<commit_message>
Fix deterministic release packaging in v0.4.1
</commit_message>
<xml_diff>
--- a/docs/Codex Chief of Staff - Installation and SOP.docx
+++ b/docs/Codex Chief of Staff - Installation and SOP.docx
@@ -229,7 +229,7 @@
                 <w:color w:val="000000"/>
                 <w:sz w:val="19"/>
               </w:rPr>
-              <w:t>0.4.0</w:t>
+              <w:t>0.4.1</w:t>
             </w:r>
           </w:p>
         </w:tc>
@@ -2678,7 +2678,7 @@
         <w:color w:val="5B6472"/>
         <w:sz w:val="16"/>
       </w:rPr>
-      <w:t xml:space="preserve">v0.4.0   /   </w:t>
+      <w:t xml:space="preserve">v0.4.1   /   </w:t>
     </w:r>
     <w:fldSimple w:instr="PAGE"/>
   </w:p>

</xml_diff>

<commit_message>
Normalize archive metadata in v0.4.2
</commit_message>
<xml_diff>
--- a/docs/Codex Chief of Staff - Installation and SOP.docx
+++ b/docs/Codex Chief of Staff - Installation and SOP.docx
@@ -229,7 +229,7 @@
                 <w:color w:val="000000"/>
                 <w:sz w:val="19"/>
               </w:rPr>
-              <w:t>0.4.1</w:t>
+              <w:t>0.4.2</w:t>
             </w:r>
           </w:p>
         </w:tc>
@@ -2678,7 +2678,7 @@
         <w:color w:val="5B6472"/>
         <w:sz w:val="16"/>
       </w:rPr>
-      <w:t xml:space="preserve">v0.4.1   /   </w:t>
+      <w:t xml:space="preserve">v0.4.2   /   </w:t>
     </w:r>
     <w:fldSimple w:instr="PAGE"/>
   </w:p>

</xml_diff>

<commit_message>
fix: make release evidence reproducible across hosts
</commit_message>
<xml_diff>
--- a/docs/Codex Chief of Staff - Installation and SOP.docx
+++ b/docs/Codex Chief of Staff - Installation and SOP.docx
@@ -229,7 +229,7 @@
                 <w:color w:val="000000"/>
                 <w:sz w:val="19"/>
               </w:rPr>
-              <w:t>0.4.2</w:t>
+              <w:t>0.4.3</w:t>
             </w:r>
           </w:p>
         </w:tc>
@@ -2678,7 +2678,7 @@
         <w:color w:val="5B6472"/>
         <w:sz w:val="16"/>
       </w:rPr>
-      <w:t xml:space="preserve">v0.4.2   /   </w:t>
+      <w:t xml:space="preserve">v0.4.3   /   </w:t>
     </w:r>
     <w:fldSimple w:instr="PAGE"/>
   </w:p>

</xml_diff>

<commit_message>
fix: normalize generated release evidence bytes
</commit_message>
<xml_diff>
--- a/docs/Codex Chief of Staff - Installation and SOP.docx
+++ b/docs/Codex Chief of Staff - Installation and SOP.docx
@@ -229,7 +229,7 @@
                 <w:color w:val="000000"/>
                 <w:sz w:val="19"/>
               </w:rPr>
-              <w:t>0.4.3</w:t>
+              <w:t>0.4.4</w:t>
             </w:r>
           </w:p>
         </w:tc>
@@ -2678,7 +2678,7 @@
         <w:color w:val="5B6472"/>
         <w:sz w:val="16"/>
       </w:rPr>
-      <w:t xml:space="preserve">v0.4.3   /   </w:t>
+      <w:t xml:space="preserve">v0.4.4   /   </w:t>
     </w:r>
     <w:fldSimple w:instr="PAGE"/>
   </w:p>

</xml_diff>

<commit_message>
docs: make v0.4.5 install foolproof
</commit_message>
<xml_diff>
--- a/docs/Codex Chief of Staff - Installation and SOP.docx
+++ b/docs/Codex Chief of Staff - Installation and SOP.docx
@@ -229,7 +229,7 @@
                 <w:color w:val="000000"/>
                 <w:sz w:val="19"/>
               </w:rPr>
-              <w:t>0.4.4</w:t>
+              <w:t>0.4.5</w:t>
             </w:r>
           </w:p>
         </w:tc>
@@ -404,7 +404,7 @@
         <w:pStyle w:val="Heading1"/>
       </w:pPr>
       <w:r>
-        <w:t>1. Install in 30 seconds</w:t>
+        <w:t>1. Install the complete stack</w:t>
       </w:r>
     </w:p>
     <w:p>
@@ -412,8 +412,197 @@
         <w:pStyle w:val="Heading2"/>
       </w:pPr>
       <w:r>
-        <w:t>Codex marketplace install</w:t>
+        <w:t>Requirements</w:t>
       </w:r>
+    </w:p>
+    <w:p>
+      <w:pPr>
+        <w:pStyle w:val="ListBullet"/>
+      </w:pPr>
+      <w:r>
+        <w:t>Codex with plugin support.</w:t>
+      </w:r>
+    </w:p>
+    <w:p>
+      <w:pPr>
+        <w:pStyle w:val="ListBullet"/>
+      </w:pPr>
+      <w:r>
+        <w:t>Git for GitHub marketplace installation.</w:t>
+      </w:r>
+    </w:p>
+    <w:p>
+      <w:pPr>
+        <w:pStyle w:val="ListBullet"/>
+      </w:pPr>
+      <w:r>
+        <w:t>Node.js 18 or later for Ponytail and Chief of Staff hooks.</w:t>
+      </w:r>
+    </w:p>
+    <w:p>
+      <w:pPr>
+        <w:pStyle w:val="ListBullet"/>
+      </w:pPr>
+      <w:r>
+        <w:t>Python 3.11 or later for AI Sloppy Copy, configuration, and validation.</w:t>
+      </w:r>
+    </w:p>
+    <w:p>
+      <w:pPr>
+        <w:pStyle w:val="Heading2"/>
+      </w:pPr>
+      <w:r>
+        <w:t>Step 1 of 3: Ponytail</w:t>
+      </w:r>
+    </w:p>
+    <w:p>
+      <w:pPr>
+        <w:spacing w:after="100"/>
+      </w:pPr>
+      <w:r>
+        <w:rPr>
+          <w:rFonts w:ascii="Calibri" w:hAnsi="Calibri"/>
+          <w:b/>
+          <w:color w:val="14213D"/>
+          <w:sz w:val="21"/>
+        </w:rPr>
+        <w:t xml:space="preserve">Repository: </w:t>
+      </w:r>
+      <w:hyperlink r:id="rId12">
+        <w:r>
+          <w:rPr>
+            <w:color w:val="2A9D8F"/>
+            <w:u w:val="single"/>
+          </w:rPr>
+          <w:t>https://github.com/DietrichGebert/ponytail</w:t>
+        </w:r>
+      </w:hyperlink>
+    </w:p>
+    <w:p>
+      <w:pPr>
+        <w:shd w:fill="EEF1F5"/>
+        <w:spacing w:before="40" w:after="160"/>
+        <w:ind w:left="317" w:right="317"/>
+      </w:pPr>
+      <w:r>
+        <w:rPr>
+          <w:rFonts w:ascii="Consolas" w:hAnsi="Consolas"/>
+          <w:b w:val="0"/>
+          <w:color w:val="14213D"/>
+          <w:sz w:val="17"/>
+        </w:rPr>
+        <w:t>codex plugin marketplace add DietrichGebert/ponytail</w:t>
+      </w:r>
+    </w:p>
+    <w:p>
+      <w:pPr>
+        <w:shd w:fill="EEF1F5"/>
+        <w:spacing w:before="40" w:after="160"/>
+        <w:ind w:left="317" w:right="317"/>
+      </w:pPr>
+      <w:r>
+        <w:rPr>
+          <w:rFonts w:ascii="Consolas" w:hAnsi="Consolas"/>
+          <w:b w:val="0"/>
+          <w:color w:val="14213D"/>
+          <w:sz w:val="17"/>
+        </w:rPr>
+        <w:t>codex plugin add ponytail@ponytail</w:t>
+      </w:r>
+    </w:p>
+    <w:p>
+      <w:pPr>
+        <w:pStyle w:val="Heading2"/>
+      </w:pPr>
+      <w:r>
+        <w:t>Step 2 of 3: AI Sloppy Copy</w:t>
+      </w:r>
+    </w:p>
+    <w:p>
+      <w:pPr>
+        <w:spacing w:after="100"/>
+      </w:pPr>
+      <w:r>
+        <w:rPr>
+          <w:rFonts w:ascii="Calibri" w:hAnsi="Calibri"/>
+          <w:b/>
+          <w:color w:val="14213D"/>
+          <w:sz w:val="21"/>
+        </w:rPr>
+        <w:t xml:space="preserve">Repository: </w:t>
+      </w:r>
+      <w:hyperlink r:id="rId13">
+        <w:r>
+          <w:rPr>
+            <w:color w:val="2A9D8F"/>
+            <w:u w:val="single"/>
+          </w:rPr>
+          <w:t>https://github.com/plotdevice01/ai-sloppy-copy</w:t>
+        </w:r>
+      </w:hyperlink>
+    </w:p>
+    <w:p>
+      <w:pPr>
+        <w:shd w:fill="EEF1F5"/>
+        <w:spacing w:before="40" w:after="160"/>
+        <w:ind w:left="317" w:right="317"/>
+      </w:pPr>
+      <w:r>
+        <w:rPr>
+          <w:rFonts w:ascii="Consolas" w:hAnsi="Consolas"/>
+          <w:b w:val="0"/>
+          <w:color w:val="14213D"/>
+          <w:sz w:val="17"/>
+        </w:rPr>
+        <w:t>codex plugin marketplace add plotdevice01/ai-sloppy-copy</w:t>
+      </w:r>
+    </w:p>
+    <w:p>
+      <w:pPr>
+        <w:shd w:fill="EEF1F5"/>
+        <w:spacing w:before="40" w:after="160"/>
+        <w:ind w:left="317" w:right="317"/>
+      </w:pPr>
+      <w:r>
+        <w:rPr>
+          <w:rFonts w:ascii="Consolas" w:hAnsi="Consolas"/>
+          <w:b w:val="0"/>
+          <w:color w:val="14213D"/>
+          <w:sz w:val="17"/>
+        </w:rPr>
+        <w:t>codex plugin add ai-sloppy-copy@ai-sloppy-copy</w:t>
+      </w:r>
+    </w:p>
+    <w:p>
+      <w:pPr>
+        <w:pStyle w:val="Heading2"/>
+      </w:pPr>
+      <w:r>
+        <w:t>Step 3 of 3: Chief of Staff</w:t>
+      </w:r>
+    </w:p>
+    <w:p>
+      <w:pPr>
+        <w:spacing w:after="100"/>
+      </w:pPr>
+      <w:r>
+        <w:rPr>
+          <w:rFonts w:ascii="Calibri" w:hAnsi="Calibri"/>
+          <w:b/>
+          <w:color w:val="14213D"/>
+          <w:sz w:val="21"/>
+        </w:rPr>
+        <w:t xml:space="preserve">Repository: </w:t>
+      </w:r>
+      <w:hyperlink r:id="rId14">
+        <w:r>
+          <w:rPr>
+            <w:color w:val="2A9D8F"/>
+            <w:u w:val="single"/>
+          </w:rPr>
+          <w:t>https://github.com/plotdevice01/codex-chief-of-staff</w:t>
+        </w:r>
+      </w:hyperlink>
     </w:p>
     <w:p>
       <w:pPr>
@@ -449,6 +638,14 @@
     </w:p>
     <w:p>
       <w:pPr>
+        <w:pStyle w:val="Heading2"/>
+      </w:pPr>
+      <w:r>
+        <w:t>Restart, trust and verify</w:t>
+      </w:r>
+    </w:p>
+    <w:p>
+      <w:pPr>
         <w:numPr>
           <w:ilvl w:val="0"/>
           <w:numId w:val="10"/>
@@ -468,7 +665,7 @@
         <w:pStyle w:val="ListNumber"/>
       </w:pPr>
       <w:r>
-        <w:t>Open /hooks. Review and trust the Chief of Staff SessionStart and SubagentStart hooks.</w:t>
+        <w:t>Open /hooks. Review and trust the hooks offered by Ponytail, AI Sloppy Copy and Chief of Staff.</w:t>
       </w:r>
     </w:p>
     <w:p>
@@ -492,7 +689,19 @@
         <w:pStyle w:val="ListNumber"/>
       </w:pPr>
       <w:r>
-        <w:t>Run codex plugin list --json and confirm chief-of-staff is active.</w:t>
+        <w:t>Run codex plugin list --json.</w:t>
+      </w:r>
+    </w:p>
+    <w:p>
+      <w:pPr>
+        <w:numPr>
+          <w:ilvl w:val="0"/>
+          <w:numId w:val="10"/>
+        </w:numPr>
+        <w:pStyle w:val="ListNumber"/>
+      </w:pPr>
+      <w:r>
+        <w:t>Confirm ponytail@ponytail, ai-sloppy-copy@ai-sloppy-copy and chief-of-staff@codex-chief-of-staff are installed and active.</w:t>
       </w:r>
     </w:p>
     <w:p>
@@ -520,7 +729,7 @@
           <w:color w:val="9C2F2F"/>
           <w:sz w:val="21"/>
         </w:rPr>
-        <w:t>The hooks run a bundled Node script that reads AGENTS.md, the retained persona text, and an optional local configuration. It uses Node standard library only and sends no telemetry.</w:t>
+        <w:t>Ponytail loads its mode and tracks changes. AI Sloppy Copy checks authored prose locally. Chief of Staff loads AGENTS.md, the retained persona and optional local configuration. Review every command before trust.</w:t>
       </w:r>
     </w:p>
     <w:p>
@@ -528,44 +737,23 @@
         <w:pStyle w:val="Heading2"/>
       </w:pPr>
       <w:r>
-        <w:t>Release ZIP or source checkout</w:t>
+        <w:t>Configure from the fresh task</w:t>
       </w:r>
     </w:p>
     <w:p>
       <w:pPr>
-        <w:pStyle w:val="ListBullet"/>
+        <w:shd w:fill="EEF1F5"/>
+        <w:spacing w:before="40" w:after="160"/>
+        <w:ind w:left="317" w:right="317"/>
       </w:pPr>
       <w:r>
-        <w:t>Windows: run .\install.ps1 from the extracted release or checkout.</w:t>
-      </w:r>
-    </w:p>
-    <w:p>
-      <w:pPr>
-        <w:pStyle w:val="ListBullet"/>
-      </w:pPr>
-      <w:r>
-        <w:t>macOS/Linux: run ./install.sh from the extracted release or checkout.</w:t>
-      </w:r>
-    </w:p>
-    <w:p>
-      <w:pPr>
-        <w:pStyle w:val="ListBullet"/>
-      </w:pPr>
-      <w:r>
-        <w:t>Use -DryRun or --dry-run to print commands without changing the install.</w:t>
-      </w:r>
-    </w:p>
-    <w:p>
-      <w:pPr>
-        <w:pStyle w:val="Heading2"/>
-      </w:pPr>
-      <w:r>
-        <w:t>No configuration yet?</w:t>
-      </w:r>
-    </w:p>
-    <w:p>
-      <w:r>
-        <w:t>Generic response behavior still loads. Connector and registered-project work remains blocked until a local configuration exists. A missing authority file is not implied consent; humanity has tried that model.</w:t>
+        <w:rPr>
+          <w:rFonts w:ascii="Consolas" w:hAnsi="Consolas"/>
+          <w:b w:val="0"/>
+          <w:color w:val="14213D"/>
+          <w:sz w:val="17"/>
+        </w:rPr>
+        <w:t>Use $chief-of-staff to initialize my local configuration, then validate the install with strict dependency checks. Report any missing plugin or hook.</w:t>
       </w:r>
     </w:p>
     <w:p>
@@ -1017,7 +1205,7 @@
           <w:color w:val="14213D"/>
           <w:sz w:val="17"/>
         </w:rPr>
-        <w:t>python validate_install.py</w:t>
+        <w:t>python validate_install.py --strict-dependencies</w:t>
       </w:r>
     </w:p>
     <w:p>
@@ -1707,6 +1895,52 @@
     </w:p>
     <w:p>
       <w:pPr>
+        <w:spacing w:after="100"/>
+      </w:pPr>
+      <w:r>
+        <w:rPr>
+          <w:rFonts w:ascii="Calibri" w:hAnsi="Calibri"/>
+          <w:b/>
+          <w:color w:val="14213D"/>
+          <w:sz w:val="21"/>
+        </w:rPr>
+        <w:t xml:space="preserve">Ponytail repository: </w:t>
+      </w:r>
+      <w:hyperlink r:id="rId12">
+        <w:r>
+          <w:rPr>
+            <w:color w:val="2A9D8F"/>
+            <w:u w:val="single"/>
+          </w:rPr>
+          <w:t>https://github.com/DietrichGebert/ponytail</w:t>
+        </w:r>
+      </w:hyperlink>
+    </w:p>
+    <w:p>
+      <w:pPr>
+        <w:spacing w:after="100"/>
+      </w:pPr>
+      <w:r>
+        <w:rPr>
+          <w:rFonts w:ascii="Calibri" w:hAnsi="Calibri"/>
+          <w:b/>
+          <w:color w:val="14213D"/>
+          <w:sz w:val="21"/>
+        </w:rPr>
+        <w:t xml:space="preserve">AI Sloppy Copy repository: </w:t>
+      </w:r>
+      <w:hyperlink r:id="rId13">
+        <w:r>
+          <w:rPr>
+            <w:color w:val="2A9D8F"/>
+            <w:u w:val="single"/>
+          </w:rPr>
+          <w:t>https://github.com/plotdevice01/ai-sloppy-copy</w:t>
+        </w:r>
+      </w:hyperlink>
+    </w:p>
+    <w:p>
+      <w:pPr>
         <w:pStyle w:val="ListBullet"/>
       </w:pPr>
       <w:r>
@@ -1771,7 +2005,7 @@
           <w:color w:val="14213D"/>
           <w:sz w:val="17"/>
         </w:rPr>
-        <w:t>python validate_install.py --example</w:t>
+        <w:t>python validate_install.py --example --strict-dependencies</w:t>
       </w:r>
     </w:p>
     <w:p>
@@ -2678,7 +2912,7 @@
         <w:color w:val="5B6472"/>
         <w:sz w:val="16"/>
       </w:rPr>
-      <w:t xml:space="preserve">v0.4.4   /   </w:t>
+      <w:t xml:space="preserve">v0.4.5   /   </w:t>
     </w:r>
     <w:fldSimple w:instr="PAGE"/>
   </w:p>

</xml_diff>

<commit_message>
release: optimize Chief of Staff v0.5.0
</commit_message>
<xml_diff>
--- a/docs/Codex Chief of Staff - Installation and SOP.docx
+++ b/docs/Codex Chief of Staff - Installation and SOP.docx
@@ -229,7 +229,7 @@
                 <w:color w:val="000000"/>
                 <w:sz w:val="19"/>
               </w:rPr>
-              <w:t>0.4.5</w:t>
+              <w:t>0.5.0</w:t>
             </w:r>
           </w:p>
         </w:tc>
@@ -925,7 +925,7 @@
                 <w:color w:val="000000"/>
                 <w:sz w:val="19"/>
               </w:rPr>
-              <w:t>Name and IANA timezone used for dates and scheduling.</w:t>
+              <w:t>Name, IANA timezone, role, operating profile, and recurring work used to load private context.</w:t>
             </w:r>
           </w:p>
         </w:tc>
@@ -1326,7 +1326,7 @@
         <w:pStyle w:val="ListNumber"/>
       </w:pPr>
       <w:r>
-        <w:t>Execute once, then read the saved result back before reporting completion.</w:t>
+        <w:t>Use idempotency when available. Read the saved result back before any retry or completion report.</w:t>
       </w:r>
     </w:p>
     <w:p>
@@ -1952,7 +1952,7 @@
         <w:pStyle w:val="ListBullet"/>
       </w:pPr>
       <w:r>
-        <w:t>AI Sloppy Copy 2.1.0 or later for exact authored-copy governance.</w:t>
+        <w:t>AI Sloppy Copy plugin 2.2.3 or later with Standard 2.1.1 or later for exact authored-copy governance.</w:t>
       </w:r>
     </w:p>
     <w:p>
@@ -2350,7 +2350,7 @@
     </w:p>
     <w:p>
       <w:r>
-        <w:t>Run the eight prompts in persona/persona-contract.json in a new Codex task. Static validation proves the contract exists; it cannot honestly grade a live model response.</w:t>
+        <w:t>Run the eight prompts in persona/persona-contract.json in separate fresh Codex tasks with both GPT-5.6 Sol and GPT-5.6 Terra. Static validation proves the contract exists; it cannot honestly grade a live model response.</w:t>
       </w:r>
     </w:p>
     <w:p>
@@ -2378,7 +2378,7 @@
           <w:color w:val="14213D"/>
           <w:sz w:val="21"/>
         </w:rPr>
-        <w:t>static checks pass and fresh-task behavior meets all eight criteria. Connector identities must match. The first briefing must stay inside the selected scope.</w:t>
+        <w:t>static checks pass and fresh-task behavior on both models meets all eight criteria. Connector identities must match. The first briefing must stay inside the selected scope.</w:t>
       </w:r>
     </w:p>
     <w:p>
@@ -2912,7 +2912,7 @@
         <w:color w:val="5B6472"/>
         <w:sz w:val="16"/>
       </w:rPr>
-      <w:t xml:space="preserve">v0.4.5   /   </w:t>
+      <w:t xml:space="preserve">v0.5.0   /   </w:t>
     </w:r>
     <w:fldSimple w:instr="PAGE"/>
   </w:p>

</xml_diff>

<commit_message>
release: add Claude Code support in v0.5.1
</commit_message>
<xml_diff>
--- a/docs/Codex Chief of Staff - Installation and SOP.docx
+++ b/docs/Codex Chief of Staff - Installation and SOP.docx
@@ -229,7 +229,7 @@
                 <w:color w:val="000000"/>
                 <w:sz w:val="19"/>
               </w:rPr>
-              <w:t>0.5.0</w:t>
+              <w:t>0.5.1</w:t>
             </w:r>
           </w:p>
         </w:tc>
@@ -255,7 +255,7 @@
                 <w:color w:val="000000"/>
                 <w:sz w:val="19"/>
               </w:rPr>
-              <w:t>Any Codex user</w:t>
+              <w:t>Any Codex or Claude Code user</w:t>
             </w:r>
           </w:p>
         </w:tc>
@@ -343,7 +343,7 @@
           <w:color w:val="14213D"/>
           <w:sz w:val="21"/>
         </w:rPr>
-        <w:t>A skills-only Codex plugin that loads the complete generic operating contract and retained persona. It grants no connector access, project authority, or external-write permission.</w:t>
+        <w:t>A skills-only Codex and Claude Code plugin that loads the complete generic operating contract and retained persona. It grants no connector access, project authority, or external-write permission.</w:t>
       </w:r>
     </w:p>
     <w:p>
@@ -420,7 +420,7 @@
         <w:pStyle w:val="ListBullet"/>
       </w:pPr>
       <w:r>
-        <w:t>Codex with plugin support.</w:t>
+        <w:t>Codex with plugin support or Claude Code.</w:t>
       </w:r>
     </w:p>
     <w:p>
@@ -757,6 +757,247 @@
       </w:r>
     </w:p>
     <w:p>
+      <w:pPr>
+        <w:pStyle w:val="Heading2"/>
+      </w:pPr>
+      <w:r>
+        <w:t>Claude Code alternative</w:t>
+      </w:r>
+    </w:p>
+    <w:p>
+      <w:pPr>
+        <w:shd w:fill="EEF1F5"/>
+        <w:spacing w:before="40" w:after="160"/>
+        <w:ind w:left="317" w:right="317"/>
+      </w:pPr>
+      <w:r>
+        <w:rPr>
+          <w:rFonts w:ascii="Consolas" w:hAnsi="Consolas"/>
+          <w:b w:val="0"/>
+          <w:color w:val="14213D"/>
+          <w:sz w:val="17"/>
+        </w:rPr>
+        <w:t>claude plugin marketplace add DietrichGebert/ponytail</w:t>
+      </w:r>
+    </w:p>
+    <w:p>
+      <w:pPr>
+        <w:shd w:fill="EEF1F5"/>
+        <w:spacing w:before="40" w:after="160"/>
+        <w:ind w:left="317" w:right="317"/>
+      </w:pPr>
+      <w:r>
+        <w:rPr>
+          <w:rFonts w:ascii="Consolas" w:hAnsi="Consolas"/>
+          <w:b w:val="0"/>
+          <w:color w:val="14213D"/>
+          <w:sz w:val="17"/>
+        </w:rPr>
+        <w:t>claude plugin install ponytail@ponytail --scope user</w:t>
+      </w:r>
+    </w:p>
+    <w:p>
+      <w:pPr>
+        <w:shd w:fill="EEF1F5"/>
+        <w:spacing w:before="40" w:after="160"/>
+        <w:ind w:left="317" w:right="317"/>
+      </w:pPr>
+      <w:r>
+        <w:rPr>
+          <w:rFonts w:ascii="Consolas" w:hAnsi="Consolas"/>
+          <w:b w:val="0"/>
+          <w:color w:val="14213D"/>
+          <w:sz w:val="17"/>
+        </w:rPr>
+        <w:t>claude plugin marketplace add plotdevice01/ai-sloppy-copy</w:t>
+      </w:r>
+    </w:p>
+    <w:p>
+      <w:pPr>
+        <w:shd w:fill="EEF1F5"/>
+        <w:spacing w:before="40" w:after="160"/>
+        <w:ind w:left="317" w:right="317"/>
+      </w:pPr>
+      <w:r>
+        <w:rPr>
+          <w:rFonts w:ascii="Consolas" w:hAnsi="Consolas"/>
+          <w:b w:val="0"/>
+          <w:color w:val="14213D"/>
+          <w:sz w:val="17"/>
+        </w:rPr>
+        <w:t>claude plugin install ai-sloppy-copy@ai-sloppy-copy --scope user</w:t>
+      </w:r>
+    </w:p>
+    <w:p>
+      <w:pPr>
+        <w:shd w:fill="EEF1F5"/>
+        <w:spacing w:before="40" w:after="160"/>
+        <w:ind w:left="317" w:right="317"/>
+      </w:pPr>
+      <w:r>
+        <w:rPr>
+          <w:rFonts w:ascii="Consolas" w:hAnsi="Consolas"/>
+          <w:b w:val="0"/>
+          <w:color w:val="14213D"/>
+          <w:sz w:val="17"/>
+        </w:rPr>
+        <w:t>claude plugin marketplace add plotdevice01/codex-chief-of-staff</w:t>
+      </w:r>
+    </w:p>
+    <w:p>
+      <w:pPr>
+        <w:shd w:fill="EEF1F5"/>
+        <w:spacing w:before="40" w:after="160"/>
+        <w:ind w:left="317" w:right="317"/>
+      </w:pPr>
+      <w:r>
+        <w:rPr>
+          <w:rFonts w:ascii="Consolas" w:hAnsi="Consolas"/>
+          <w:b w:val="0"/>
+          <w:color w:val="14213D"/>
+          <w:sz w:val="17"/>
+        </w:rPr>
+        <w:t>claude plugin install chief-of-staff@codex-chief-of-staff --scope user</w:t>
+      </w:r>
+    </w:p>
+    <w:p>
+      <w:pPr>
+        <w:numPr>
+          <w:ilvl w:val="0"/>
+          <w:numId w:val="11"/>
+        </w:numPr>
+        <w:pStyle w:val="ListNumber"/>
+      </w:pPr>
+      <w:r>
+        <w:t>Start Claude Code and run /reload-plugins.</w:t>
+      </w:r>
+    </w:p>
+    <w:p>
+      <w:pPr>
+        <w:numPr>
+          <w:ilvl w:val="0"/>
+          <w:numId w:val="11"/>
+        </w:numPr>
+        <w:pStyle w:val="ListNumber"/>
+      </w:pPr>
+      <w:r>
+        <w:t>Open /hooks and review the hooks from all three plugins.</w:t>
+      </w:r>
+    </w:p>
+    <w:p>
+      <w:pPr>
+        <w:numPr>
+          <w:ilvl w:val="0"/>
+          <w:numId w:val="11"/>
+        </w:numPr>
+        <w:pStyle w:val="ListNumber"/>
+      </w:pPr>
+      <w:r>
+        <w:t>Run claude plugin list --json and confirm all three plugin IDs are enabled.</w:t>
+      </w:r>
+    </w:p>
+    <w:p>
+      <w:pPr>
+        <w:numPr>
+          <w:ilvl w:val="0"/>
+          <w:numId w:val="11"/>
+        </w:numPr>
+        <w:pStyle w:val="ListNumber"/>
+      </w:pPr>
+      <w:r>
+        <w:t>Start a fresh session so SessionStart loads the contract and retained persona.</w:t>
+      </w:r>
+    </w:p>
+    <w:p>
+      <w:pPr>
+        <w:pStyle w:val="Heading2"/>
+      </w:pPr>
+      <w:r>
+        <w:t>One-command and team deployment</w:t>
+      </w:r>
+    </w:p>
+    <w:p>
+      <w:pPr>
+        <w:shd w:fill="EEF1F5"/>
+        <w:spacing w:before="40" w:after="160"/>
+        <w:ind w:left="317" w:right="317"/>
+      </w:pPr>
+      <w:r>
+        <w:rPr>
+          <w:rFonts w:ascii="Consolas" w:hAnsi="Consolas"/>
+          <w:b w:val="0"/>
+          <w:color w:val="14213D"/>
+          <w:sz w:val="17"/>
+        </w:rPr>
+        <w:t>.\install-claude.ps1</w:t>
+      </w:r>
+    </w:p>
+    <w:p>
+      <w:pPr>
+        <w:shd w:fill="EEF1F5"/>
+        <w:spacing w:before="40" w:after="160"/>
+        <w:ind w:left="317" w:right="317"/>
+      </w:pPr>
+      <w:r>
+        <w:rPr>
+          <w:rFonts w:ascii="Consolas" w:hAnsi="Consolas"/>
+          <w:b w:val="0"/>
+          <w:color w:val="14213D"/>
+          <w:sz w:val="17"/>
+        </w:rPr>
+        <w:t>./install-claude.sh</w:t>
+      </w:r>
+    </w:p>
+    <w:p>
+      <w:r>
+        <w:t>The scripts install or update all three plugins. The default scope is user. Use project scope only when the repository should carry shared enablement.</w:t>
+      </w:r>
+    </w:p>
+    <w:p>
+      <w:pPr>
+        <w:shd w:fill="EEF1F5"/>
+        <w:spacing w:before="40" w:after="160"/>
+        <w:ind w:left="317" w:right="317"/>
+      </w:pPr>
+      <w:r>
+        <w:rPr>
+          <w:rFonts w:ascii="Consolas" w:hAnsi="Consolas"/>
+          <w:b w:val="0"/>
+          <w:color w:val="14213D"/>
+          <w:sz w:val="17"/>
+        </w:rPr>
+        <w:t>Copy examples\claude-project-settings.json to .claude\settings.json</w:t>
+      </w:r>
+    </w:p>
+    <w:p>
+      <w:pPr>
+        <w:pBdr>
+          <w:left w:val="single" w:sz="18" w:space="8" w:color="9C2F2F"/>
+        </w:pBdr>
+        <w:shd w:fill="FBECEC"/>
+        <w:spacing w:before="80" w:after="160"/>
+        <w:ind w:left="115" w:right="115"/>
+      </w:pPr>
+      <w:r>
+        <w:rPr>
+          <w:rFonts w:ascii="Calibri" w:hAnsi="Calibri"/>
+          <w:b/>
+          <w:color w:val="9C2F2F"/>
+          <w:sz w:val="21"/>
+        </w:rPr>
+        <w:t xml:space="preserve">Keep authority local: </w:t>
+      </w:r>
+      <w:r>
+        <w:rPr>
+          <w:rFonts w:ascii="Calibri" w:hAnsi="Calibri"/>
+          <w:b w:val="0"/>
+          <w:color w:val="9C2F2F"/>
+          <w:sz w:val="21"/>
+        </w:rPr>
+        <w:t>Shared Claude settings may name marketplaces and enabled plugins. Private identities, paths, scopes, and approval rules stay in ignored chief-of-staff.json.</w:t>
+      </w:r>
+    </w:p>
+    <w:p>
       <w:r>
         <w:br w:type="page"/>
       </w:r>
@@ -795,7 +1036,7 @@
     </w:p>
     <w:p>
       <w:r>
-        <w:t>Or start a fresh Codex task and say: Use $chief-of-staff to initialize my local configuration.</w:t>
+        <w:t>Or start a fresh Codex task or Claude Code session and ask the Chief of Staff skill to initialize the local configuration.</w:t>
       </w:r>
     </w:p>
     <w:tbl>
@@ -1233,7 +1474,7 @@
           <w:color w:val="9C2F2F"/>
           <w:sz w:val="21"/>
         </w:rPr>
-        <w:t>Do not use a connector until validation passes and Codex reads back the intended scope and identity gate with the approval policy.</w:t>
+        <w:t>Do not use a connector until validation passes and the host reads back the intended scope and identity gate with the approval policy.</w:t>
       </w:r>
     </w:p>
     <w:p>
@@ -1261,7 +1502,7 @@
       <w:pPr>
         <w:numPr>
           <w:ilvl w:val="0"/>
-          <w:numId w:val="11"/>
+          <w:numId w:val="12"/>
         </w:numPr>
         <w:pStyle w:val="ListNumber"/>
       </w:pPr>
@@ -1273,7 +1514,7 @@
       <w:pPr>
         <w:numPr>
           <w:ilvl w:val="0"/>
-          <w:numId w:val="11"/>
+          <w:numId w:val="12"/>
         </w:numPr>
         <w:pStyle w:val="ListNumber"/>
       </w:pPr>
@@ -1285,7 +1526,7 @@
       <w:pPr>
         <w:numPr>
           <w:ilvl w:val="0"/>
-          <w:numId w:val="11"/>
+          <w:numId w:val="12"/>
         </w:numPr>
         <w:pStyle w:val="ListNumber"/>
       </w:pPr>
@@ -1297,7 +1538,7 @@
       <w:pPr>
         <w:numPr>
           <w:ilvl w:val="0"/>
-          <w:numId w:val="11"/>
+          <w:numId w:val="12"/>
         </w:numPr>
         <w:pStyle w:val="ListNumber"/>
       </w:pPr>
@@ -1309,7 +1550,7 @@
       <w:pPr>
         <w:numPr>
           <w:ilvl w:val="0"/>
-          <w:numId w:val="11"/>
+          <w:numId w:val="12"/>
         </w:numPr>
         <w:pStyle w:val="ListNumber"/>
       </w:pPr>
@@ -1321,7 +1562,7 @@
       <w:pPr>
         <w:numPr>
           <w:ilvl w:val="0"/>
-          <w:numId w:val="11"/>
+          <w:numId w:val="12"/>
         </w:numPr>
         <w:pStyle w:val="ListNumber"/>
       </w:pPr>
@@ -1341,7 +1582,7 @@
       <w:pPr>
         <w:numPr>
           <w:ilvl w:val="0"/>
-          <w:numId w:val="12"/>
+          <w:numId w:val="13"/>
         </w:numPr>
         <w:pStyle w:val="ListNumber"/>
       </w:pPr>
@@ -1353,7 +1594,7 @@
       <w:pPr>
         <w:numPr>
           <w:ilvl w:val="0"/>
-          <w:numId w:val="12"/>
+          <w:numId w:val="13"/>
         </w:numPr>
         <w:pStyle w:val="ListNumber"/>
       </w:pPr>
@@ -1365,7 +1606,7 @@
       <w:pPr>
         <w:numPr>
           <w:ilvl w:val="0"/>
-          <w:numId w:val="12"/>
+          <w:numId w:val="13"/>
         </w:numPr>
         <w:pStyle w:val="ListNumber"/>
       </w:pPr>
@@ -1377,7 +1618,7 @@
       <w:pPr>
         <w:numPr>
           <w:ilvl w:val="0"/>
-          <w:numId w:val="12"/>
+          <w:numId w:val="13"/>
         </w:numPr>
         <w:pStyle w:val="ListNumber"/>
       </w:pPr>
@@ -1494,7 +1735,7 @@
       <w:pPr>
         <w:numPr>
           <w:ilvl w:val="0"/>
-          <w:numId w:val="13"/>
+          <w:numId w:val="14"/>
         </w:numPr>
         <w:pStyle w:val="ListNumber"/>
       </w:pPr>
@@ -1506,7 +1747,7 @@
       <w:pPr>
         <w:numPr>
           <w:ilvl w:val="0"/>
-          <w:numId w:val="13"/>
+          <w:numId w:val="14"/>
         </w:numPr>
         <w:pStyle w:val="ListNumber"/>
       </w:pPr>
@@ -1518,7 +1759,7 @@
       <w:pPr>
         <w:numPr>
           <w:ilvl w:val="0"/>
-          <w:numId w:val="13"/>
+          <w:numId w:val="14"/>
         </w:numPr>
         <w:pStyle w:val="ListNumber"/>
       </w:pPr>
@@ -1530,7 +1771,7 @@
       <w:pPr>
         <w:numPr>
           <w:ilvl w:val="0"/>
-          <w:numId w:val="13"/>
+          <w:numId w:val="14"/>
         </w:numPr>
         <w:pStyle w:val="ListNumber"/>
       </w:pPr>
@@ -1952,7 +2193,7 @@
         <w:pStyle w:val="ListBullet"/>
       </w:pPr>
       <w:r>
-        <w:t>AI Sloppy Copy plugin 2.2.3 or later with Standard 2.1.1 or later for exact authored-copy governance.</w:t>
+        <w:t>AI Sloppy Copy plugin 2.2.4 or later with Standard 2.1.1 or later for exact authored-copy governance.</w:t>
       </w:r>
     </w:p>
     <w:p>
@@ -2350,7 +2591,7 @@
     </w:p>
     <w:p>
       <w:r>
-        <w:t>Run the eight prompts in persona/persona-contract.json in separate fresh Codex tasks with both GPT-5.6 Sol and GPT-5.6 Terra. Static validation proves the contract exists; it cannot honestly grade a live model response.</w:t>
+        <w:t>Run the eight prompts in persona/persona-contract.json in separate fresh Codex tasks with both GPT-5.6 Sol and GPT-5.6 Terra. Repeat them in a fresh Claude Code session when certifying that host. Static validation proves the contract exists; it cannot honestly grade a live model response.</w:t>
       </w:r>
     </w:p>
     <w:p>
@@ -2436,6 +2677,38 @@
     </w:p>
     <w:p>
       <w:pPr>
+        <w:shd w:fill="EEF1F5"/>
+        <w:spacing w:before="40" w:after="160"/>
+        <w:ind w:left="317" w:right="317"/>
+      </w:pPr>
+      <w:r>
+        <w:rPr>
+          <w:rFonts w:ascii="Consolas" w:hAnsi="Consolas"/>
+          <w:b w:val="0"/>
+          <w:color w:val="14213D"/>
+          <w:sz w:val="17"/>
+        </w:rPr>
+        <w:t>claude plugin marketplace update codex-chief-of-staff</w:t>
+      </w:r>
+    </w:p>
+    <w:p>
+      <w:pPr>
+        <w:shd w:fill="EEF1F5"/>
+        <w:spacing w:before="40" w:after="160"/>
+        <w:ind w:left="317" w:right="317"/>
+      </w:pPr>
+      <w:r>
+        <w:rPr>
+          <w:rFonts w:ascii="Consolas" w:hAnsi="Consolas"/>
+          <w:b w:val="0"/>
+          <w:color w:val="14213D"/>
+          <w:sz w:val="17"/>
+        </w:rPr>
+        <w:t>claude plugin update chief-of-staff@codex-chief-of-staff</w:t>
+      </w:r>
+    </w:p>
+    <w:p>
+      <w:pPr>
         <w:pStyle w:val="ListBullet"/>
       </w:pPr>
       <w:r>
@@ -2455,7 +2728,7 @@
         <w:pStyle w:val="ListBullet"/>
       </w:pPr>
       <w:r>
-        <w:t>Restart Codex and repeat the fresh-task acceptance prompts.</w:t>
+        <w:t>Restart Codex or run Claude Code /reload-plugins, then repeat the fresh-session acceptance prompts.</w:t>
       </w:r>
     </w:p>
     <w:p>
@@ -2504,6 +2777,38 @@
           <w:sz w:val="17"/>
         </w:rPr>
         <w:t>codex plugin marketplace remove codex-chief-of-staff</w:t>
+      </w:r>
+    </w:p>
+    <w:p>
+      <w:pPr>
+        <w:shd w:fill="EEF1F5"/>
+        <w:spacing w:before="40" w:after="160"/>
+        <w:ind w:left="317" w:right="317"/>
+      </w:pPr>
+      <w:r>
+        <w:rPr>
+          <w:rFonts w:ascii="Consolas" w:hAnsi="Consolas"/>
+          <w:b w:val="0"/>
+          <w:color w:val="14213D"/>
+          <w:sz w:val="17"/>
+        </w:rPr>
+        <w:t>claude plugin uninstall chief-of-staff@codex-chief-of-staff</w:t>
+      </w:r>
+    </w:p>
+    <w:p>
+      <w:pPr>
+        <w:shd w:fill="EEF1F5"/>
+        <w:spacing w:before="40" w:after="160"/>
+        <w:ind w:left="317" w:right="317"/>
+      </w:pPr>
+      <w:r>
+        <w:rPr>
+          <w:rFonts w:ascii="Consolas" w:hAnsi="Consolas"/>
+          <w:b w:val="0"/>
+          <w:color w:val="14213D"/>
+          <w:sz w:val="17"/>
+        </w:rPr>
+        <w:t>claude plugin marketplace remove codex-chief-of-staff</w:t>
       </w:r>
     </w:p>
     <w:p>
@@ -2646,7 +2951,7 @@
                 <w:color w:val="000000"/>
                 <w:sz w:val="19"/>
               </w:rPr>
-              <w:t>Restart Codex, open /hooks, review trust, then start a fresh task.</w:t>
+              <w:t>Restart Codex or run Claude Code /reload-plugins, review /hooks, then start fresh.</w:t>
             </w:r>
           </w:p>
         </w:tc>
@@ -2873,19 +3178,6 @@
         <w:spacing w:after="0"/>
       </w:pPr>
     </w:p>
-    <w:p>
-      <w:pPr>
-        <w:pStyle w:val="Heading2"/>
-      </w:pPr>
-      <w:r>
-        <w:t>Optional release verification</w:t>
-      </w:r>
-    </w:p>
-    <w:p>
-      <w:r>
-        <w:t>Each release publishes a SHA-256 file and GitHub build-provenance attestation. Use them when the download path or environment requires independent artifact verification.</w:t>
-      </w:r>
-    </w:p>
     <w:sectPr>
       <w:headerReference w:type="default" r:id="rId9"/>
       <w:footerReference w:type="default" r:id="rId10"/>
@@ -2912,7 +3204,7 @@
         <w:color w:val="5B6472"/>
         <w:sz w:val="16"/>
       </w:rPr>
-      <w:t xml:space="preserve">v0.5.0   /   </w:t>
+      <w:t xml:space="preserve">v0.5.1   /   </w:t>
     </w:r>
     <w:fldSimple w:instr="PAGE"/>
   </w:p>
@@ -2933,7 +3225,7 @@
         <w:color w:val="5B6472"/>
         <w:sz w:val="16"/>
       </w:rPr>
-      <w:t>CODEX CHIEF OF STAFF  /  INSTALLATION AND OPERATING SOP</w:t>
+      <w:t>CHIEF OF STAFF  /  CODEX + CLAUDE CODE  /  INSTALLATION AND OPERATING SOP</w:t>
     </w:r>
   </w:p>
 </w:hdr>
@@ -3158,6 +3450,12 @@
     </w:lvlOverride>
   </w:num>
   <w:num w:numId="13">
+    <w:abstractNumId w:val="7"/>
+    <w:lvlOverride w:ilvl="0">
+      <w:startOverride w:val="1"/>
+    </w:lvlOverride>
+  </w:num>
+  <w:num w:numId="14">
     <w:abstractNumId w:val="7"/>
     <w:lvlOverride w:ilvl="0">
       <w:startOverride w:val="1"/>

</xml_diff>

<commit_message>
release: Chief of Staff v0.5.2
</commit_message>
<xml_diff>
--- a/docs/Codex Chief of Staff - Installation and SOP.docx
+++ b/docs/Codex Chief of Staff - Installation and SOP.docx
@@ -229,7 +229,7 @@
                 <w:color w:val="000000"/>
                 <w:sz w:val="19"/>
               </w:rPr>
-              <w:t>0.5.1</w:t>
+              <w:t>0.5.2</w:t>
             </w:r>
           </w:p>
         </w:tc>
@@ -383,7 +383,7 @@
         <w:pStyle w:val="ListBullet"/>
       </w:pPr>
       <w:r>
-        <w:t>Shared behavior propagated without deleting project-specific rules.</w:t>
+        <w:t>One canonical behavior contract with fail-safe project loaders that preserve every project-specific rule.</w:t>
       </w:r>
     </w:p>
     <w:p>
@@ -729,7 +729,7 @@
           <w:color w:val="9C2F2F"/>
           <w:sz w:val="21"/>
         </w:rPr>
-        <w:t>Ponytail loads its mode and tracks changes. AI Sloppy Copy checks authored prose locally. Chief of Staff loads AGENTS.md, the retained persona and optional local configuration. Review every command before trust.</w:t>
+        <w:t>Ponytail loads its mode and tracks changes. AI Sloppy Copy checks authored prose locally. Chief of Staff loads the retained persona and injects AGENTS.md only when Codex has not already loaded the canonical contract. Claude Code receives the full contract through the hook. Review every command before trust.</w:t>
       </w:r>
     </w:p>
     <w:p>
@@ -893,7 +893,7 @@
         <w:pStyle w:val="ListNumber"/>
       </w:pPr>
       <w:r>
-        <w:t>Run claude plugin list --json and confirm all three plugin IDs are enabled.</w:t>
+        <w:t>Run claude plugin list --json and confirm all three plugin IDs are active.</w:t>
       </w:r>
     </w:p>
     <w:p>
@@ -950,7 +950,7 @@
     </w:p>
     <w:p>
       <w:r>
-        <w:t>The scripts install or update all three plugins. The default scope is user. Use project scope only when the repository should carry shared enablement.</w:t>
+        <w:t>The scripts install or update all three plugins. The default scope is user. Use project scope only when the repository should carry shared plugin activation.</w:t>
       </w:r>
     </w:p>
     <w:p>
@@ -994,7 +994,7 @@
           <w:color w:val="9C2F2F"/>
           <w:sz w:val="21"/>
         </w:rPr>
-        <w:t>Shared Claude settings may name marketplaces and enabled plugins. Private identities, paths, scopes, and approval rules stay in ignored chief-of-staff.json.</w:t>
+        <w:t>Shared Claude settings may name marketplaces and active plugins. Private identities, paths, scopes, and approval rules stay in ignored chief-of-staff.json.</w:t>
       </w:r>
     </w:p>
     <w:p>
@@ -1248,6 +1248,60 @@
                 <w:color w:val="000000"/>
                 <w:sz w:val="19"/>
               </w:rPr>
+              <w:t>execution</w:t>
+            </w:r>
+          </w:p>
+        </w:tc>
+        <w:tc>
+          <w:tcPr>
+            <w:tcW w:type="dxa" w:w="7200"/>
+            <w:vAlign w:val="center"/>
+            <w:tcMar>
+              <w:top w:w="100" w:type="dxa"/>
+              <w:start w:w="120" w:type="dxa"/>
+              <w:bottom w:w="100" w:type="dxa"/>
+              <w:end w:w="120" w:type="dxa"/>
+            </w:tcMar>
+          </w:tcPr>
+          <w:p>
+            <w:pPr>
+              <w:spacing w:after="0" w:line="252" w:lineRule="auto"/>
+            </w:pPr>
+            <w:r>
+              <w:rPr>
+                <w:rFonts w:ascii="Calibri" w:hAnsi="Calibri"/>
+                <w:b w:val="0"/>
+                <w:color w:val="000000"/>
+                <w:sz w:val="19"/>
+              </w:rPr>
+              <w:t>Standard Sol Medium work and Expert/high-risk Sol High or Extra High work. No quick tier.</w:t>
+            </w:r>
+          </w:p>
+        </w:tc>
+      </w:tr>
+      <w:tr>
+        <w:tc>
+          <w:tcPr>
+            <w:tcW w:type="dxa" w:w="2160"/>
+            <w:vAlign w:val="center"/>
+            <w:tcMar>
+              <w:top w:w="100" w:type="dxa"/>
+              <w:start w:w="120" w:type="dxa"/>
+              <w:bottom w:w="100" w:type="dxa"/>
+              <w:end w:w="120" w:type="dxa"/>
+            </w:tcMar>
+          </w:tcPr>
+          <w:p>
+            <w:pPr>
+              <w:spacing w:after="0" w:line="252" w:lineRule="auto"/>
+            </w:pPr>
+            <w:r>
+              <w:rPr>
+                <w:rFonts w:ascii="Calibri" w:hAnsi="Calibri"/>
+                <w:b w:val="0"/>
+                <w:color w:val="000000"/>
+                <w:sz w:val="19"/>
+              </w:rPr>
               <w:t>connectors</w:t>
             </w:r>
           </w:p>
@@ -1568,6 +1622,46 @@
       </w:pPr>
       <w:r>
         <w:t>Use idempotency when available. Read the saved result back before any retry or completion report.</w:t>
+      </w:r>
+    </w:p>
+    <w:p>
+      <w:pPr>
+        <w:pStyle w:val="Heading2"/>
+      </w:pPr>
+      <w:r>
+        <w:t>Execution tiers</w:t>
+      </w:r>
+    </w:p>
+    <w:p>
+      <w:pPr>
+        <w:pStyle w:val="ListBullet"/>
+      </w:pPr>
+      <w:r>
+        <w:t>Standard is the default: Sol Medium, relevant workspace inspection, and focused validators proportional to the change.</w:t>
+      </w:r>
+    </w:p>
+    <w:p>
+      <w:pPr>
+        <w:pStyle w:val="ListBullet"/>
+      </w:pPr>
+      <w:r>
+        <w:t>Expert/high-risk covers releases; security; legal; medical; financial; production; permissions; public writes; destructive actions; cross-project work; and multi-system changes.</w:t>
+      </w:r>
+    </w:p>
+    <w:p>
+      <w:pPr>
+        <w:pStyle w:val="ListBullet"/>
+      </w:pPr>
+      <w:r>
+        <w:t>Expert/high-risk uses Sol High or Extra High when available and runs the full relevant validation. It checks failure paths and parity, then reads the saved result back.</w:t>
+      </w:r>
+    </w:p>
+    <w:p>
+      <w:pPr>
+        <w:pStyle w:val="ListBullet"/>
+      </w:pPr>
+      <w:r>
+        <w:t>There is no quick tier.</w:t>
       </w:r>
     </w:p>
     <w:p>
@@ -2055,7 +2149,7 @@
     </w:p>
     <w:p>
       <w:r>
-        <w:t>The sync tool compares the shared Chief of Staff block with every registered target. Project-specific content outside the managed block remains untouched.</w:t>
+        <w:t>The sync tool compares the versioned fail-safe loader with every registered target. Project-specific content outside the managed loader remains untouched.</w:t>
       </w:r>
     </w:p>
     <w:p>
@@ -2193,7 +2287,7 @@
         <w:pStyle w:val="ListBullet"/>
       </w:pPr>
       <w:r>
-        <w:t>AI Sloppy Copy plugin 2.2.5 or later with Standard 2.1.1 or later for exact authored-copy governance.</w:t>
+        <w:t>AI Sloppy Copy plugin 2.2.6 or later with Standard 2.1.1 or later for exact authored-copy governance.</w:t>
       </w:r>
     </w:p>
     <w:p>
@@ -2408,7 +2502,7 @@
                 <w:color w:val="000000"/>
                 <w:sz w:val="19"/>
               </w:rPr>
-              <w:t>97 requirements, six integration rules and source hashes remain present. Eight scenarios remain too.</w:t>
+              <w:t>97 requirements, eight integration rules and source hashes remain present. Eight scenarios remain too.</w:t>
             </w:r>
           </w:p>
         </w:tc>
@@ -2591,7 +2685,7 @@
     </w:p>
     <w:p>
       <w:r>
-        <w:t>Run the eight prompts in persona/persona-contract.json in separate fresh Codex tasks with both GPT-5.6 Sol and GPT-5.6 Terra. Repeat them in a fresh Claude Code session when certifying that host. Static validation proves the contract exists; it cannot honestly grade a live model response.</w:t>
+        <w:t>Run the eight prompts in persona/persona-contract.json in separate fresh Codex tasks with GPT-5.6 Sol Medium. Repeat them in a fresh Claude Code session when certifying that host. Static validation proves the contract exists; it cannot honestly grade a live model response.</w:t>
       </w:r>
     </w:p>
     <w:p>
@@ -2619,7 +2713,7 @@
           <w:color w:val="14213D"/>
           <w:sz w:val="21"/>
         </w:rPr>
-        <w:t>static checks pass and fresh-task behavior on both models meets all eight criteria. Connector identities must match. The first briefing must stay inside the selected scope.</w:t>
+        <w:t>static checks pass and fresh-task Sol Medium behavior meets all eight criteria. Terra compatibility evidence may be carried forward only when every model-facing input is unchanged and the tested delivery path passes. Connector identities must match. The first briefing must stay inside the selected scope.</w:t>
       </w:r>
     </w:p>
     <w:p>
@@ -3113,7 +3207,7 @@
                 <w:color w:val="000000"/>
                 <w:sz w:val="19"/>
               </w:rPr>
-              <w:t>Restore AGENTS.md, persona files and contract. Restore configuration from the same version.</w:t>
+              <w:t>Restore the canonical repository AGENTS.md, persona files and contract. Restore configuration from the same version.</w:t>
             </w:r>
           </w:p>
         </w:tc>
@@ -3204,7 +3298,7 @@
         <w:color w:val="5B6472"/>
         <w:sz w:val="16"/>
       </w:rPr>
-      <w:t xml:space="preserve">v0.5.1   /   </w:t>
+      <w:t xml:space="preserve">v0.5.2   /   </w:t>
     </w:r>
     <w:fldSimple w:instr="PAGE"/>
   </w:p>

</xml_diff>

<commit_message>
release: Chief of Staff v0.6
</commit_message>
<xml_diff>
--- a/docs/Codex Chief of Staff - Installation and SOP.docx
+++ b/docs/Codex Chief of Staff - Installation and SOP.docx
@@ -229,7 +229,7 @@
                 <w:color w:val="000000"/>
                 <w:sz w:val="19"/>
               </w:rPr>
-              <w:t>0.5.2</w:t>
+              <w:t>0.6</w:t>
             </w:r>
           </w:p>
         </w:tc>
@@ -2287,7 +2287,7 @@
         <w:pStyle w:val="ListBullet"/>
       </w:pPr>
       <w:r>
-        <w:t>AI Sloppy Copy plugin 2.2.6 or later with Standard 2.1.1 or later for exact authored-copy governance.</w:t>
+        <w:t>AI Sloppy Copy release 0.3 with Standard 2.1.1 or later for exact authored-copy governance.</w:t>
       </w:r>
     </w:p>
     <w:p>
@@ -2739,6 +2739,130 @@
     </w:p>
     <w:p>
       <w:pPr>
+        <w:pBdr>
+          <w:left w:val="single" w:sz="18" w:space="8" w:color="9C2F2F"/>
+        </w:pBdr>
+        <w:shd w:fill="FBECEC"/>
+        <w:spacing w:before="80" w:after="160"/>
+        <w:ind w:left="115" w:right="115"/>
+      </w:pPr>
+      <w:r>
+        <w:rPr>
+          <w:rFonts w:ascii="Calibri" w:hAnsi="Calibri"/>
+          <w:b/>
+          <w:color w:val="9C2F2F"/>
+          <w:sz w:val="21"/>
+        </w:rPr>
+        <w:t xml:space="preserve">AI Sloppy Copy 0.3 reset: </w:t>
+      </w:r>
+      <w:r>
+        <w:rPr>
+          <w:rFonts w:ascii="Calibri" w:hAnsi="Calibri"/>
+          <w:b w:val="0"/>
+          <w:color w:val="9C2F2F"/>
+          <w:sz w:val="21"/>
+        </w:rPr>
+        <w:t>Remove an existing 2.2.6 installation once before reinstalling. Its required host manifest version is 0.3.0, which semantic-version updaters sort below 2.2.6.</w:t>
+      </w:r>
+    </w:p>
+    <w:p>
+      <w:pPr>
+        <w:shd w:fill="EEF1F5"/>
+        <w:spacing w:before="40" w:after="160"/>
+        <w:ind w:left="317" w:right="317"/>
+      </w:pPr>
+      <w:r>
+        <w:rPr>
+          <w:rFonts w:ascii="Consolas" w:hAnsi="Consolas"/>
+          <w:b w:val="0"/>
+          <w:color w:val="14213D"/>
+          <w:sz w:val="17"/>
+        </w:rPr>
+        <w:t>codex plugin remove ai-sloppy-copy@ai-sloppy-copy</w:t>
+      </w:r>
+    </w:p>
+    <w:p>
+      <w:pPr>
+        <w:shd w:fill="EEF1F5"/>
+        <w:spacing w:before="40" w:after="160"/>
+        <w:ind w:left="317" w:right="317"/>
+      </w:pPr>
+      <w:r>
+        <w:rPr>
+          <w:rFonts w:ascii="Consolas" w:hAnsi="Consolas"/>
+          <w:b w:val="0"/>
+          <w:color w:val="14213D"/>
+          <w:sz w:val="17"/>
+        </w:rPr>
+        <w:t>codex plugin marketplace upgrade ai-sloppy-copy</w:t>
+      </w:r>
+    </w:p>
+    <w:p>
+      <w:pPr>
+        <w:shd w:fill="EEF1F5"/>
+        <w:spacing w:before="40" w:after="160"/>
+        <w:ind w:left="317" w:right="317"/>
+      </w:pPr>
+      <w:r>
+        <w:rPr>
+          <w:rFonts w:ascii="Consolas" w:hAnsi="Consolas"/>
+          <w:b w:val="0"/>
+          <w:color w:val="14213D"/>
+          <w:sz w:val="17"/>
+        </w:rPr>
+        <w:t>codex plugin add ai-sloppy-copy@ai-sloppy-copy</w:t>
+      </w:r>
+    </w:p>
+    <w:p>
+      <w:pPr>
+        <w:shd w:fill="EEF1F5"/>
+        <w:spacing w:before="40" w:after="160"/>
+        <w:ind w:left="317" w:right="317"/>
+      </w:pPr>
+      <w:r>
+        <w:rPr>
+          <w:rFonts w:ascii="Consolas" w:hAnsi="Consolas"/>
+          <w:b w:val="0"/>
+          <w:color w:val="14213D"/>
+          <w:sz w:val="17"/>
+        </w:rPr>
+        <w:t>claude plugin uninstall ai-sloppy-copy@ai-sloppy-copy</w:t>
+      </w:r>
+    </w:p>
+    <w:p>
+      <w:pPr>
+        <w:shd w:fill="EEF1F5"/>
+        <w:spacing w:before="40" w:after="160"/>
+        <w:ind w:left="317" w:right="317"/>
+      </w:pPr>
+      <w:r>
+        <w:rPr>
+          <w:rFonts w:ascii="Consolas" w:hAnsi="Consolas"/>
+          <w:b w:val="0"/>
+          <w:color w:val="14213D"/>
+          <w:sz w:val="17"/>
+        </w:rPr>
+        <w:t>claude plugin marketplace update ai-sloppy-copy</w:t>
+      </w:r>
+    </w:p>
+    <w:p>
+      <w:pPr>
+        <w:shd w:fill="EEF1F5"/>
+        <w:spacing w:before="40" w:after="160"/>
+        <w:ind w:left="317" w:right="317"/>
+      </w:pPr>
+      <w:r>
+        <w:rPr>
+          <w:rFonts w:ascii="Consolas" w:hAnsi="Consolas"/>
+          <w:b w:val="0"/>
+          <w:color w:val="14213D"/>
+          <w:sz w:val="17"/>
+        </w:rPr>
+        <w:t>claude plugin install ai-sloppy-copy@ai-sloppy-copy --scope user</w:t>
+      </w:r>
+    </w:p>
+    <w:p>
+      <w:pPr>
         <w:shd w:fill="EEF1F5"/>
         <w:spacing w:before="40" w:after="160"/>
         <w:ind w:left="317" w:right="317"/>
@@ -2908,6 +3032,296 @@
     <w:p>
       <w:r>
         <w:t>Uninstalling does not delete chief-of-staff.json. Remove that private file separately only when the user intends to discard the configuration.</w:t>
+      </w:r>
+    </w:p>
+    <w:p>
+      <w:r>
+        <w:br w:type="page"/>
+      </w:r>
+    </w:p>
+    <w:p>
+      <w:pPr>
+        <w:pStyle w:val="Heading2"/>
+      </w:pPr>
+      <w:r>
+        <w:t>Version labels</w:t>
+      </w:r>
+    </w:p>
+    <w:tbl>
+      <w:tblPr>
+        <w:tblW w:type="dxa" w:w="9360"/>
+        <w:tblLayout w:type="fixed"/>
+        <w:tblLook w:firstColumn="1" w:firstRow="1" w:lastColumn="0" w:lastRow="0" w:noHBand="0" w:noVBand="1" w:val="04A0"/>
+        <w:tblInd w:type="dxa" w:w="120"/>
+        <w:tblBorders>
+          <w:top w:val="single" w:sz="5" w:space="0" w:color="CCD5DF"/>
+          <w:left w:val="single" w:sz="5" w:space="0" w:color="CCD5DF"/>
+          <w:bottom w:val="single" w:sz="5" w:space="0" w:color="CCD5DF"/>
+          <w:right w:val="single" w:sz="5" w:space="0" w:color="CCD5DF"/>
+          <w:insideH w:val="single" w:sz="5" w:space="0" w:color="CCD5DF"/>
+          <w:insideV w:val="single" w:sz="5" w:space="0" w:color="CCD5DF"/>
+        </w:tblBorders>
+      </w:tblPr>
+      <w:tblGrid>
+        <w:gridCol w:w="3600"/>
+        <w:gridCol w:w="2880"/>
+        <w:gridCol w:w="2880"/>
+      </w:tblGrid>
+      <w:tr>
+        <w:trPr>
+          <w:tblHeader w:val="true"/>
+        </w:trPr>
+        <w:tc>
+          <w:tcPr>
+            <w:tcW w:type="dxa" w:w="3600"/>
+            <w:shd w:fill="E8F4F2"/>
+            <w:vAlign w:val="center"/>
+            <w:tcMar>
+              <w:top w:w="100" w:type="dxa"/>
+              <w:start w:w="120" w:type="dxa"/>
+              <w:bottom w:w="100" w:type="dxa"/>
+              <w:end w:w="120" w:type="dxa"/>
+            </w:tcMar>
+          </w:tcPr>
+          <w:p>
+            <w:pPr>
+              <w:spacing w:after="0" w:line="252" w:lineRule="auto"/>
+            </w:pPr>
+            <w:r>
+              <w:rPr>
+                <w:rFonts w:ascii="Calibri" w:hAnsi="Calibri"/>
+                <w:b/>
+                <w:color w:val="14213D"/>
+                <w:sz w:val="19"/>
+              </w:rPr>
+              <w:t>Product</w:t>
+            </w:r>
+          </w:p>
+        </w:tc>
+        <w:tc>
+          <w:tcPr>
+            <w:tcW w:type="dxa" w:w="2880"/>
+            <w:shd w:fill="E8F4F2"/>
+            <w:vAlign w:val="center"/>
+            <w:tcMar>
+              <w:top w:w="100" w:type="dxa"/>
+              <w:start w:w="120" w:type="dxa"/>
+              <w:bottom w:w="100" w:type="dxa"/>
+              <w:end w:w="120" w:type="dxa"/>
+            </w:tcMar>
+          </w:tcPr>
+          <w:p>
+            <w:pPr>
+              <w:spacing w:after="0" w:line="252" w:lineRule="auto"/>
+            </w:pPr>
+            <w:r>
+              <w:rPr>
+                <w:rFonts w:ascii="Calibri" w:hAnsi="Calibri"/>
+                <w:b/>
+                <w:color w:val="14213D"/>
+                <w:sz w:val="19"/>
+              </w:rPr>
+              <w:t>Public release</w:t>
+            </w:r>
+          </w:p>
+        </w:tc>
+        <w:tc>
+          <w:tcPr>
+            <w:tcW w:type="dxa" w:w="2880"/>
+            <w:shd w:fill="E8F4F2"/>
+            <w:vAlign w:val="center"/>
+            <w:tcMar>
+              <w:top w:w="100" w:type="dxa"/>
+              <w:start w:w="120" w:type="dxa"/>
+              <w:bottom w:w="100" w:type="dxa"/>
+              <w:end w:w="120" w:type="dxa"/>
+            </w:tcMar>
+          </w:tcPr>
+          <w:p>
+            <w:pPr>
+              <w:spacing w:after="0" w:line="252" w:lineRule="auto"/>
+            </w:pPr>
+            <w:r>
+              <w:rPr>
+                <w:rFonts w:ascii="Calibri" w:hAnsi="Calibri"/>
+                <w:b/>
+                <w:color w:val="14213D"/>
+                <w:sz w:val="19"/>
+              </w:rPr>
+              <w:t>Host manifest</w:t>
+            </w:r>
+          </w:p>
+        </w:tc>
+      </w:tr>
+      <w:tr>
+        <w:tc>
+          <w:tcPr>
+            <w:tcW w:type="dxa" w:w="3600"/>
+            <w:vAlign w:val="center"/>
+            <w:tcMar>
+              <w:top w:w="100" w:type="dxa"/>
+              <w:start w:w="120" w:type="dxa"/>
+              <w:bottom w:w="100" w:type="dxa"/>
+              <w:end w:w="120" w:type="dxa"/>
+            </w:tcMar>
+          </w:tcPr>
+          <w:p>
+            <w:pPr>
+              <w:spacing w:after="0" w:line="252" w:lineRule="auto"/>
+            </w:pPr>
+            <w:r>
+              <w:rPr>
+                <w:rFonts w:ascii="Calibri" w:hAnsi="Calibri"/>
+                <w:b w:val="0"/>
+                <w:color w:val="000000"/>
+                <w:sz w:val="19"/>
+              </w:rPr>
+              <w:t>Chief of Staff</w:t>
+            </w:r>
+          </w:p>
+        </w:tc>
+        <w:tc>
+          <w:tcPr>
+            <w:tcW w:type="dxa" w:w="2880"/>
+            <w:vAlign w:val="center"/>
+            <w:tcMar>
+              <w:top w:w="100" w:type="dxa"/>
+              <w:start w:w="120" w:type="dxa"/>
+              <w:bottom w:w="100" w:type="dxa"/>
+              <w:end w:w="120" w:type="dxa"/>
+            </w:tcMar>
+          </w:tcPr>
+          <w:p>
+            <w:pPr>
+              <w:spacing w:after="0" w:line="252" w:lineRule="auto"/>
+            </w:pPr>
+            <w:r>
+              <w:rPr>
+                <w:rFonts w:ascii="Calibri" w:hAnsi="Calibri"/>
+                <w:b w:val="0"/>
+                <w:color w:val="000000"/>
+                <w:sz w:val="19"/>
+              </w:rPr>
+              <w:t>0.6</w:t>
+            </w:r>
+          </w:p>
+        </w:tc>
+        <w:tc>
+          <w:tcPr>
+            <w:tcW w:type="dxa" w:w="2880"/>
+            <w:vAlign w:val="center"/>
+            <w:tcMar>
+              <w:top w:w="100" w:type="dxa"/>
+              <w:start w:w="120" w:type="dxa"/>
+              <w:bottom w:w="100" w:type="dxa"/>
+              <w:end w:w="120" w:type="dxa"/>
+            </w:tcMar>
+          </w:tcPr>
+          <w:p>
+            <w:pPr>
+              <w:spacing w:after="0" w:line="252" w:lineRule="auto"/>
+            </w:pPr>
+            <w:r>
+              <w:rPr>
+                <w:rFonts w:ascii="Calibri" w:hAnsi="Calibri"/>
+                <w:b w:val="0"/>
+                <w:color w:val="000000"/>
+                <w:sz w:val="19"/>
+              </w:rPr>
+              <w:t>0.6.0</w:t>
+            </w:r>
+          </w:p>
+        </w:tc>
+      </w:tr>
+      <w:tr>
+        <w:tc>
+          <w:tcPr>
+            <w:tcW w:type="dxa" w:w="3600"/>
+            <w:vAlign w:val="center"/>
+            <w:tcMar>
+              <w:top w:w="100" w:type="dxa"/>
+              <w:start w:w="120" w:type="dxa"/>
+              <w:bottom w:w="100" w:type="dxa"/>
+              <w:end w:w="120" w:type="dxa"/>
+            </w:tcMar>
+          </w:tcPr>
+          <w:p>
+            <w:pPr>
+              <w:spacing w:after="0" w:line="252" w:lineRule="auto"/>
+            </w:pPr>
+            <w:r>
+              <w:rPr>
+                <w:rFonts w:ascii="Calibri" w:hAnsi="Calibri"/>
+                <w:b w:val="0"/>
+                <w:color w:val="000000"/>
+                <w:sz w:val="19"/>
+              </w:rPr>
+              <w:t>AI Sloppy Copy</w:t>
+            </w:r>
+          </w:p>
+        </w:tc>
+        <w:tc>
+          <w:tcPr>
+            <w:tcW w:type="dxa" w:w="2880"/>
+            <w:vAlign w:val="center"/>
+            <w:tcMar>
+              <w:top w:w="100" w:type="dxa"/>
+              <w:start w:w="120" w:type="dxa"/>
+              <w:bottom w:w="100" w:type="dxa"/>
+              <w:end w:w="120" w:type="dxa"/>
+            </w:tcMar>
+          </w:tcPr>
+          <w:p>
+            <w:pPr>
+              <w:spacing w:after="0" w:line="252" w:lineRule="auto"/>
+            </w:pPr>
+            <w:r>
+              <w:rPr>
+                <w:rFonts w:ascii="Calibri" w:hAnsi="Calibri"/>
+                <w:b w:val="0"/>
+                <w:color w:val="000000"/>
+                <w:sz w:val="19"/>
+              </w:rPr>
+              <w:t>0.3</w:t>
+            </w:r>
+          </w:p>
+        </w:tc>
+        <w:tc>
+          <w:tcPr>
+            <w:tcW w:type="dxa" w:w="2880"/>
+            <w:vAlign w:val="center"/>
+            <w:tcMar>
+              <w:top w:w="100" w:type="dxa"/>
+              <w:start w:w="120" w:type="dxa"/>
+              <w:bottom w:w="100" w:type="dxa"/>
+              <w:end w:w="120" w:type="dxa"/>
+            </w:tcMar>
+          </w:tcPr>
+          <w:p>
+            <w:pPr>
+              <w:spacing w:after="0" w:line="252" w:lineRule="auto"/>
+            </w:pPr>
+            <w:r>
+              <w:rPr>
+                <w:rFonts w:ascii="Calibri" w:hAnsi="Calibri"/>
+                <w:b w:val="0"/>
+                <w:color w:val="000000"/>
+                <w:sz w:val="19"/>
+              </w:rPr>
+              <w:t>0.3.0</w:t>
+            </w:r>
+          </w:p>
+        </w:tc>
+      </w:tr>
+    </w:tbl>
+    <w:p>
+      <w:pPr>
+        <w:spacing w:after="0"/>
+      </w:pPr>
+    </w:p>
+    <w:p>
+      <w:r>
+        <w:t>Public tags, documentation and ZIP names use one-decimal pre-1.0 milestones. Codex and Claude Code manifests retain the final zero because both hosts require strict semantic versions.</w:t>
       </w:r>
     </w:p>
     <w:p>
@@ -3298,7 +3712,7 @@
         <w:color w:val="5B6472"/>
         <w:sz w:val="16"/>
       </w:rPr>
-      <w:t xml:space="preserve">v0.5.2   /   </w:t>
+      <w:t xml:space="preserve">v0.6   /   </w:t>
     </w:r>
     <w:fldSimple w:instr="PAGE"/>
   </w:p>

</xml_diff>

<commit_message>
chore: require AI Sloppy Copy 0.4
</commit_message>
<xml_diff>
--- a/docs/Codex Chief of Staff - Installation and SOP.docx
+++ b/docs/Codex Chief of Staff - Installation and SOP.docx
@@ -23,7 +23,7 @@
                     <pic:cNvPicPr/>
                   </pic:nvPicPr>
                   <pic:blipFill>
-                    <a:blip r:embed="rId11"/>
+                    <a:blip r:embed="rId13"/>
                     <a:stretch>
                       <a:fillRect/>
                     </a:stretch>
@@ -468,7 +468,7 @@
         </w:rPr>
         <w:t xml:space="preserve">Repository: </w:t>
       </w:r>
-      <w:hyperlink r:id="rId12">
+      <w:hyperlink r:id="rId14">
         <w:r>
           <w:rPr>
             <w:color w:val="2A9D8F"/>
@@ -531,7 +531,7 @@
         </w:rPr>
         <w:t xml:space="preserve">Repository: </w:t>
       </w:r>
-      <w:hyperlink r:id="rId13">
+      <w:hyperlink r:id="rId15">
         <w:r>
           <w:rPr>
             <w:color w:val="2A9D8F"/>
@@ -594,7 +594,7 @@
         </w:rPr>
         <w:t xml:space="preserve">Repository: </w:t>
       </w:r>
-      <w:hyperlink r:id="rId14">
+      <w:hyperlink r:id="rId16">
         <w:r>
           <w:rPr>
             <w:color w:val="2A9D8F"/>
@@ -1825,53 +1825,305 @@
         <w:t>Identity mismatch</w:t>
       </w:r>
     </w:p>
+    <w:tbl>
+      <w:tblPr>
+        <w:tblW w:type="dxa" w:w="9360"/>
+        <w:tblLayout w:type="fixed"/>
+        <w:tblLook w:firstColumn="1" w:firstRow="1" w:lastColumn="0" w:lastRow="0" w:noHBand="0" w:noVBand="1" w:val="04A0"/>
+        <w:tblInd w:type="dxa" w:w="120"/>
+        <w:tblBorders>
+          <w:top w:val="single" w:sz="5" w:space="0" w:color="CCD5DF"/>
+          <w:left w:val="single" w:sz="5" w:space="0" w:color="CCD5DF"/>
+          <w:bottom w:val="single" w:sz="5" w:space="0" w:color="CCD5DF"/>
+          <w:right w:val="single" w:sz="5" w:space="0" w:color="CCD5DF"/>
+          <w:insideH w:val="single" w:sz="5" w:space="0" w:color="CCD5DF"/>
+          <w:insideV w:val="single" w:sz="5" w:space="0" w:color="CCD5DF"/>
+        </w:tblBorders>
+      </w:tblPr>
+      <w:tblGrid>
+        <w:gridCol w:w="900"/>
+        <w:gridCol w:w="8460"/>
+      </w:tblGrid>
+      <w:tr>
+        <w:trPr>
+          <w:tblHeader w:val="true"/>
+        </w:trPr>
+        <w:tc>
+          <w:tcPr>
+            <w:tcW w:type="dxa" w:w="900"/>
+            <w:shd w:fill="E8F4F2"/>
+            <w:vAlign w:val="center"/>
+            <w:tcMar>
+              <w:top w:w="100" w:type="dxa"/>
+              <w:start w:w="120" w:type="dxa"/>
+              <w:bottom w:w="100" w:type="dxa"/>
+              <w:end w:w="120" w:type="dxa"/>
+            </w:tcMar>
+          </w:tcPr>
+          <w:p>
+            <w:pPr>
+              <w:spacing w:after="0" w:line="252" w:lineRule="auto"/>
+            </w:pPr>
+            <w:r>
+              <w:rPr>
+                <w:rFonts w:ascii="Calibri" w:hAnsi="Calibri"/>
+                <w:b/>
+                <w:color w:val="14213D"/>
+                <w:sz w:val="19"/>
+              </w:rPr>
+              <w:t>Step</w:t>
+            </w:r>
+          </w:p>
+        </w:tc>
+        <w:tc>
+          <w:tcPr>
+            <w:tcW w:type="dxa" w:w="8460"/>
+            <w:shd w:fill="E8F4F2"/>
+            <w:vAlign w:val="center"/>
+            <w:tcMar>
+              <w:top w:w="100" w:type="dxa"/>
+              <w:start w:w="120" w:type="dxa"/>
+              <w:bottom w:w="100" w:type="dxa"/>
+              <w:end w:w="120" w:type="dxa"/>
+            </w:tcMar>
+          </w:tcPr>
+          <w:p>
+            <w:pPr>
+              <w:spacing w:after="0" w:line="252" w:lineRule="auto"/>
+            </w:pPr>
+            <w:r>
+              <w:rPr>
+                <w:rFonts w:ascii="Calibri" w:hAnsi="Calibri"/>
+                <w:b/>
+                <w:color w:val="14213D"/>
+                <w:sz w:val="19"/>
+              </w:rPr>
+              <w:t>Required action</w:t>
+            </w:r>
+          </w:p>
+        </w:tc>
+      </w:tr>
+      <w:tr>
+        <w:tc>
+          <w:tcPr>
+            <w:tcW w:type="dxa" w:w="900"/>
+            <w:vAlign w:val="center"/>
+            <w:tcMar>
+              <w:top w:w="100" w:type="dxa"/>
+              <w:start w:w="120" w:type="dxa"/>
+              <w:bottom w:w="100" w:type="dxa"/>
+              <w:end w:w="120" w:type="dxa"/>
+            </w:tcMar>
+          </w:tcPr>
+          <w:p>
+            <w:pPr>
+              <w:spacing w:after="0" w:line="252" w:lineRule="auto"/>
+            </w:pPr>
+            <w:r>
+              <w:rPr>
+                <w:rFonts w:ascii="Calibri" w:hAnsi="Calibri"/>
+                <w:b w:val="0"/>
+                <w:color w:val="000000"/>
+                <w:sz w:val="19"/>
+              </w:rPr>
+              <w:t>1</w:t>
+            </w:r>
+          </w:p>
+        </w:tc>
+        <w:tc>
+          <w:tcPr>
+            <w:tcW w:type="dxa" w:w="8460"/>
+            <w:vAlign w:val="center"/>
+            <w:tcMar>
+              <w:top w:w="100" w:type="dxa"/>
+              <w:start w:w="120" w:type="dxa"/>
+              <w:bottom w:w="100" w:type="dxa"/>
+              <w:end w:w="120" w:type="dxa"/>
+            </w:tcMar>
+          </w:tcPr>
+          <w:p>
+            <w:pPr>
+              <w:spacing w:after="0" w:line="252" w:lineRule="auto"/>
+            </w:pPr>
+            <w:r>
+              <w:rPr>
+                <w:rFonts w:ascii="Calibri" w:hAnsi="Calibri"/>
+                <w:b w:val="0"/>
+                <w:color w:val="000000"/>
+                <w:sz w:val="19"/>
+              </w:rPr>
+              <w:t>Stop before searching, reading, drafting, or changing connector data.</w:t>
+            </w:r>
+          </w:p>
+        </w:tc>
+      </w:tr>
+      <w:tr>
+        <w:tc>
+          <w:tcPr>
+            <w:tcW w:type="dxa" w:w="900"/>
+            <w:vAlign w:val="center"/>
+            <w:tcMar>
+              <w:top w:w="100" w:type="dxa"/>
+              <w:start w:w="120" w:type="dxa"/>
+              <w:bottom w:w="100" w:type="dxa"/>
+              <w:end w:w="120" w:type="dxa"/>
+            </w:tcMar>
+          </w:tcPr>
+          <w:p>
+            <w:pPr>
+              <w:spacing w:after="0" w:line="252" w:lineRule="auto"/>
+            </w:pPr>
+            <w:r>
+              <w:rPr>
+                <w:rFonts w:ascii="Calibri" w:hAnsi="Calibri"/>
+                <w:b w:val="0"/>
+                <w:color w:val="000000"/>
+                <w:sz w:val="19"/>
+              </w:rPr>
+              <w:t>2</w:t>
+            </w:r>
+          </w:p>
+        </w:tc>
+        <w:tc>
+          <w:tcPr>
+            <w:tcW w:type="dxa" w:w="8460"/>
+            <w:vAlign w:val="center"/>
+            <w:tcMar>
+              <w:top w:w="100" w:type="dxa"/>
+              <w:start w:w="120" w:type="dxa"/>
+              <w:bottom w:w="100" w:type="dxa"/>
+              <w:end w:w="120" w:type="dxa"/>
+            </w:tcMar>
+          </w:tcPr>
+          <w:p>
+            <w:pPr>
+              <w:spacing w:after="0" w:line="252" w:lineRule="auto"/>
+            </w:pPr>
+            <w:r>
+              <w:rPr>
+                <w:rFonts w:ascii="Calibri" w:hAnsi="Calibri"/>
+                <w:b w:val="0"/>
+                <w:color w:val="000000"/>
+                <w:sz w:val="19"/>
+              </w:rPr>
+              <w:t>Report the expected identity and the actual identity shown.</w:t>
+            </w:r>
+          </w:p>
+        </w:tc>
+      </w:tr>
+      <w:tr>
+        <w:tc>
+          <w:tcPr>
+            <w:tcW w:type="dxa" w:w="900"/>
+            <w:vAlign w:val="center"/>
+            <w:tcMar>
+              <w:top w:w="100" w:type="dxa"/>
+              <w:start w:w="120" w:type="dxa"/>
+              <w:bottom w:w="100" w:type="dxa"/>
+              <w:end w:w="120" w:type="dxa"/>
+            </w:tcMar>
+          </w:tcPr>
+          <w:p>
+            <w:pPr>
+              <w:spacing w:after="0" w:line="252" w:lineRule="auto"/>
+            </w:pPr>
+            <w:r>
+              <w:rPr>
+                <w:rFonts w:ascii="Calibri" w:hAnsi="Calibri"/>
+                <w:b w:val="0"/>
+                <w:color w:val="000000"/>
+                <w:sz w:val="19"/>
+              </w:rPr>
+              <w:t>3</w:t>
+            </w:r>
+          </w:p>
+        </w:tc>
+        <w:tc>
+          <w:tcPr>
+            <w:tcW w:type="dxa" w:w="8460"/>
+            <w:vAlign w:val="center"/>
+            <w:tcMar>
+              <w:top w:w="100" w:type="dxa"/>
+              <w:start w:w="120" w:type="dxa"/>
+              <w:bottom w:w="100" w:type="dxa"/>
+              <w:end w:w="120" w:type="dxa"/>
+            </w:tcMar>
+          </w:tcPr>
+          <w:p>
+            <w:pPr>
+              <w:spacing w:after="0" w:line="252" w:lineRule="auto"/>
+            </w:pPr>
+            <w:r>
+              <w:rPr>
+                <w:rFonts w:ascii="Calibri" w:hAnsi="Calibri"/>
+                <w:b w:val="0"/>
+                <w:color w:val="000000"/>
+                <w:sz w:val="19"/>
+              </w:rPr>
+              <w:t>Reconnect the approved account outside the task.</w:t>
+            </w:r>
+          </w:p>
+        </w:tc>
+      </w:tr>
+      <w:tr>
+        <w:tc>
+          <w:tcPr>
+            <w:tcW w:type="dxa" w:w="900"/>
+            <w:vAlign w:val="center"/>
+            <w:tcMar>
+              <w:top w:w="100" w:type="dxa"/>
+              <w:start w:w="120" w:type="dxa"/>
+              <w:bottom w:w="100" w:type="dxa"/>
+              <w:end w:w="120" w:type="dxa"/>
+            </w:tcMar>
+          </w:tcPr>
+          <w:p>
+            <w:pPr>
+              <w:spacing w:after="0" w:line="252" w:lineRule="auto"/>
+            </w:pPr>
+            <w:r>
+              <w:rPr>
+                <w:rFonts w:ascii="Calibri" w:hAnsi="Calibri"/>
+                <w:b w:val="0"/>
+                <w:color w:val="000000"/>
+                <w:sz w:val="19"/>
+              </w:rPr>
+              <w:t>4</w:t>
+            </w:r>
+          </w:p>
+        </w:tc>
+        <w:tc>
+          <w:tcPr>
+            <w:tcW w:type="dxa" w:w="8460"/>
+            <w:vAlign w:val="center"/>
+            <w:tcMar>
+              <w:top w:w="100" w:type="dxa"/>
+              <w:start w:w="120" w:type="dxa"/>
+              <w:bottom w:w="100" w:type="dxa"/>
+              <w:end w:w="120" w:type="dxa"/>
+            </w:tcMar>
+          </w:tcPr>
+          <w:p>
+            <w:pPr>
+              <w:spacing w:after="0" w:line="252" w:lineRule="auto"/>
+            </w:pPr>
+            <w:r>
+              <w:rPr>
+                <w:rFonts w:ascii="Calibri" w:hAnsi="Calibri"/>
+                <w:b w:val="0"/>
+                <w:color w:val="000000"/>
+                <w:sz w:val="19"/>
+              </w:rPr>
+              <w:t>Repeat the identity check and resume only after every configured field matches.</w:t>
+            </w:r>
+          </w:p>
+        </w:tc>
+      </w:tr>
+    </w:tbl>
     <w:p>
       <w:pPr>
-        <w:numPr>
-          <w:ilvl w:val="0"/>
-          <w:numId w:val="14"/>
-        </w:numPr>
-        <w:pStyle w:val="ListNumber"/>
-      </w:pPr>
-      <w:r>
-        <w:t>Stop before searching, reading, drafting, or changing connector data.</w:t>
-      </w:r>
-    </w:p>
-    <w:p>
-      <w:pPr>
-        <w:numPr>
-          <w:ilvl w:val="0"/>
-          <w:numId w:val="14"/>
-        </w:numPr>
-        <w:pStyle w:val="ListNumber"/>
-      </w:pPr>
-      <w:r>
-        <w:t>Report the expected identity and the actual identity shown.</w:t>
-      </w:r>
-    </w:p>
-    <w:p>
-      <w:pPr>
-        <w:numPr>
-          <w:ilvl w:val="0"/>
-          <w:numId w:val="14"/>
-        </w:numPr>
-        <w:pStyle w:val="ListNumber"/>
-      </w:pPr>
-      <w:r>
-        <w:t>Reconnect the approved account outside the task.</w:t>
-      </w:r>
-    </w:p>
-    <w:p>
-      <w:pPr>
-        <w:numPr>
-          <w:ilvl w:val="0"/>
-          <w:numId w:val="14"/>
-        </w:numPr>
-        <w:pStyle w:val="ListNumber"/>
-      </w:pPr>
-      <w:r>
-        <w:t>Repeat the identity check and resume only after every configured field matches.</w:t>
-      </w:r>
+        <w:spacing w:after="0"/>
+      </w:pPr>
     </w:p>
     <w:tbl>
       <w:tblPr>
@@ -2099,14 +2351,29 @@
     </w:p>
     <w:p>
       <w:pPr>
-        <w:pStyle w:val="Heading2"/>
+        <w:pBdr>
+          <w:left w:val="single" w:sz="18" w:space="8" w:color="2A9D8F"/>
+        </w:pBdr>
+        <w:shd w:fill="E8F4F2"/>
+        <w:spacing w:before="80" w:after="160"/>
+        <w:ind w:left="115" w:right="115"/>
       </w:pPr>
       <w:r>
-        <w:t>Tone boundary</w:t>
+        <w:rPr>
+          <w:rFonts w:ascii="Calibri" w:hAnsi="Calibri"/>
+          <w:b/>
+          <w:color w:val="14213D"/>
+          <w:sz w:val="21"/>
+        </w:rPr>
+        <w:t xml:space="preserve">Tone boundary: </w:t>
       </w:r>
-    </w:p>
-    <w:p>
       <w:r>
+        <w:rPr>
+          <w:rFonts w:ascii="Calibri" w:hAnsi="Calibri"/>
+          <w:b w:val="0"/>
+          <w:color w:val="14213D"/>
+          <w:sz w:val="21"/>
+        </w:rPr>
         <w:t>Direct replies may use useful dry sarcasm and cynical humor. Client-facing, legal, medical, executive, and external communication stays professional unless the user explicitly requests another tone.</w:t>
       </w:r>
     </w:p>
@@ -2241,7 +2508,7 @@
         </w:rPr>
         <w:t xml:space="preserve">Ponytail repository: </w:t>
       </w:r>
-      <w:hyperlink r:id="rId12">
+      <w:hyperlink r:id="rId14">
         <w:r>
           <w:rPr>
             <w:color w:val="2A9D8F"/>
@@ -2264,7 +2531,7 @@
         </w:rPr>
         <w:t xml:space="preserve">AI Sloppy Copy repository: </w:t>
       </w:r>
-      <w:hyperlink r:id="rId13">
+      <w:hyperlink r:id="rId15">
         <w:r>
           <w:rPr>
             <w:color w:val="2A9D8F"/>
@@ -2287,7 +2554,7 @@
         <w:pStyle w:val="ListBullet"/>
       </w:pPr>
       <w:r>
-        <w:t>AI Sloppy Copy release 0.3 with Standard 2.1.1 or later for exact authored-copy governance.</w:t>
+        <w:t>AI Sloppy Copy release 0.4 with Standard 2.2.0 or later for exact authored-copy governance.</w:t>
       </w:r>
     </w:p>
     <w:p>
@@ -2753,7 +3020,7 @@
           <w:color w:val="9C2F2F"/>
           <w:sz w:val="21"/>
         </w:rPr>
-        <w:t xml:space="preserve">AI Sloppy Copy 0.3 reset: </w:t>
+        <w:t xml:space="preserve">AI Sloppy Copy legacy-version reset: </w:t>
       </w:r>
       <w:r>
         <w:rPr>
@@ -2762,7 +3029,7 @@
           <w:color w:val="9C2F2F"/>
           <w:sz w:val="21"/>
         </w:rPr>
-        <w:t>Remove an existing 2.2.6 installation once before reinstalling. Its required host manifest version is 0.3.0, which semantic-version updaters sort below 2.2.6.</w:t>
+        <w:t>Remove an existing 2.2.6 installation once before reinstalling. Its required host manifest version is 0.4.0, which semantic-version updaters sort below 2.2.6.</w:t>
       </w:r>
     </w:p>
     <w:p>
@@ -3282,7 +3549,7 @@
                 <w:color w:val="000000"/>
                 <w:sz w:val="19"/>
               </w:rPr>
-              <w:t>0.3</w:t>
+              <w:t>0.4</w:t>
             </w:r>
           </w:p>
         </w:tc>
@@ -3308,7 +3575,7 @@
                 <w:color w:val="000000"/>
                 <w:sz w:val="19"/>
               </w:rPr>
-              <w:t>0.3.0</w:t>
+              <w:t>0.4.0</w:t>
             </w:r>
           </w:p>
         </w:tc>
@@ -3688,7 +3955,9 @@
     </w:p>
     <w:sectPr>
       <w:headerReference w:type="default" r:id="rId9"/>
-      <w:footerReference w:type="default" r:id="rId10"/>
+      <w:headerReference w:type="even" r:id="rId10"/>
+      <w:footerReference w:type="default" r:id="rId11"/>
+      <w:footerReference w:type="even" r:id="rId12"/>
       <w:pgSz w:w="12240" w:h="15840"/>
       <w:pgMar w:top="1440" w:right="1440" w:bottom="1440" w:left="1440" w:header="504" w:footer="504" w:gutter="0"/>
       <w:cols w:space="720"/>
@@ -3719,7 +3988,48 @@
 </w:ftr>
 </file>
 
+<file path=word/footer2.xml><?xml version="1.0" encoding="utf-8"?>
+<w:ftr xmlns:m="http://schemas.openxmlformats.org/officeDocument/2006/math" xmlns:mc="http://schemas.openxmlformats.org/markup-compatibility/2006" xmlns:mo="http://schemas.microsoft.com/office/mac/office/2008/main" xmlns:mv="urn:schemas-microsoft-com:mac:vml" xmlns:o="urn:schemas-microsoft-com:office:office" xmlns:r="http://schemas.openxmlformats.org/officeDocument/2006/relationships" xmlns:v="urn:schemas-microsoft-com:vml" xmlns:w10="urn:schemas-microsoft-com:office:word" xmlns:w14="http://schemas.microsoft.com/office/word/2010/wordml" xmlns:w="http://schemas.openxmlformats.org/wordprocessingml/2006/main" xmlns:wne="http://schemas.microsoft.com/office/word/2006/wordml" xmlns:wp14="http://schemas.microsoft.com/office/word/2010/wordprocessingDrawing" xmlns:wp="http://schemas.openxmlformats.org/drawingml/2006/wordprocessingDrawing" xmlns:wpc="http://schemas.microsoft.com/office/word/2010/wordprocessingCanvas" xmlns:wpg="http://schemas.microsoft.com/office/word/2010/wordprocessingGroup" xmlns:wpi="http://schemas.microsoft.com/office/word/2010/wordprocessingInk" xmlns:wps="http://schemas.microsoft.com/office/word/2010/wordprocessingShape" mc:Ignorable="w14 wp14">
+  <w:p>
+    <w:pPr>
+      <w:pStyle w:val="Footer"/>
+      <w:jc w:val="right"/>
+    </w:pPr>
+    <w:r>
+      <w:rPr>
+        <w:rFonts w:ascii="Calibri" w:hAnsi="Calibri"/>
+        <w:b w:val="0"/>
+        <w:color w:val="5B6472"/>
+        <w:sz w:val="16"/>
+      </w:rPr>
+      <w:t xml:space="preserve">v0.6   /   </w:t>
+    </w:r>
+    <w:fldSimple w:instr="PAGE"/>
+  </w:p>
+</w:ftr>
+</file>
+
 <file path=word/header1.xml><?xml version="1.0" encoding="utf-8"?>
+<w:hdr xmlns:m="http://schemas.openxmlformats.org/officeDocument/2006/math" xmlns:mc="http://schemas.openxmlformats.org/markup-compatibility/2006" xmlns:mo="http://schemas.microsoft.com/office/mac/office/2008/main" xmlns:mv="urn:schemas-microsoft-com:mac:vml" xmlns:o="urn:schemas-microsoft-com:office:office" xmlns:r="http://schemas.openxmlformats.org/officeDocument/2006/relationships" xmlns:v="urn:schemas-microsoft-com:vml" xmlns:w10="urn:schemas-microsoft-com:office:word" xmlns:w14="http://schemas.microsoft.com/office/word/2010/wordml" xmlns:w="http://schemas.openxmlformats.org/wordprocessingml/2006/main" xmlns:wne="http://schemas.microsoft.com/office/word/2006/wordml" xmlns:wp14="http://schemas.microsoft.com/office/word/2010/wordprocessingDrawing" xmlns:wp="http://schemas.openxmlformats.org/drawingml/2006/wordprocessingDrawing" xmlns:wpc="http://schemas.microsoft.com/office/word/2010/wordprocessingCanvas" xmlns:wpg="http://schemas.microsoft.com/office/word/2010/wordprocessingGroup" xmlns:wpi="http://schemas.microsoft.com/office/word/2010/wordprocessingInk" xmlns:wps="http://schemas.microsoft.com/office/word/2010/wordprocessingShape" mc:Ignorable="w14 wp14">
+  <w:p>
+    <w:pPr>
+      <w:pStyle w:val="Header"/>
+      <w:jc w:val="left"/>
+    </w:pPr>
+    <w:r>
+      <w:rPr>
+        <w:rFonts w:ascii="Calibri" w:hAnsi="Calibri"/>
+        <w:b/>
+        <w:color w:val="5B6472"/>
+        <w:sz w:val="16"/>
+      </w:rPr>
+      <w:t>CHIEF OF STAFF  /  CODEX + CLAUDE CODE  /  INSTALLATION AND OPERATING SOP</w:t>
+    </w:r>
+  </w:p>
+</w:hdr>
+</file>
+
+<file path=word/header2.xml><?xml version="1.0" encoding="utf-8"?>
 <w:hdr xmlns:m="http://schemas.openxmlformats.org/officeDocument/2006/math" xmlns:mc="http://schemas.openxmlformats.org/markup-compatibility/2006" xmlns:mo="http://schemas.microsoft.com/office/mac/office/2008/main" xmlns:mv="urn:schemas-microsoft-com:mac:vml" xmlns:o="urn:schemas-microsoft-com:office:office" xmlns:r="http://schemas.openxmlformats.org/officeDocument/2006/relationships" xmlns:v="urn:schemas-microsoft-com:vml" xmlns:w10="urn:schemas-microsoft-com:office:word" xmlns:w14="http://schemas.microsoft.com/office/word/2010/wordml" xmlns:w="http://schemas.openxmlformats.org/wordprocessingml/2006/main" xmlns:wne="http://schemas.microsoft.com/office/word/2006/wordml" xmlns:wp14="http://schemas.microsoft.com/office/word/2010/wordprocessingDrawing" xmlns:wp="http://schemas.openxmlformats.org/drawingml/2006/wordprocessingDrawing" xmlns:wpc="http://schemas.microsoft.com/office/word/2010/wordprocessingCanvas" xmlns:wpg="http://schemas.microsoft.com/office/word/2010/wordprocessingGroup" xmlns:wpi="http://schemas.microsoft.com/office/word/2010/wordprocessingInk" xmlns:wps="http://schemas.microsoft.com/office/word/2010/wordprocessingShape" mc:Ignorable="w14 wp14">
   <w:p>
     <w:pPr>
@@ -3958,12 +4268,6 @@
     </w:lvlOverride>
   </w:num>
   <w:num w:numId="13">
-    <w:abstractNumId w:val="7"/>
-    <w:lvlOverride w:ilvl="0">
-      <w:startOverride w:val="1"/>
-    </w:lvlOverride>
-  </w:num>
-  <w:num w:numId="14">
     <w:abstractNumId w:val="7"/>
     <w:lvlOverride w:ilvl="0">
       <w:startOverride w:val="1"/>

</xml_diff>

<commit_message>
release: Chief of Staff v1.0.0
</commit_message>
<xml_diff>
--- a/docs/Codex Chief of Staff - Installation and SOP.docx
+++ b/docs/Codex Chief of Staff - Installation and SOP.docx
@@ -69,7 +69,7 @@
           <w:color w:val="5B6472"/>
           <w:sz w:val="26"/>
         </w:rPr>
-        <w:t>Native plugin release / scoped execution / retained judgment</w:t>
+        <w:t>Native plugin / scoped execution / default ICM architecture</w:t>
       </w:r>
     </w:p>
     <w:tbl>
@@ -229,7 +229,7 @@
                 <w:color w:val="000000"/>
                 <w:sz w:val="19"/>
               </w:rPr>
-              <w:t>0.6</w:t>
+              <w:t>1.0.0</w:t>
             </w:r>
           </w:p>
         </w:tc>
@@ -383,6 +383,14 @@
         <w:pStyle w:val="ListBullet"/>
       </w:pPr>
       <w:r>
+        <w:t>A compact ICM task contract for every non-trivial task and automatic architecture for new projects.</w:t>
+      </w:r>
+    </w:p>
+    <w:p>
+      <w:pPr>
+        <w:pStyle w:val="ListBullet"/>
+      </w:pPr>
+      <w:r>
         <w:t>One canonical behavior contract with fail-safe project loaders that preserve every project-specific rule.</w:t>
       </w:r>
     </w:p>
@@ -646,11 +654,13 @@
     </w:p>
     <w:p>
       <w:pPr>
+        <w:pStyle w:val="ListNumber"/>
         <w:numPr>
           <w:ilvl w:val="0"/>
           <w:numId w:val="10"/>
         </w:numPr>
-        <w:pStyle w:val="ListNumber"/>
+        <w:keepNext w:val="0"/>
+        <w:spacing w:after="60" w:line="288" w:lineRule="auto"/>
       </w:pPr>
       <w:r>
         <w:t>Restart Codex.</w:t>
@@ -658,11 +668,13 @@
     </w:p>
     <w:p>
       <w:pPr>
+        <w:pStyle w:val="ListNumber"/>
         <w:numPr>
           <w:ilvl w:val="0"/>
           <w:numId w:val="10"/>
         </w:numPr>
-        <w:pStyle w:val="ListNumber"/>
+        <w:keepNext w:val="0"/>
+        <w:spacing w:after="60" w:line="288" w:lineRule="auto"/>
       </w:pPr>
       <w:r>
         <w:t>Open /hooks. Review and trust the hooks offered by Ponytail, AI Sloppy Copy and Chief of Staff.</w:t>
@@ -670,11 +682,13 @@
     </w:p>
     <w:p>
       <w:pPr>
+        <w:pStyle w:val="ListNumber"/>
         <w:numPr>
           <w:ilvl w:val="0"/>
           <w:numId w:val="10"/>
         </w:numPr>
-        <w:pStyle w:val="ListNumber"/>
+        <w:keepNext w:val="0"/>
+        <w:spacing w:after="60" w:line="288" w:lineRule="auto"/>
       </w:pPr>
       <w:r>
         <w:t>Start a fresh task. Existing tasks do not retroactively gain startup context.</w:t>
@@ -682,11 +696,13 @@
     </w:p>
     <w:p>
       <w:pPr>
+        <w:pStyle w:val="ListNumber"/>
         <w:numPr>
           <w:ilvl w:val="0"/>
           <w:numId w:val="10"/>
         </w:numPr>
-        <w:pStyle w:val="ListNumber"/>
+        <w:keepNext w:val="0"/>
+        <w:spacing w:after="60" w:line="288" w:lineRule="auto"/>
       </w:pPr>
       <w:r>
         <w:t>Run codex plugin list --json.</w:t>
@@ -694,11 +710,13 @@
     </w:p>
     <w:p>
       <w:pPr>
+        <w:pStyle w:val="ListNumber"/>
         <w:numPr>
           <w:ilvl w:val="0"/>
           <w:numId w:val="10"/>
         </w:numPr>
-        <w:pStyle w:val="ListNumber"/>
+        <w:keepNext w:val="0"/>
+        <w:spacing w:after="60" w:line="288" w:lineRule="auto"/>
       </w:pPr>
       <w:r>
         <w:t>Confirm ponytail@ponytail, ai-sloppy-copy@ai-sloppy-copy and chief-of-staff@codex-chief-of-staff are installed and active.</w:t>
@@ -862,11 +880,13 @@
     </w:p>
     <w:p>
       <w:pPr>
+        <w:pStyle w:val="ListNumber"/>
         <w:numPr>
           <w:ilvl w:val="0"/>
           <w:numId w:val="11"/>
         </w:numPr>
-        <w:pStyle w:val="ListNumber"/>
+        <w:keepNext w:val="0"/>
+        <w:spacing w:after="60" w:line="288" w:lineRule="auto"/>
       </w:pPr>
       <w:r>
         <w:t>Start Claude Code and run /reload-plugins.</w:t>
@@ -874,11 +894,13 @@
     </w:p>
     <w:p>
       <w:pPr>
+        <w:pStyle w:val="ListNumber"/>
         <w:numPr>
           <w:ilvl w:val="0"/>
           <w:numId w:val="11"/>
         </w:numPr>
-        <w:pStyle w:val="ListNumber"/>
+        <w:keepNext w:val="0"/>
+        <w:spacing w:after="60" w:line="288" w:lineRule="auto"/>
       </w:pPr>
       <w:r>
         <w:t>Open /hooks and review the hooks from all three plugins.</w:t>
@@ -886,11 +908,13 @@
     </w:p>
     <w:p>
       <w:pPr>
+        <w:pStyle w:val="ListNumber"/>
         <w:numPr>
           <w:ilvl w:val="0"/>
           <w:numId w:val="11"/>
         </w:numPr>
-        <w:pStyle w:val="ListNumber"/>
+        <w:keepNext w:val="0"/>
+        <w:spacing w:after="60" w:line="288" w:lineRule="auto"/>
       </w:pPr>
       <w:r>
         <w:t>Run claude plugin list --json and confirm all three plugin IDs are active.</w:t>
@@ -898,11 +922,13 @@
     </w:p>
     <w:p>
       <w:pPr>
+        <w:pStyle w:val="ListNumber"/>
         <w:numPr>
           <w:ilvl w:val="0"/>
           <w:numId w:val="11"/>
         </w:numPr>
-        <w:pStyle w:val="ListNumber"/>
+        <w:keepNext w:val="0"/>
+        <w:spacing w:after="60" w:line="288" w:lineRule="auto"/>
       </w:pPr>
       <w:r>
         <w:t>Start a fresh session so SessionStart loads the contract and retained persona.</w:t>
@@ -1554,11 +1580,13 @@
     </w:p>
     <w:p>
       <w:pPr>
+        <w:pStyle w:val="ListNumber"/>
         <w:numPr>
           <w:ilvl w:val="0"/>
           <w:numId w:val="12"/>
         </w:numPr>
-        <w:pStyle w:val="ListNumber"/>
+        <w:keepNext w:val="0"/>
+        <w:spacing w:after="60" w:line="288" w:lineRule="auto"/>
       </w:pPr>
       <w:r>
         <w:t>Name one configured scope.</w:t>
@@ -1566,11 +1594,13 @@
     </w:p>
     <w:p>
       <w:pPr>
+        <w:pStyle w:val="ListNumber"/>
         <w:numPr>
           <w:ilvl w:val="0"/>
           <w:numId w:val="12"/>
         </w:numPr>
-        <w:pStyle w:val="ListNumber"/>
+        <w:keepNext w:val="0"/>
+        <w:spacing w:after="60" w:line="288" w:lineRule="auto"/>
       </w:pPr>
       <w:r>
         <w:t>Read the resolved Chief of Staff configuration.</w:t>
@@ -1578,11 +1608,13 @@
     </w:p>
     <w:p>
       <w:pPr>
+        <w:pStyle w:val="ListNumber"/>
         <w:numPr>
           <w:ilvl w:val="0"/>
           <w:numId w:val="12"/>
         </w:numPr>
-        <w:pStyle w:val="ListNumber"/>
+        <w:keepNext w:val="0"/>
+        <w:spacing w:after="60" w:line="288" w:lineRule="auto"/>
       </w:pPr>
       <w:r>
         <w:t>Read the selected project's AGENTS.md and source-of-truth files.</w:t>
@@ -1590,11 +1622,41 @@
     </w:p>
     <w:p>
       <w:pPr>
+        <w:pStyle w:val="ListNumber"/>
         <w:numPr>
           <w:ilvl w:val="0"/>
           <w:numId w:val="12"/>
         </w:numPr>
+        <w:keepNext w:val="0"/>
+        <w:spacing w:after="60" w:line="288" w:lineRule="auto"/>
+      </w:pPr>
+      <w:r>
+        <w:t>Define exact inputs, one job, relevant references, output, observable status and the human check.</w:t>
+      </w:r>
+    </w:p>
+    <w:p>
+      <w:pPr>
         <w:pStyle w:val="ListNumber"/>
+        <w:numPr>
+          <w:ilvl w:val="0"/>
+          <w:numId w:val="12"/>
+        </w:numPr>
+        <w:keepNext w:val="0"/>
+        <w:spacing w:after="60" w:line="288" w:lineRule="auto"/>
+      </w:pPr>
+      <w:r>
+        <w:t>Load only the files named by that task contract.</w:t>
+      </w:r>
+    </w:p>
+    <w:p>
+      <w:pPr>
+        <w:pStyle w:val="ListNumber"/>
+        <w:numPr>
+          <w:ilvl w:val="0"/>
+          <w:numId w:val="12"/>
+        </w:numPr>
+        <w:keepNext w:val="0"/>
+        <w:spacing w:after="60" w:line="288" w:lineRule="auto"/>
       </w:pPr>
       <w:r>
         <w:t>Verify each connector identity before its first use in the task.</w:t>
@@ -1602,11 +1664,13 @@
     </w:p>
     <w:p>
       <w:pPr>
+        <w:pStyle w:val="ListNumber"/>
         <w:numPr>
           <w:ilvl w:val="0"/>
           <w:numId w:val="12"/>
         </w:numPr>
-        <w:pStyle w:val="ListNumber"/>
+        <w:keepNext w:val="0"/>
+        <w:spacing w:after="60" w:line="288" w:lineRule="auto"/>
       </w:pPr>
       <w:r>
         <w:t>Check the write policy before creating or changing external state.</w:t>
@@ -1614,11 +1678,13 @@
     </w:p>
     <w:p>
       <w:pPr>
+        <w:pStyle w:val="ListNumber"/>
         <w:numPr>
           <w:ilvl w:val="0"/>
           <w:numId w:val="12"/>
         </w:numPr>
-        <w:pStyle w:val="ListNumber"/>
+        <w:keepNext w:val="0"/>
+        <w:spacing w:after="60" w:line="288" w:lineRule="auto"/>
       </w:pPr>
       <w:r>
         <w:t>Use idempotency when available. Read the saved result back before any retry or completion report.</w:t>
@@ -1629,6 +1695,138 @@
         <w:pStyle w:val="Heading2"/>
       </w:pPr>
       <w:r>
+        <w:t>ICM project and workspace architecture</w:t>
+      </w:r>
+    </w:p>
+    <w:p>
+      <w:pPr>
+        <w:pStyle w:val="ListBullet"/>
+      </w:pPr>
+      <w:r>
+        <w:t>ICM is the default operating architecture. The 85% communication mode remains a separate default.</w:t>
+      </w:r>
+    </w:p>
+    <w:p>
+      <w:pPr>
+        <w:pStyle w:val="ListBullet"/>
+      </w:pPr>
+      <w:r>
+        <w:t>Invoke ICM Architect automatically for every new project, workspace or recurring process.</w:t>
+      </w:r>
+    </w:p>
+    <w:p>
+      <w:pPr>
+        <w:pStyle w:val="ListBullet"/>
+      </w:pPr>
+      <w:r>
+        <w:t>If the prompt does not name a registered project, stay generic. Do not import a client or project fact from configuration or memory.</w:t>
+      </w:r>
+    </w:p>
+    <w:p>
+      <w:pPr>
+        <w:pStyle w:val="ListBullet"/>
+      </w:pPr>
+      <w:r>
+        <w:t>Do not invent data sources, connector names, metrics or schemas.</w:t>
+      </w:r>
+    </w:p>
+    <w:p>
+      <w:pPr>
+        <w:pStyle w:val="ListBullet"/>
+      </w:pPr>
+      <w:r>
+        <w:t>Before proposing files, name ICM and the repeating unit. Use one canonical form name from ICM Architect. State the factory-product split and human gate.</w:t>
+      </w:r>
+    </w:p>
+    <w:p>
+      <w:pPr>
+        <w:pStyle w:val="ListBullet"/>
+      </w:pPr>
+      <w:r>
+        <w:t>Choose the smallest fitting form: pipeline, umbrella, record library, knowledge bundle or context map.</w:t>
+      </w:r>
+    </w:p>
+    <w:p>
+      <w:pPr>
+        <w:pStyle w:val="ListBullet"/>
+      </w:pPr>
+      <w:r>
+        <w:t>Separate stable factory material from per-run product and validate with the cold-agent walk test.</w:t>
+      </w:r>
+    </w:p>
+    <w:p>
+      <w:pPr>
+        <w:pStyle w:val="ListBullet"/>
+      </w:pPr>
+      <w:r>
+        <w:t>Create folders only for persistent, repeated, multi-step, shared or review-gated work.</w:t>
+      </w:r>
+    </w:p>
+    <w:p>
+      <w:pPr>
+        <w:pStyle w:val="ListBullet"/>
+      </w:pPr>
+      <w:r>
+        <w:t>Inventory first. Present a target tree and migration map before any restructure move.</w:t>
+      </w:r>
+    </w:p>
+    <w:p>
+      <w:pPr>
+        <w:pStyle w:val="ListBullet"/>
+      </w:pPr>
+      <w:r>
+        <w:t>Keep real-time coordination, high concurrency and automated branching in suitable code while preserving explicit context and human controls.</w:t>
+      </w:r>
+    </w:p>
+    <w:p>
+      <w:pPr>
+        <w:shd w:fill="EEF1F5"/>
+        <w:spacing w:before="40" w:after="160"/>
+        <w:ind w:left="317" w:right="317"/>
+      </w:pPr>
+      <w:r>
+        <w:rPr>
+          <w:rFonts w:ascii="Consolas" w:hAnsi="Consolas"/>
+          <w:b w:val="0"/>
+          <w:color w:val="14213D"/>
+          <w:sz w:val="17"/>
+        </w:rPr>
+        <w:t>Use $icm-architect to build the smallest ICM workspace for this project.</w:t>
+      </w:r>
+    </w:p>
+    <w:p>
+      <w:pPr>
+        <w:pBdr>
+          <w:left w:val="single" w:sz="18" w:space="8" w:color="9C2F2F"/>
+        </w:pBdr>
+        <w:shd w:fill="FBECEC"/>
+        <w:spacing w:before="80" w:after="160"/>
+        <w:ind w:left="115" w:right="115"/>
+      </w:pPr>
+      <w:r>
+        <w:rPr>
+          <w:rFonts w:ascii="Calibri" w:hAnsi="Calibri"/>
+          <w:b/>
+          <w:color w:val="9C2F2F"/>
+          <w:sz w:val="21"/>
+        </w:rPr>
+        <w:t xml:space="preserve">Claude Code enforcement: </w:t>
+      </w:r>
+      <w:r>
+        <w:rPr>
+          <w:rFonts w:ascii="Calibri" w:hAnsi="Calibri"/>
+          <w:b w:val="0"/>
+          <w:color w:val="9C2F2F"/>
+          <w:sz w:val="21"/>
+        </w:rPr>
+        <w:t>Architecture prompts activate a seven-line ICM response contract. The stop hook returns an invalid answer for correction up to two times. A third invalid answer stops with recovery instructions. A pre-tool check blocks private configured context absent from the prompt. Set CHIEF_ICM_ENFORCEMENT=off only for recovery. Set it to on after repair.</w:t>
+      </w:r>
+    </w:p>
+    <w:p>
+      <w:pPr>
+        <w:pStyle w:val="Heading2"/>
+      </w:pPr>
+      <w:r>
         <w:t>Execution tiers</w:t>
       </w:r>
     </w:p>
@@ -1674,11 +1872,13 @@
     </w:p>
     <w:p>
       <w:pPr>
+        <w:pStyle w:val="ListNumber"/>
         <w:numPr>
           <w:ilvl w:val="0"/>
           <w:numId w:val="13"/>
         </w:numPr>
-        <w:pStyle w:val="ListNumber"/>
+        <w:keepNext w:val="0"/>
+        <w:spacing w:after="60" w:line="288" w:lineRule="auto"/>
       </w:pPr>
       <w:r>
         <w:t>Current project sources and project AGENTS.md.</w:t>
@@ -1686,23 +1886,27 @@
     </w:p>
     <w:p>
       <w:pPr>
+        <w:pStyle w:val="ListNumber"/>
         <w:numPr>
           <w:ilvl w:val="0"/>
           <w:numId w:val="13"/>
         </w:numPr>
-        <w:pStyle w:val="ListNumber"/>
+        <w:keepNext w:val="0"/>
+        <w:spacing w:after="60" w:line="288" w:lineRule="auto"/>
       </w:pPr>
       <w:r>
-        <w:t>Registered work systems for assignments, owners, due dates, and status.</w:t>
+        <w:t>Registered work systems remain authoritative for assignments, owners, due dates, and current status.</w:t>
       </w:r>
     </w:p>
     <w:p>
       <w:pPr>
+        <w:pStyle w:val="ListNumber"/>
         <w:numPr>
           <w:ilvl w:val="0"/>
           <w:numId w:val="13"/>
         </w:numPr>
-        <w:pStyle w:val="ListNumber"/>
+        <w:keepNext w:val="0"/>
+        <w:spacing w:after="60" w:line="288" w:lineRule="auto"/>
       </w:pPr>
       <w:r>
         <w:t>Calendar and approved communications for current context.</w:t>
@@ -1710,11 +1914,13 @@
     </w:p>
     <w:p>
       <w:pPr>
+        <w:pStyle w:val="ListNumber"/>
         <w:numPr>
           <w:ilvl w:val="0"/>
           <w:numId w:val="13"/>
         </w:numPr>
-        <w:pStyle w:val="ListNumber"/>
+        <w:keepNext w:val="0"/>
+        <w:spacing w:after="60" w:line="288" w:lineRule="auto"/>
       </w:pPr>
       <w:r>
         <w:t>Memory for prior decisions, followed by live verification when facts can drift.</w:t>
@@ -1802,11 +2008,6 @@
           <w:sz w:val="17"/>
         </w:rPr>
         <w:t>Chief of Staff: run a read-only briefing for [scope]. Return schedule, priorities, waiting items, risks, decisions, and proposed drafts. Do not create or send anything.</w:t>
-      </w:r>
-    </w:p>
-    <w:p>
-      <w:r>
-        <w:br w:type="page"/>
       </w:r>
     </w:p>
     <w:p>
@@ -2378,11 +2579,6 @@
       </w:r>
     </w:p>
     <w:p>
-      <w:r>
-        <w:br w:type="page"/>
-      </w:r>
-    </w:p>
-    <w:p>
       <w:pPr>
         <w:pStyle w:val="Heading1"/>
       </w:pPr>
@@ -2554,7 +2750,7 @@
         <w:pStyle w:val="ListBullet"/>
       </w:pPr>
       <w:r>
-        <w:t>AI Sloppy Copy release 0.4 with Standard 2.2.0 or later for exact authored-copy governance.</w:t>
+        <w:t>AI Sloppy Copy 0.5.0 with Standard 2.2.0 or later for exact authored-copy governance.</w:t>
       </w:r>
     </w:p>
     <w:p>
@@ -2640,6 +2836,38 @@
           <w:sz w:val="17"/>
         </w:rPr>
         <w:t>node tests/test_hooks.js</w:t>
+      </w:r>
+    </w:p>
+    <w:p>
+      <w:pPr>
+        <w:shd w:fill="EEF1F5"/>
+        <w:spacing w:before="40" w:after="160"/>
+        <w:ind w:left="317" w:right="317"/>
+      </w:pPr>
+      <w:r>
+        <w:rPr>
+          <w:rFonts w:ascii="Consolas" w:hAnsi="Consolas"/>
+          <w:b w:val="0"/>
+          <w:color w:val="14213D"/>
+          <w:sz w:val="17"/>
+        </w:rPr>
+        <w:t>python tests/test_icm.py</w:t>
+      </w:r>
+    </w:p>
+    <w:p>
+      <w:pPr>
+        <w:shd w:fill="EEF1F5"/>
+        <w:spacing w:before="40" w:after="160"/>
+        <w:ind w:left="317" w:right="317"/>
+      </w:pPr>
+      <w:r>
+        <w:rPr>
+          <w:rFonts w:ascii="Consolas" w:hAnsi="Consolas"/>
+          <w:b w:val="0"/>
+          <w:color w:val="14213D"/>
+          <w:sz w:val="17"/>
+        </w:rPr>
+        <w:t>python tests/test_release.py</w:t>
       </w:r>
     </w:p>
     <w:tbl>
@@ -2769,7 +2997,61 @@
                 <w:color w:val="000000"/>
                 <w:sz w:val="19"/>
               </w:rPr>
-              <w:t>97 requirements, eight integration rules and source hashes remain present. Eight scenarios remain too.</w:t>
+              <w:t>97 requirements, nine integration rules and source hashes remain present. Twelve scenarios remain too.</w:t>
+            </w:r>
+          </w:p>
+        </w:tc>
+      </w:tr>
+      <w:tr>
+        <w:tc>
+          <w:tcPr>
+            <w:tcW w:type="dxa" w:w="2160"/>
+            <w:vAlign w:val="center"/>
+            <w:tcMar>
+              <w:top w:w="100" w:type="dxa"/>
+              <w:start w:w="120" w:type="dxa"/>
+              <w:bottom w:w="100" w:type="dxa"/>
+              <w:end w:w="120" w:type="dxa"/>
+            </w:tcMar>
+          </w:tcPr>
+          <w:p>
+            <w:pPr>
+              <w:spacing w:after="0" w:line="252" w:lineRule="auto"/>
+            </w:pPr>
+            <w:r>
+              <w:rPr>
+                <w:rFonts w:ascii="Calibri" w:hAnsi="Calibri"/>
+                <w:b w:val="0"/>
+                <w:color w:val="000000"/>
+                <w:sz w:val="19"/>
+              </w:rPr>
+              <w:t>ICM</w:t>
+            </w:r>
+          </w:p>
+        </w:tc>
+        <w:tc>
+          <w:tcPr>
+            <w:tcW w:type="dxa" w:w="7200"/>
+            <w:vAlign w:val="center"/>
+            <w:tcMar>
+              <w:top w:w="100" w:type="dxa"/>
+              <w:start w:w="120" w:type="dxa"/>
+              <w:bottom w:w="100" w:type="dxa"/>
+              <w:end w:w="120" w:type="dxa"/>
+            </w:tcMar>
+          </w:tcPr>
+          <w:p>
+            <w:pPr>
+              <w:spacing w:after="0" w:line="252" w:lineRule="auto"/>
+            </w:pPr>
+            <w:r>
+              <w:rPr>
+                <w:rFonts w:ascii="Calibri" w:hAnsi="Calibri"/>
+                <w:b w:val="0"/>
+                <w:color w:val="000000"/>
+                <w:sz w:val="19"/>
+              </w:rPr>
+              <w:t>Five forms, ten invariants, task routing, cold-walk failure behavior and release contracts pass.</w:t>
             </w:r>
           </w:p>
         </w:tc>
@@ -2931,7 +3213,7 @@
                 <w:color w:val="000000"/>
                 <w:sz w:val="19"/>
               </w:rPr>
-              <w:t>Session and subagent startup output contains the behavior contract, persona, version, and config status.</w:t>
+              <w:t>Lifecycle output contains the contract and persona. ICM enforcement also passes activation, correction, recovery and privacy checks.</w:t>
             </w:r>
           </w:p>
         </w:tc>
@@ -2952,7 +3234,7 @@
     </w:p>
     <w:p>
       <w:r>
-        <w:t>Run the eight prompts in persona/persona-contract.json in separate fresh Codex tasks with GPT-5.6 Sol Medium. Repeat them in a fresh Claude Code session when certifying that host. Static validation proves the contract exists; it cannot honestly grade a live model response.</w:t>
+        <w:t>Run the twelve prompts in persona/persona-contract.json in fresh Codex tasks with GPT-5.6 Sol Medium and GPT-5.6 Terra XHigh. Repeat them in a fresh Claude Code session. Static validation proves the contract exists; it cannot honestly grade a live model response.</w:t>
       </w:r>
     </w:p>
     <w:p>
@@ -2980,7 +3262,7 @@
           <w:color w:val="14213D"/>
           <w:sz w:val="21"/>
         </w:rPr>
-        <w:t>static checks pass and fresh-task Sol Medium behavior meets all eight criteria. Terra compatibility evidence may be carried forward only when every model-facing input is unchanged and the tested delivery path passes. Connector identities must match. The first briefing must stay inside the selected scope.</w:t>
+        <w:t>static checks plus host and installed-runtime checks pass. A required model must pass unless the owner records a version-bound waiver for a pending Sol or Terra check. Failed checks cannot be waived. Pending evidence stays pending. v0.6 evidence cannot be carried forward because v1.0.0 changes model-facing inputs. Connector identities must match. The first briefing must stay inside the selected scope.</w:t>
       </w:r>
     </w:p>
     <w:p>
@@ -3029,7 +3311,7 @@
           <w:color w:val="9C2F2F"/>
           <w:sz w:val="21"/>
         </w:rPr>
-        <w:t>Remove an existing 2.2.6 installation once before reinstalling. Its required host manifest version is 0.4.0, which semantic-version updaters sort below 2.2.6.</w:t>
+        <w:t>Remove an existing 2.2.6 installation once before reinstalling. Version 0.5.0 sorts below 2.2.6 in semantic-version updaters.</w:t>
       </w:r>
     </w:p>
     <w:p>
@@ -3330,9 +3612,9 @@
         </w:tblBorders>
       </w:tblPr>
       <w:tblGrid>
-        <w:gridCol w:w="3600"/>
-        <w:gridCol w:w="2880"/>
-        <w:gridCol w:w="2880"/>
+        <w:gridCol w:w="3200"/>
+        <w:gridCol w:w="2500"/>
+        <w:gridCol w:w="3660"/>
       </w:tblGrid>
       <w:tr>
         <w:trPr>
@@ -3340,7 +3622,7 @@
         </w:trPr>
         <w:tc>
           <w:tcPr>
-            <w:tcW w:type="dxa" w:w="3600"/>
+            <w:tcW w:type="dxa" w:w="3200"/>
             <w:shd w:fill="E8F4F2"/>
             <w:vAlign w:val="center"/>
             <w:tcMar>
@@ -3367,7 +3649,7 @@
         </w:tc>
         <w:tc>
           <w:tcPr>
-            <w:tcW w:type="dxa" w:w="2880"/>
+            <w:tcW w:type="dxa" w:w="2500"/>
             <w:shd w:fill="E8F4F2"/>
             <w:vAlign w:val="center"/>
             <w:tcMar>
@@ -3388,13 +3670,13 @@
                 <w:color w:val="14213D"/>
                 <w:sz w:val="19"/>
               </w:rPr>
-              <w:t>Public release</w:t>
+              <w:t>Product version</w:t>
             </w:r>
           </w:p>
         </w:tc>
         <w:tc>
           <w:tcPr>
-            <w:tcW w:type="dxa" w:w="2880"/>
+            <w:tcW w:type="dxa" w:w="3660"/>
             <w:shd w:fill="E8F4F2"/>
             <w:vAlign w:val="center"/>
             <w:tcMar>
@@ -3415,7 +3697,7 @@
                 <w:color w:val="14213D"/>
                 <w:sz w:val="19"/>
               </w:rPr>
-              <w:t>Host manifest</w:t>
+              <w:t>Separate rules contract</w:t>
             </w:r>
           </w:p>
         </w:tc>
@@ -3423,7 +3705,7 @@
       <w:tr>
         <w:tc>
           <w:tcPr>
-            <w:tcW w:type="dxa" w:w="3600"/>
+            <w:tcW w:type="dxa" w:w="3200"/>
             <w:vAlign w:val="center"/>
             <w:tcMar>
               <w:top w:w="100" w:type="dxa"/>
@@ -3449,7 +3731,7 @@
         </w:tc>
         <w:tc>
           <w:tcPr>
-            <w:tcW w:type="dxa" w:w="2880"/>
+            <w:tcW w:type="dxa" w:w="2500"/>
             <w:vAlign w:val="center"/>
             <w:tcMar>
               <w:top w:w="100" w:type="dxa"/>
@@ -3469,13 +3751,13 @@
                 <w:color w:val="000000"/>
                 <w:sz w:val="19"/>
               </w:rPr>
-              <w:t>0.6</w:t>
+              <w:t>1.0.0</w:t>
             </w:r>
           </w:p>
         </w:tc>
         <w:tc>
           <w:tcPr>
-            <w:tcW w:type="dxa" w:w="2880"/>
+            <w:tcW w:type="dxa" w:w="3660"/>
             <w:vAlign w:val="center"/>
             <w:tcMar>
               <w:top w:w="100" w:type="dxa"/>
@@ -3495,7 +3777,7 @@
                 <w:color w:val="000000"/>
                 <w:sz w:val="19"/>
               </w:rPr>
-              <w:t>0.6.0</w:t>
+              <w:t>None</w:t>
             </w:r>
           </w:p>
         </w:tc>
@@ -3503,7 +3785,7 @@
       <w:tr>
         <w:tc>
           <w:tcPr>
-            <w:tcW w:type="dxa" w:w="3600"/>
+            <w:tcW w:type="dxa" w:w="3200"/>
             <w:vAlign w:val="center"/>
             <w:tcMar>
               <w:top w:w="100" w:type="dxa"/>
@@ -3529,7 +3811,7 @@
         </w:tc>
         <w:tc>
           <w:tcPr>
-            <w:tcW w:type="dxa" w:w="2880"/>
+            <w:tcW w:type="dxa" w:w="2500"/>
             <w:vAlign w:val="center"/>
             <w:tcMar>
               <w:top w:w="100" w:type="dxa"/>
@@ -3549,13 +3831,13 @@
                 <w:color w:val="000000"/>
                 <w:sz w:val="19"/>
               </w:rPr>
-              <w:t>0.4</w:t>
+              <w:t>0.5.0</w:t>
             </w:r>
           </w:p>
         </w:tc>
         <w:tc>
           <w:tcPr>
-            <w:tcW w:type="dxa" w:w="2880"/>
+            <w:tcW w:type="dxa" w:w="3660"/>
             <w:vAlign w:val="center"/>
             <w:tcMar>
               <w:top w:w="100" w:type="dxa"/>
@@ -3575,7 +3857,7 @@
                 <w:color w:val="000000"/>
                 <w:sz w:val="19"/>
               </w:rPr>
-              <w:t>0.4.0</w:t>
+              <w:t>Standard 2.2.0 or later</w:t>
             </w:r>
           </w:p>
         </w:tc>
@@ -3588,7 +3870,7 @@
     </w:p>
     <w:p>
       <w:r>
-        <w:t>Public tags, documentation and ZIP names use one-decimal pre-1.0 milestones. Codex and Claude Code manifests retain the final zero because both hosts require strict semantic versions.</w:t>
+        <w:t>Each product uses one three-part version for its GitHub release and tag. The ZIP and both host manifests use that same number. AI Sloppy Copy also carries a separately versioned writing-rules contract.</w:t>
       </w:r>
     </w:p>
     <w:p>
@@ -3727,6 +4009,60 @@
                 <w:sz w:val="19"/>
               </w:rPr>
               <w:t>Restart Codex or run Claude Code /reload-plugins, review /hooks, then start fresh.</w:t>
+            </w:r>
+          </w:p>
+        </w:tc>
+      </w:tr>
+      <w:tr>
+        <w:tc>
+          <w:tcPr>
+            <w:tcW w:type="dxa" w:w="2880"/>
+            <w:vAlign w:val="center"/>
+            <w:tcMar>
+              <w:top w:w="100" w:type="dxa"/>
+              <w:start w:w="120" w:type="dxa"/>
+              <w:bottom w:w="100" w:type="dxa"/>
+              <w:end w:w="120" w:type="dxa"/>
+            </w:tcMar>
+          </w:tcPr>
+          <w:p>
+            <w:pPr>
+              <w:spacing w:after="0" w:line="252" w:lineRule="auto"/>
+            </w:pPr>
+            <w:r>
+              <w:rPr>
+                <w:rFonts w:ascii="Calibri" w:hAnsi="Calibri"/>
+                <w:b w:val="0"/>
+                <w:color w:val="000000"/>
+                <w:sz w:val="19"/>
+              </w:rPr>
+              <w:t>ICM response stops</w:t>
+            </w:r>
+          </w:p>
+        </w:tc>
+        <w:tc>
+          <w:tcPr>
+            <w:tcW w:type="dxa" w:w="6480"/>
+            <w:vAlign w:val="center"/>
+            <w:tcMar>
+              <w:top w:w="100" w:type="dxa"/>
+              <w:start w:w="120" w:type="dxa"/>
+              <w:bottom w:w="100" w:type="dxa"/>
+              <w:end w:w="120" w:type="dxa"/>
+            </w:tcMar>
+          </w:tcPr>
+          <w:p>
+            <w:pPr>
+              <w:spacing w:after="0" w:line="252" w:lineRule="auto"/>
+            </w:pPr>
+            <w:r>
+              <w:rPr>
+                <w:rFonts w:ascii="Calibri" w:hAnsi="Calibri"/>
+                <w:b w:val="0"/>
+                <w:color w:val="000000"/>
+                <w:sz w:val="19"/>
+              </w:rPr>
+              <w:t>Start a new prompt. For repair only, set CHIEF_ICM_ENFORCEMENT=off, reload plugins and fix the installation. Set enforcement to on afterward.</w:t>
             </w:r>
           </w:p>
         </w:tc>
@@ -3981,7 +4317,7 @@
         <w:color w:val="5B6472"/>
         <w:sz w:val="16"/>
       </w:rPr>
-      <w:t xml:space="preserve">v0.6   /   </w:t>
+      <w:t xml:space="preserve">v1.0.0   /   </w:t>
     </w:r>
     <w:fldSimple w:instr="PAGE"/>
   </w:p>
@@ -4002,7 +4338,7 @@
         <w:color w:val="5B6472"/>
         <w:sz w:val="16"/>
       </w:rPr>
-      <w:t xml:space="preserve">v0.6   /   </w:t>
+      <w:t xml:space="preserve">v1.0.0   /   </w:t>
     </w:r>
     <w:fldSimple w:instr="PAGE"/>
   </w:p>
@@ -4975,7 +5311,6 @@
       </w:numPr>
       <w:spacing w:after="60" w:line="288" w:lineRule="auto"/>
       <w:ind w:left="504" w:hanging="259"/>
-      <w:contextualSpacing/>
     </w:pPr>
     <w:rPr>
       <w:rFonts w:ascii="Calibri" w:hAnsi="Calibri"/>
@@ -5022,7 +5357,6 @@
       </w:numPr>
       <w:spacing w:after="60" w:line="288" w:lineRule="auto"/>
       <w:ind w:left="504" w:hanging="259"/>
-      <w:contextualSpacing/>
     </w:pPr>
     <w:rPr>
       <w:rFonts w:ascii="Calibri" w:hAnsi="Calibri"/>

</xml_diff>

<commit_message>
Release Chief of Staff 2.0.0 suite orchestration
</commit_message>
<xml_diff>
--- a/docs/Codex Chief of Staff - Installation and SOP.docx
+++ b/docs/Codex Chief of Staff - Installation and SOP.docx
@@ -229,7 +229,7 @@
                 <w:color w:val="000000"/>
                 <w:sz w:val="19"/>
               </w:rPr>
-              <w:t>1.0.0</w:t>
+              <w:t>2.0.0</w:t>
             </w:r>
           </w:p>
         </w:tc>
@@ -403,13 +403,9 @@
       </w:r>
     </w:p>
     <w:p>
-      <w:r>
-        <w:br w:type="page"/>
-      </w:r>
-    </w:p>
-    <w:p>
       <w:pPr>
         <w:pStyle w:val="Heading1"/>
+        <w:pageBreakBefore/>
       </w:pPr>
       <w:r>
         <w:t>1. Install the complete stack</w:t>
@@ -460,7 +456,7 @@
         <w:pStyle w:val="Heading2"/>
       </w:pPr>
       <w:r>
-        <w:t>Step 1 of 3: Ponytail</w:t>
+        <w:t>Step 1 of 5: Ponytail</w:t>
       </w:r>
     </w:p>
     <w:p>
@@ -523,7 +519,7 @@
         <w:pStyle w:val="Heading2"/>
       </w:pPr>
       <w:r>
-        <w:t>Step 2 of 3: AI Sloppy Copy</w:t>
+        <w:t>Step 2 of 5: AI Sloppy Copy</w:t>
       </w:r>
     </w:p>
     <w:p>
@@ -586,7 +582,7 @@
         <w:pStyle w:val="Heading2"/>
       </w:pPr>
       <w:r>
-        <w:t>Step 3 of 3: Chief of Staff</w:t>
+        <w:t>Step 3 of 5: Brand Voice Factory</w:t>
       </w:r>
     </w:p>
     <w:p>
@@ -608,6 +604,132 @@
             <w:color w:val="2A9D8F"/>
             <w:u w:val="single"/>
           </w:rPr>
+          <w:t>https://github.com/plotdevice01/brand-voice-factory</w:t>
+        </w:r>
+      </w:hyperlink>
+    </w:p>
+    <w:p>
+      <w:pPr>
+        <w:shd w:fill="EEF1F5"/>
+        <w:spacing w:before="40" w:after="160"/>
+        <w:ind w:left="317" w:right="317"/>
+      </w:pPr>
+      <w:r>
+        <w:rPr>
+          <w:rFonts w:ascii="Consolas" w:hAnsi="Consolas"/>
+          <w:b w:val="0"/>
+          <w:color w:val="14213D"/>
+          <w:sz w:val="17"/>
+        </w:rPr>
+        <w:t>codex plugin marketplace add plotdevice01/brand-voice-factory</w:t>
+      </w:r>
+    </w:p>
+    <w:p>
+      <w:pPr>
+        <w:shd w:fill="EEF1F5"/>
+        <w:spacing w:before="40" w:after="160"/>
+        <w:ind w:left="317" w:right="317"/>
+      </w:pPr>
+      <w:r>
+        <w:rPr>
+          <w:rFonts w:ascii="Consolas" w:hAnsi="Consolas"/>
+          <w:b w:val="0"/>
+          <w:color w:val="14213D"/>
+          <w:sz w:val="17"/>
+        </w:rPr>
+        <w:t>codex plugin add brand-voice-factory@brand-voice-factory</w:t>
+      </w:r>
+    </w:p>
+    <w:p>
+      <w:pPr>
+        <w:pStyle w:val="Heading2"/>
+      </w:pPr>
+      <w:r>
+        <w:t>Step 4 of 5: Crafty Carousels</w:t>
+      </w:r>
+    </w:p>
+    <w:p>
+      <w:pPr>
+        <w:spacing w:after="100"/>
+      </w:pPr>
+      <w:r>
+        <w:rPr>
+          <w:rFonts w:ascii="Calibri" w:hAnsi="Calibri"/>
+          <w:b/>
+          <w:color w:val="14213D"/>
+          <w:sz w:val="21"/>
+        </w:rPr>
+        <w:t xml:space="preserve">Repository: </w:t>
+      </w:r>
+      <w:hyperlink r:id="rId17">
+        <w:r>
+          <w:rPr>
+            <w:color w:val="2A9D8F"/>
+            <w:u w:val="single"/>
+          </w:rPr>
+          <w:t>https://github.com/plotdevice01/crafty-carousels-skill</w:t>
+        </w:r>
+      </w:hyperlink>
+    </w:p>
+    <w:p>
+      <w:pPr>
+        <w:shd w:fill="EEF1F5"/>
+        <w:spacing w:before="40" w:after="160"/>
+        <w:ind w:left="317" w:right="317"/>
+      </w:pPr>
+      <w:r>
+        <w:rPr>
+          <w:rFonts w:ascii="Consolas" w:hAnsi="Consolas"/>
+          <w:b w:val="0"/>
+          <w:color w:val="14213D"/>
+          <w:sz w:val="17"/>
+        </w:rPr>
+        <w:t>codex plugin marketplace add plotdevice01/crafty-carousels-skill</w:t>
+      </w:r>
+    </w:p>
+    <w:p>
+      <w:pPr>
+        <w:shd w:fill="EEF1F5"/>
+        <w:spacing w:before="40" w:after="160"/>
+        <w:ind w:left="317" w:right="317"/>
+      </w:pPr>
+      <w:r>
+        <w:rPr>
+          <w:rFonts w:ascii="Consolas" w:hAnsi="Consolas"/>
+          <w:b w:val="0"/>
+          <w:color w:val="14213D"/>
+          <w:sz w:val="17"/>
+        </w:rPr>
+        <w:t>codex plugin add crafty-carousels@crafty-carousels-skill</w:t>
+      </w:r>
+    </w:p>
+    <w:p>
+      <w:pPr>
+        <w:pStyle w:val="Heading2"/>
+      </w:pPr>
+      <w:r>
+        <w:t>Step 5 of 5: Chief of Staff</w:t>
+      </w:r>
+    </w:p>
+    <w:p>
+      <w:pPr>
+        <w:spacing w:after="100"/>
+      </w:pPr>
+      <w:r>
+        <w:rPr>
+          <w:rFonts w:ascii="Calibri" w:hAnsi="Calibri"/>
+          <w:b/>
+          <w:color w:val="14213D"/>
+          <w:sz w:val="21"/>
+        </w:rPr>
+        <w:t xml:space="preserve">Repository: </w:t>
+      </w:r>
+      <w:hyperlink r:id="rId18">
+        <w:r>
+          <w:rPr>
+            <w:color w:val="2A9D8F"/>
+            <w:u w:val="single"/>
+          </w:rPr>
           <w:t>https://github.com/plotdevice01/codex-chief-of-staff</w:t>
         </w:r>
       </w:hyperlink>
@@ -677,7 +799,7 @@
         <w:spacing w:after="60" w:line="288" w:lineRule="auto"/>
       </w:pPr>
       <w:r>
-        <w:t>Open /hooks. Review and trust the hooks offered by Ponytail, AI Sloppy Copy and Chief of Staff.</w:t>
+        <w:t>Open /hooks. Review and trust the hooks offered by the five installed plugins.</w:t>
       </w:r>
     </w:p>
     <w:p>
@@ -719,7 +841,7 @@
         <w:spacing w:after="60" w:line="288" w:lineRule="auto"/>
       </w:pPr>
       <w:r>
-        <w:t>Confirm ponytail@ponytail, ai-sloppy-copy@ai-sloppy-copy and chief-of-staff@codex-chief-of-staff are installed and active.</w:t>
+        <w:t>Confirm ponytail@ponytail, ai-sloppy-copy@ai-sloppy-copy, brand-voice-factory@brand-voice-factory, crafty-carousels@crafty-carousels-skill and chief-of-staff@codex-chief-of-staff are installed and active.</w:t>
       </w:r>
     </w:p>
     <w:p>
@@ -859,6 +981,70 @@
           <w:color w:val="14213D"/>
           <w:sz w:val="17"/>
         </w:rPr>
+        <w:t>claude plugin marketplace add plotdevice01/brand-voice-factory</w:t>
+      </w:r>
+    </w:p>
+    <w:p>
+      <w:pPr>
+        <w:shd w:fill="EEF1F5"/>
+        <w:spacing w:before="40" w:after="160"/>
+        <w:ind w:left="317" w:right="317"/>
+      </w:pPr>
+      <w:r>
+        <w:rPr>
+          <w:rFonts w:ascii="Consolas" w:hAnsi="Consolas"/>
+          <w:b w:val="0"/>
+          <w:color w:val="14213D"/>
+          <w:sz w:val="17"/>
+        </w:rPr>
+        <w:t>claude plugin install brand-voice-factory@brand-voice-factory --scope user</w:t>
+      </w:r>
+    </w:p>
+    <w:p>
+      <w:pPr>
+        <w:shd w:fill="EEF1F5"/>
+        <w:spacing w:before="40" w:after="160"/>
+        <w:ind w:left="317" w:right="317"/>
+      </w:pPr>
+      <w:r>
+        <w:rPr>
+          <w:rFonts w:ascii="Consolas" w:hAnsi="Consolas"/>
+          <w:b w:val="0"/>
+          <w:color w:val="14213D"/>
+          <w:sz w:val="17"/>
+        </w:rPr>
+        <w:t>claude plugin marketplace add plotdevice01/crafty-carousels-skill</w:t>
+      </w:r>
+    </w:p>
+    <w:p>
+      <w:pPr>
+        <w:shd w:fill="EEF1F5"/>
+        <w:spacing w:before="40" w:after="160"/>
+        <w:ind w:left="317" w:right="317"/>
+      </w:pPr>
+      <w:r>
+        <w:rPr>
+          <w:rFonts w:ascii="Consolas" w:hAnsi="Consolas"/>
+          <w:b w:val="0"/>
+          <w:color w:val="14213D"/>
+          <w:sz w:val="17"/>
+        </w:rPr>
+        <w:t>claude plugin install crafty-carousels@crafty-carousels-skill --scope user</w:t>
+      </w:r>
+    </w:p>
+    <w:p>
+      <w:pPr>
+        <w:shd w:fill="EEF1F5"/>
+        <w:spacing w:before="40" w:after="160"/>
+        <w:ind w:left="317" w:right="317"/>
+      </w:pPr>
+      <w:r>
+        <w:rPr>
+          <w:rFonts w:ascii="Consolas" w:hAnsi="Consolas"/>
+          <w:b w:val="0"/>
+          <w:color w:val="14213D"/>
+          <w:sz w:val="17"/>
+        </w:rPr>
         <w:t>claude plugin marketplace add plotdevice01/codex-chief-of-staff</w:t>
       </w:r>
     </w:p>
@@ -903,7 +1089,7 @@
         <w:spacing w:after="60" w:line="288" w:lineRule="auto"/>
       </w:pPr>
       <w:r>
-        <w:t>Open /hooks and review the hooks from all three plugins.</w:t>
+        <w:t>Open /hooks and review the hooks from all five plugins.</w:t>
       </w:r>
     </w:p>
     <w:p>
@@ -917,7 +1103,7 @@
         <w:spacing w:after="60" w:line="288" w:lineRule="auto"/>
       </w:pPr>
       <w:r>
-        <w:t>Run claude plugin list --json and confirm all three plugin IDs are active.</w:t>
+        <w:t>Run claude plugin list --json and confirm all five plugin IDs are active.</w:t>
       </w:r>
     </w:p>
     <w:p>
@@ -976,7 +1162,7 @@
     </w:p>
     <w:p>
       <w:r>
-        <w:t>The scripts install or update all three plugins. The default scope is user. Use project scope only when the repository should carry shared plugin activation.</w:t>
+        <w:t>The scripts install or update all five plugins. The default scope is user. Use project scope only when the repository should carry shared plugin activation.</w:t>
       </w:r>
     </w:p>
     <w:p>
@@ -993,6 +1179,15 @@
           <w:sz w:val="17"/>
         </w:rPr>
         <w:t>Copy examples\claude-project-settings.json to .claude\settings.json</w:t>
+      </w:r>
+    </w:p>
+    <w:p>
+      <w:pPr>
+        <w:pStyle w:val="Heading1"/>
+        <w:pageBreakBefore/>
+      </w:pPr>
+      <w:r>
+        <w:t>2. Configure private authority</w:t>
       </w:r>
     </w:p>
     <w:p>
@@ -1021,19 +1216,6 @@
           <w:sz w:val="21"/>
         </w:rPr>
         <w:t>Shared Claude settings may name marketplaces and active plugins. Private identities, paths, scopes, and approval rules stay in ignored chief-of-staff.json.</w:t>
-      </w:r>
-    </w:p>
-    <w:p>
-      <w:r>
-        <w:br w:type="page"/>
-      </w:r>
-    </w:p>
-    <w:p>
-      <w:pPr>
-        <w:pStyle w:val="Heading1"/>
-      </w:pPr>
-      <w:r>
-        <w:t>2. Configure private authority</w:t>
       </w:r>
     </w:p>
     <w:p>
@@ -1558,13 +1740,9 @@
       </w:r>
     </w:p>
     <w:p>
-      <w:r>
-        <w:br w:type="page"/>
-      </w:r>
-    </w:p>
-    <w:p>
       <w:pPr>
         <w:pStyle w:val="Heading1"/>
+        <w:pageBreakBefore/>
       </w:pPr>
       <w:r>
         <w:t>3. Run scoped work</w:t>
@@ -2739,6 +2917,52 @@
     </w:p>
     <w:p>
       <w:pPr>
+        <w:spacing w:after="100"/>
+      </w:pPr>
+      <w:r>
+        <w:rPr>
+          <w:rFonts w:ascii="Calibri" w:hAnsi="Calibri"/>
+          <w:b/>
+          <w:color w:val="14213D"/>
+          <w:sz w:val="21"/>
+        </w:rPr>
+        <w:t xml:space="preserve">Brand Voice Factory repository: </w:t>
+      </w:r>
+      <w:hyperlink r:id="rId16">
+        <w:r>
+          <w:rPr>
+            <w:color w:val="2A9D8F"/>
+            <w:u w:val="single"/>
+          </w:rPr>
+          <w:t>https://github.com/plotdevice01/brand-voice-factory</w:t>
+        </w:r>
+      </w:hyperlink>
+    </w:p>
+    <w:p>
+      <w:pPr>
+        <w:spacing w:after="100"/>
+      </w:pPr>
+      <w:r>
+        <w:rPr>
+          <w:rFonts w:ascii="Calibri" w:hAnsi="Calibri"/>
+          <w:b/>
+          <w:color w:val="14213D"/>
+          <w:sz w:val="21"/>
+        </w:rPr>
+        <w:t xml:space="preserve">Crafty Carousels repository: </w:t>
+      </w:r>
+      <w:hyperlink r:id="rId17">
+        <w:r>
+          <w:rPr>
+            <w:color w:val="2A9D8F"/>
+            <w:u w:val="single"/>
+          </w:rPr>
+          <w:t>https://github.com/plotdevice01/crafty-carousels-skill</w:t>
+        </w:r>
+      </w:hyperlink>
+    </w:p>
+    <w:p>
+      <w:pPr>
         <w:pStyle w:val="ListBullet"/>
       </w:pPr>
       <w:r>
@@ -2758,17 +2982,21 @@
         <w:pStyle w:val="ListBullet"/>
       </w:pPr>
       <w:r>
-        <w:t>No other repository or service is required for the core plugin. No connector is required either.</w:t>
+        <w:t>Brand Voice Factory 0.2.0 or later for the canonical voice package and handoff contract.</w:t>
       </w:r>
     </w:p>
     <w:p>
+      <w:pPr>
+        <w:pStyle w:val="ListBullet"/>
+      </w:pPr>
       <w:r>
-        <w:br w:type="page"/>
+        <w:t>Crafty Carousels 0.6.0 or later for governed carousel production.</w:t>
       </w:r>
     </w:p>
     <w:p>
       <w:pPr>
         <w:pStyle w:val="Heading1"/>
+        <w:pageBreakBefore/>
       </w:pPr>
       <w:r>
         <w:t>6. Validate behavior and release integrity</w:t>
@@ -3262,17 +3490,13 @@
           <w:color w:val="14213D"/>
           <w:sz w:val="21"/>
         </w:rPr>
-        <w:t>static checks plus host and installed-runtime checks pass. A required model must pass unless the owner records a version-bound waiver for a pending Sol or Terra check. Failed checks cannot be waived. Pending evidence stays pending. v0.6 evidence cannot be carried forward because v1.0.0 changes model-facing inputs. Connector identities must match. The first briefing must stay inside the selected scope.</w:t>
+        <w:t>static checks plus host and installed-runtime checks pass. A required model must pass unless the owner records a version-bound waiver for a pending Sol or Terra check. Failed checks cannot be waived. Pending evidence stays pending. Prior evidence cannot be carried forward because v2.0.0 changes model-facing inputs. Connector identities must match. The first briefing must stay inside the selected scope.</w:t>
       </w:r>
     </w:p>
     <w:p>
-      <w:r>
-        <w:br w:type="page"/>
-      </w:r>
-    </w:p>
-    <w:p>
       <w:pPr>
         <w:pStyle w:val="Heading1"/>
+        <w:pageBreakBefore/>
       </w:pPr>
       <w:r>
         <w:t>7. Update, uninstall, recover</w:t>
@@ -3423,6 +3647,134 @@
           <w:color w:val="14213D"/>
           <w:sz w:val="17"/>
         </w:rPr>
+        <w:t>codex plugin marketplace upgrade brand-voice-factory</w:t>
+      </w:r>
+    </w:p>
+    <w:p>
+      <w:pPr>
+        <w:shd w:fill="EEF1F5"/>
+        <w:spacing w:before="40" w:after="160"/>
+        <w:ind w:left="317" w:right="317"/>
+      </w:pPr>
+      <w:r>
+        <w:rPr>
+          <w:rFonts w:ascii="Consolas" w:hAnsi="Consolas"/>
+          <w:b w:val="0"/>
+          <w:color w:val="14213D"/>
+          <w:sz w:val="17"/>
+        </w:rPr>
+        <w:t>codex plugin add brand-voice-factory@brand-voice-factory</w:t>
+      </w:r>
+    </w:p>
+    <w:p>
+      <w:pPr>
+        <w:shd w:fill="EEF1F5"/>
+        <w:spacing w:before="40" w:after="160"/>
+        <w:ind w:left="317" w:right="317"/>
+      </w:pPr>
+      <w:r>
+        <w:rPr>
+          <w:rFonts w:ascii="Consolas" w:hAnsi="Consolas"/>
+          <w:b w:val="0"/>
+          <w:color w:val="14213D"/>
+          <w:sz w:val="17"/>
+        </w:rPr>
+        <w:t>claude plugin marketplace update brand-voice-factory</w:t>
+      </w:r>
+    </w:p>
+    <w:p>
+      <w:pPr>
+        <w:shd w:fill="EEF1F5"/>
+        <w:spacing w:before="40" w:after="160"/>
+        <w:ind w:left="317" w:right="317"/>
+      </w:pPr>
+      <w:r>
+        <w:rPr>
+          <w:rFonts w:ascii="Consolas" w:hAnsi="Consolas"/>
+          <w:b w:val="0"/>
+          <w:color w:val="14213D"/>
+          <w:sz w:val="17"/>
+        </w:rPr>
+        <w:t>claude plugin update brand-voice-factory@brand-voice-factory</w:t>
+      </w:r>
+    </w:p>
+    <w:p>
+      <w:pPr>
+        <w:shd w:fill="EEF1F5"/>
+        <w:spacing w:before="40" w:after="160"/>
+        <w:ind w:left="317" w:right="317"/>
+      </w:pPr>
+      <w:r>
+        <w:rPr>
+          <w:rFonts w:ascii="Consolas" w:hAnsi="Consolas"/>
+          <w:b w:val="0"/>
+          <w:color w:val="14213D"/>
+          <w:sz w:val="17"/>
+        </w:rPr>
+        <w:t>codex plugin marketplace upgrade crafty-carousels-skill</w:t>
+      </w:r>
+    </w:p>
+    <w:p>
+      <w:pPr>
+        <w:shd w:fill="EEF1F5"/>
+        <w:spacing w:before="40" w:after="160"/>
+        <w:ind w:left="317" w:right="317"/>
+      </w:pPr>
+      <w:r>
+        <w:rPr>
+          <w:rFonts w:ascii="Consolas" w:hAnsi="Consolas"/>
+          <w:b w:val="0"/>
+          <w:color w:val="14213D"/>
+          <w:sz w:val="17"/>
+        </w:rPr>
+        <w:t>codex plugin add crafty-carousels@crafty-carousels-skill</w:t>
+      </w:r>
+    </w:p>
+    <w:p>
+      <w:pPr>
+        <w:shd w:fill="EEF1F5"/>
+        <w:spacing w:before="40" w:after="160"/>
+        <w:ind w:left="317" w:right="317"/>
+      </w:pPr>
+      <w:r>
+        <w:rPr>
+          <w:rFonts w:ascii="Consolas" w:hAnsi="Consolas"/>
+          <w:b w:val="0"/>
+          <w:color w:val="14213D"/>
+          <w:sz w:val="17"/>
+        </w:rPr>
+        <w:t>claude plugin marketplace update crafty-carousels-skill</w:t>
+      </w:r>
+    </w:p>
+    <w:p>
+      <w:pPr>
+        <w:shd w:fill="EEF1F5"/>
+        <w:spacing w:before="40" w:after="160"/>
+        <w:ind w:left="317" w:right="317"/>
+      </w:pPr>
+      <w:r>
+        <w:rPr>
+          <w:rFonts w:ascii="Consolas" w:hAnsi="Consolas"/>
+          <w:b w:val="0"/>
+          <w:color w:val="14213D"/>
+          <w:sz w:val="17"/>
+        </w:rPr>
+        <w:t>claude plugin update crafty-carousels@crafty-carousels-skill</w:t>
+      </w:r>
+    </w:p>
+    <w:p>
+      <w:pPr>
+        <w:shd w:fill="EEF1F5"/>
+        <w:spacing w:before="40" w:after="160"/>
+        <w:ind w:left="317" w:right="317"/>
+      </w:pPr>
+      <w:r>
+        <w:rPr>
+          <w:rFonts w:ascii="Consolas" w:hAnsi="Consolas"/>
+          <w:b w:val="0"/>
+          <w:color w:val="14213D"/>
+          <w:sz w:val="17"/>
+        </w:rPr>
         <w:t>codex plugin marketplace upgrade codex-chief-of-staff</w:t>
       </w:r>
     </w:p>
@@ -3581,11 +3933,6 @@
     <w:p>
       <w:r>
         <w:t>Uninstalling does not delete chief-of-staff.json. Remove that private file separately only when the user intends to discard the configuration.</w:t>
-      </w:r>
-    </w:p>
-    <w:p>
-      <w:r>
-        <w:br w:type="page"/>
       </w:r>
     </w:p>
     <w:p>
@@ -3751,7 +4098,7 @@
                 <w:color w:val="000000"/>
                 <w:sz w:val="19"/>
               </w:rPr>
-              <w:t>1.0.0</w:t>
+              <w:t>2.0.0</w:t>
             </w:r>
           </w:p>
         </w:tc>
@@ -3858,6 +4205,246 @@
                 <w:sz w:val="19"/>
               </w:rPr>
               <w:t>Standard 2.2.0 or later</w:t>
+            </w:r>
+          </w:p>
+        </w:tc>
+      </w:tr>
+      <w:tr>
+        <w:tc>
+          <w:tcPr>
+            <w:tcW w:type="dxa" w:w="3200"/>
+            <w:vAlign w:val="center"/>
+            <w:tcMar>
+              <w:top w:w="100" w:type="dxa"/>
+              <w:start w:w="120" w:type="dxa"/>
+              <w:bottom w:w="100" w:type="dxa"/>
+              <w:end w:w="120" w:type="dxa"/>
+            </w:tcMar>
+          </w:tcPr>
+          <w:p>
+            <w:pPr>
+              <w:spacing w:after="0" w:line="252" w:lineRule="auto"/>
+            </w:pPr>
+            <w:r>
+              <w:rPr>
+                <w:rFonts w:ascii="Calibri" w:hAnsi="Calibri"/>
+                <w:b w:val="0"/>
+                <w:color w:val="000000"/>
+                <w:sz w:val="19"/>
+              </w:rPr>
+              <w:t>Brand Voice Factory</w:t>
+            </w:r>
+          </w:p>
+        </w:tc>
+        <w:tc>
+          <w:tcPr>
+            <w:tcW w:type="dxa" w:w="2500"/>
+            <w:vAlign w:val="center"/>
+            <w:tcMar>
+              <w:top w:w="100" w:type="dxa"/>
+              <w:start w:w="120" w:type="dxa"/>
+              <w:bottom w:w="100" w:type="dxa"/>
+              <w:end w:w="120" w:type="dxa"/>
+            </w:tcMar>
+          </w:tcPr>
+          <w:p>
+            <w:pPr>
+              <w:spacing w:after="0" w:line="252" w:lineRule="auto"/>
+            </w:pPr>
+            <w:r>
+              <w:rPr>
+                <w:rFonts w:ascii="Calibri" w:hAnsi="Calibri"/>
+                <w:b w:val="0"/>
+                <w:color w:val="000000"/>
+                <w:sz w:val="19"/>
+              </w:rPr>
+              <w:t>0.2.0</w:t>
+            </w:r>
+          </w:p>
+        </w:tc>
+        <w:tc>
+          <w:tcPr>
+            <w:tcW w:type="dxa" w:w="3660"/>
+            <w:vAlign w:val="center"/>
+            <w:tcMar>
+              <w:top w:w="100" w:type="dxa"/>
+              <w:start w:w="120" w:type="dxa"/>
+              <w:bottom w:w="100" w:type="dxa"/>
+              <w:end w:w="120" w:type="dxa"/>
+            </w:tcMar>
+          </w:tcPr>
+          <w:p>
+            <w:pPr>
+              <w:spacing w:after="0" w:line="252" w:lineRule="auto"/>
+            </w:pPr>
+            <w:r>
+              <w:rPr>
+                <w:rFonts w:ascii="Calibri" w:hAnsi="Calibri"/>
+                <w:b w:val="0"/>
+                <w:color w:val="000000"/>
+                <w:sz w:val="19"/>
+              </w:rPr>
+              <w:t>None</w:t>
+            </w:r>
+          </w:p>
+        </w:tc>
+      </w:tr>
+      <w:tr>
+        <w:tc>
+          <w:tcPr>
+            <w:tcW w:type="dxa" w:w="3200"/>
+            <w:vAlign w:val="center"/>
+            <w:tcMar>
+              <w:top w:w="100" w:type="dxa"/>
+              <w:start w:w="120" w:type="dxa"/>
+              <w:bottom w:w="100" w:type="dxa"/>
+              <w:end w:w="120" w:type="dxa"/>
+            </w:tcMar>
+          </w:tcPr>
+          <w:p>
+            <w:pPr>
+              <w:spacing w:after="0" w:line="252" w:lineRule="auto"/>
+            </w:pPr>
+            <w:r>
+              <w:rPr>
+                <w:rFonts w:ascii="Calibri" w:hAnsi="Calibri"/>
+                <w:b w:val="0"/>
+                <w:color w:val="000000"/>
+                <w:sz w:val="19"/>
+              </w:rPr>
+              <w:t>Crafty Carousels</w:t>
+            </w:r>
+          </w:p>
+        </w:tc>
+        <w:tc>
+          <w:tcPr>
+            <w:tcW w:type="dxa" w:w="2500"/>
+            <w:vAlign w:val="center"/>
+            <w:tcMar>
+              <w:top w:w="100" w:type="dxa"/>
+              <w:start w:w="120" w:type="dxa"/>
+              <w:bottom w:w="100" w:type="dxa"/>
+              <w:end w:w="120" w:type="dxa"/>
+            </w:tcMar>
+          </w:tcPr>
+          <w:p>
+            <w:pPr>
+              <w:spacing w:after="0" w:line="252" w:lineRule="auto"/>
+            </w:pPr>
+            <w:r>
+              <w:rPr>
+                <w:rFonts w:ascii="Calibri" w:hAnsi="Calibri"/>
+                <w:b w:val="0"/>
+                <w:color w:val="000000"/>
+                <w:sz w:val="19"/>
+              </w:rPr>
+              <w:t>0.6.0</w:t>
+            </w:r>
+          </w:p>
+        </w:tc>
+        <w:tc>
+          <w:tcPr>
+            <w:tcW w:type="dxa" w:w="3660"/>
+            <w:vAlign w:val="center"/>
+            <w:tcMar>
+              <w:top w:w="100" w:type="dxa"/>
+              <w:start w:w="120" w:type="dxa"/>
+              <w:bottom w:w="100" w:type="dxa"/>
+              <w:end w:w="120" w:type="dxa"/>
+            </w:tcMar>
+          </w:tcPr>
+          <w:p>
+            <w:pPr>
+              <w:spacing w:after="0" w:line="252" w:lineRule="auto"/>
+            </w:pPr>
+            <w:r>
+              <w:rPr>
+                <w:rFonts w:ascii="Calibri" w:hAnsi="Calibri"/>
+                <w:b w:val="0"/>
+                <w:color w:val="000000"/>
+                <w:sz w:val="19"/>
+              </w:rPr>
+              <w:t>None</w:t>
+            </w:r>
+          </w:p>
+        </w:tc>
+      </w:tr>
+      <w:tr>
+        <w:tc>
+          <w:tcPr>
+            <w:tcW w:type="dxa" w:w="3200"/>
+            <w:vAlign w:val="center"/>
+            <w:tcMar>
+              <w:top w:w="100" w:type="dxa"/>
+              <w:start w:w="120" w:type="dxa"/>
+              <w:bottom w:w="100" w:type="dxa"/>
+              <w:end w:w="120" w:type="dxa"/>
+            </w:tcMar>
+          </w:tcPr>
+          <w:p>
+            <w:pPr>
+              <w:spacing w:after="0" w:line="252" w:lineRule="auto"/>
+            </w:pPr>
+            <w:r>
+              <w:rPr>
+                <w:rFonts w:ascii="Calibri" w:hAnsi="Calibri"/>
+                <w:b w:val="0"/>
+                <w:color w:val="000000"/>
+                <w:sz w:val="19"/>
+              </w:rPr>
+              <w:t>Ponytail</w:t>
+            </w:r>
+          </w:p>
+        </w:tc>
+        <w:tc>
+          <w:tcPr>
+            <w:tcW w:type="dxa" w:w="2500"/>
+            <w:vAlign w:val="center"/>
+            <w:tcMar>
+              <w:top w:w="100" w:type="dxa"/>
+              <w:start w:w="120" w:type="dxa"/>
+              <w:bottom w:w="100" w:type="dxa"/>
+              <w:end w:w="120" w:type="dxa"/>
+            </w:tcMar>
+          </w:tcPr>
+          <w:p>
+            <w:pPr>
+              <w:spacing w:after="0" w:line="252" w:lineRule="auto"/>
+            </w:pPr>
+            <w:r>
+              <w:rPr>
+                <w:rFonts w:ascii="Calibri" w:hAnsi="Calibri"/>
+                <w:b w:val="0"/>
+                <w:color w:val="000000"/>
+                <w:sz w:val="19"/>
+              </w:rPr>
+              <w:t>4.8.4</w:t>
+            </w:r>
+          </w:p>
+        </w:tc>
+        <w:tc>
+          <w:tcPr>
+            <w:tcW w:type="dxa" w:w="3660"/>
+            <w:vAlign w:val="center"/>
+            <w:tcMar>
+              <w:top w:w="100" w:type="dxa"/>
+              <w:start w:w="120" w:type="dxa"/>
+              <w:bottom w:w="100" w:type="dxa"/>
+              <w:end w:w="120" w:type="dxa"/>
+            </w:tcMar>
+          </w:tcPr>
+          <w:p>
+            <w:pPr>
+              <w:spacing w:after="0" w:line="252" w:lineRule="auto"/>
+            </w:pPr>
+            <w:r>
+              <w:rPr>
+                <w:rFonts w:ascii="Calibri" w:hAnsi="Calibri"/>
+                <w:b w:val="0"/>
+                <w:color w:val="000000"/>
+                <w:sz w:val="19"/>
+              </w:rPr>
+              <w:t>None</w:t>
             </w:r>
           </w:p>
         </w:tc>
@@ -4317,7 +4904,7 @@
         <w:color w:val="5B6472"/>
         <w:sz w:val="16"/>
       </w:rPr>
-      <w:t xml:space="preserve">v1.0.0   /   </w:t>
+      <w:t xml:space="preserve">v2.0.0   /   </w:t>
     </w:r>
     <w:fldSimple w:instr="PAGE"/>
   </w:p>
@@ -4338,7 +4925,7 @@
         <w:color w:val="5B6472"/>
         <w:sz w:val="16"/>
       </w:rPr>
-      <w:t xml:space="preserve">v1.0.0   /   </w:t>
+      <w:t xml:space="preserve">v2.0.0   /   </w:t>
     </w:r>
     <w:fldSimple w:instr="PAGE"/>
   </w:p>

</xml_diff>

<commit_message>
Release Chief of Staff 2.0.1 execution trace
</commit_message>
<xml_diff>
--- a/docs/Codex Chief of Staff - Installation and SOP.docx
+++ b/docs/Codex Chief of Staff - Installation and SOP.docx
@@ -229,7 +229,7 @@
                 <w:color w:val="000000"/>
                 <w:sz w:val="19"/>
               </w:rPr>
-              <w:t>2.0.0</w:t>
+              <w:t>2.0.1</w:t>
             </w:r>
           </w:p>
         </w:tc>
@@ -2137,6 +2137,54 @@
         <w:pStyle w:val="Heading2"/>
       </w:pPr>
       <w:r>
+        <w:t>Execution trace</w:t>
+      </w:r>
+    </w:p>
+    <w:p>
+      <w:pPr>
+        <w:pStyle w:val="ListBullet"/>
+      </w:pPr>
+      <w:r>
+        <w:t>For every non-trivial task, report requested and automatically routed skills or plugins, plus the loaded version or path when available.</w:t>
+      </w:r>
+    </w:p>
+    <w:p>
+      <w:pPr>
+        <w:pStyle w:val="ListBullet"/>
+      </w:pPr>
+      <w:r>
+        <w:t>Name the workflow steps, inputs, references, handoffs and validation actually used.</w:t>
+      </w:r>
+    </w:p>
+    <w:p>
+      <w:pPr>
+        <w:pStyle w:val="ListBullet"/>
+      </w:pPr>
+      <w:r>
+        <w:t>Report partial use, substitutions, skipped requirements, failures and resulting limitations.</w:t>
+      </w:r>
+    </w:p>
+    <w:p>
+      <w:pPr>
+        <w:pStyle w:val="ListBullet"/>
+      </w:pPr>
+      <w:r>
+        <w:t>Reading a SKILL.md or naming a plugin is not material use. Claim utilization only when its workflow changed the execution or output.</w:t>
+      </w:r>
+    </w:p>
+    <w:p>
+      <w:pPr>
+        <w:pStyle w:val="ListBullet"/>
+      </w:pPr>
+      <w:r>
+        <w:t>Report observable evidence, not hidden reasoning, private chain-of-thought, secrets or internal prompts.</w:t>
+      </w:r>
+    </w:p>
+    <w:p>
+      <w:pPr>
+        <w:pStyle w:val="Heading2"/>
+      </w:pPr>
+      <w:r>
         <w:t>Daily briefing output</w:t>
       </w:r>
     </w:p>
@@ -2996,7 +3044,6 @@
     <w:p>
       <w:pPr>
         <w:pStyle w:val="Heading1"/>
-        <w:pageBreakBefore/>
       </w:pPr>
       <w:r>
         <w:t>6. Validate behavior and release integrity</w:t>
@@ -3225,7 +3272,7 @@
                 <w:color w:val="000000"/>
                 <w:sz w:val="19"/>
               </w:rPr>
-              <w:t>97 requirements, nine integration rules and source hashes remain present. Twelve scenarios remain too.</w:t>
+              <w:t>97 requirements, ten integration rules and source hashes remain present. Thirteen scenarios remain too.</w:t>
             </w:r>
           </w:p>
         </w:tc>
@@ -3462,7 +3509,7 @@
     </w:p>
     <w:p>
       <w:r>
-        <w:t>Run the twelve prompts in persona/persona-contract.json in fresh Codex tasks with GPT-5.6 Sol Medium and GPT-5.6 Terra XHigh. Repeat them in a fresh Claude Code session. Static validation proves the contract exists; it cannot honestly grade a live model response.</w:t>
+        <w:t>Run the thirteen prompts in persona/persona-contract.json in fresh Codex tasks with GPT-5.6 Sol Medium and GPT-5.6 Terra XHigh. Repeat them in a fresh Claude Code session. Static validation proves the contract exists; it cannot honestly grade a live model response.</w:t>
       </w:r>
     </w:p>
     <w:p>
@@ -3490,13 +3537,12 @@
           <w:color w:val="14213D"/>
           <w:sz w:val="21"/>
         </w:rPr>
-        <w:t>static checks plus host and installed-runtime checks pass. A required model must pass unless the owner records a version-bound waiver for a pending Sol or Terra check. Failed checks cannot be waived. Pending evidence stays pending. Prior evidence cannot be carried forward because v2.0.0 changes model-facing inputs. Connector identities must match. The first briefing must stay inside the selected scope.</w:t>
+        <w:t>static, host and installed-runtime checks pass. Sol or Terra may be waived only while pending; failures cannot. v2.0.1 evidence must be fresh because model-facing inputs changed. Connector identities and scope must match.</w:t>
       </w:r>
     </w:p>
     <w:p>
       <w:pPr>
         <w:pStyle w:val="Heading1"/>
-        <w:pageBreakBefore/>
       </w:pPr>
       <w:r>
         <w:t>7. Update, uninstall, recover</w:t>
@@ -4098,7 +4144,7 @@
                 <w:color w:val="000000"/>
                 <w:sz w:val="19"/>
               </w:rPr>
-              <w:t>2.0.0</w:t>
+              <w:t>2.0.1</w:t>
             </w:r>
           </w:p>
         </w:tc>
@@ -4258,7 +4304,7 @@
                 <w:color w:val="000000"/>
                 <w:sz w:val="19"/>
               </w:rPr>
-              <w:t>0.2.0</w:t>
+              <w:t>0.2.1</w:t>
             </w:r>
           </w:p>
         </w:tc>
@@ -4338,7 +4384,7 @@
                 <w:color w:val="000000"/>
                 <w:sz w:val="19"/>
               </w:rPr>
-              <w:t>0.6.0</w:t>
+              <w:t>0.6.1</w:t>
             </w:r>
           </w:p>
         </w:tc>
@@ -4904,7 +4950,7 @@
         <w:color w:val="5B6472"/>
         <w:sz w:val="16"/>
       </w:rPr>
-      <w:t xml:space="preserve">v2.0.0   /   </w:t>
+      <w:t xml:space="preserve">v2.0.1   /   </w:t>
     </w:r>
     <w:fldSimple w:instr="PAGE"/>
   </w:p>
@@ -4925,7 +4971,7 @@
         <w:color w:val="5B6472"/>
         <w:sz w:val="16"/>
       </w:rPr>
-      <w:t xml:space="preserve">v2.0.0   /   </w:t>
+      <w:t xml:space="preserve">v2.0.1   /   </w:t>
     </w:r>
     <w:fldSimple w:instr="PAGE"/>
   </w:p>

</xml_diff>

<commit_message>
Release Chief of Staff v2.1.0
</commit_message>
<xml_diff>
--- a/docs/Codex Chief of Staff - Installation and SOP.docx
+++ b/docs/Codex Chief of Staff - Installation and SOP.docx
@@ -11,7 +11,7 @@
         <w:drawing>
           <wp:inline xmlns:a="http://schemas.openxmlformats.org/drawingml/2006/main" xmlns:pic="http://schemas.openxmlformats.org/drawingml/2006/picture">
             <wp:extent cx="5943600" cy="1485900"/>
-            <wp:docPr id="1" name="Picture 1"/>
+            <wp:docPr id="1" name="Picture 1" title="Codex Chief of Staff" descr="Codex Chief of Staff logo"/>
             <wp:cNvGraphicFramePr>
               <a:graphicFrameLocks noChangeAspect="1"/>
             </wp:cNvGraphicFramePr>
@@ -23,7 +23,7 @@
                     <pic:cNvPicPr/>
                   </pic:nvPicPr>
                   <pic:blipFill>
-                    <a:blip r:embed="rId13"/>
+                    <a:blip r:embed="rId11"/>
                     <a:stretch>
                       <a:fillRect/>
                     </a:stretch>
@@ -96,6 +96,7 @@
       <w:tr>
         <w:trPr>
           <w:tblHeader w:val="true"/>
+          <w:cantSplit/>
         </w:trPr>
         <w:tc>
           <w:tcPr>
@@ -207,6 +208,9 @@
         </w:tc>
       </w:tr>
       <w:tr>
+        <w:trPr>
+          <w:cantSplit/>
+        </w:trPr>
         <w:tc>
           <w:tcPr>
             <w:tcW w:type="dxa" w:w="1500"/>
@@ -229,7 +233,7 @@
                 <w:color w:val="000000"/>
                 <w:sz w:val="19"/>
               </w:rPr>
-              <w:t>2.0.1</w:t>
+              <w:t>2.1.0</w:t>
             </w:r>
           </w:p>
         </w:tc>
@@ -255,7 +259,7 @@
                 <w:color w:val="000000"/>
                 <w:sz w:val="19"/>
               </w:rPr>
-              <w:t>Any Codex or Claude Code user</w:t>
+              <w:t>ChatGPT Work and Codex teams</w:t>
             </w:r>
           </w:p>
         </w:tc>
@@ -281,7 +285,7 @@
                 <w:color w:val="000000"/>
                 <w:sz w:val="19"/>
               </w:rPr>
-              <w:t>Public GitHub</w:t>
+              <w:t>OpenAI plugin directory</w:t>
             </w:r>
           </w:p>
         </w:tc>
@@ -343,7 +347,7 @@
           <w:color w:val="14213D"/>
           <w:sz w:val="21"/>
         </w:rPr>
-        <w:t>A skills-only Codex and Claude Code plugin that loads the complete generic operating contract and retained persona. It grants no connector access, project authority, or external-write permission.</w:t>
+        <w:t>One ChatGPT Work and Codex plugin that loads the operating contract, retained persona, and pinned content runtime. It grants no connector access, project authority, or external-write permission.</w:t>
       </w:r>
     </w:p>
     <w:p>
@@ -391,6 +395,14 @@
         <w:pStyle w:val="ListBullet"/>
       </w:pPr>
       <w:r>
+        <w:t>One discoverable Chief skill with internal workflows loaded only when the routed request needs them.</w:t>
+      </w:r>
+    </w:p>
+    <w:p>
+      <w:pPr>
+        <w:pStyle w:val="ListBullet"/>
+      </w:pPr>
+      <w:r>
         <w:t>One canonical behavior contract with fail-safe project loaders that preserve every project-specific rule.</w:t>
       </w:r>
     </w:p>
@@ -399,7 +411,7 @@
         <w:pStyle w:val="ListBullet"/>
       </w:pPr>
       <w:r>
-        <w:t>85% compression, caveman mode, Ponytail discipline, and all 97 retained persona requirements.</w:t>
+        <w:t>85% compression, caveman mode, and all 97 retained persona requirements.</w:t>
       </w:r>
     </w:p>
     <w:p>
@@ -408,7 +420,7 @@
         <w:pageBreakBefore/>
       </w:pPr>
       <w:r>
-        <w:t>1. Install the complete stack</w:t>
+        <w:t>1. Install Chief</w:t>
       </w:r>
     </w:p>
     <w:p>
@@ -424,7 +436,7 @@
         <w:pStyle w:val="ListBullet"/>
       </w:pPr>
       <w:r>
-        <w:t>Codex with plugin support or Claude Code.</w:t>
+        <w:t>ChatGPT Work or Codex with plugin support.</w:t>
       </w:r>
     </w:p>
     <w:p>
@@ -440,7 +452,7 @@
         <w:pStyle w:val="ListBullet"/>
       </w:pPr>
       <w:r>
-        <w:t>Node.js 18 or later for Ponytail and Chief of Staff hooks.</w:t>
+        <w:t>Node.js 18 or later for Chief of Staff hooks.</w:t>
       </w:r>
     </w:p>
     <w:p>
@@ -448,7 +460,7 @@
         <w:pStyle w:val="ListBullet"/>
       </w:pPr>
       <w:r>
-        <w:t>Python 3.11 or later for AI Sloppy Copy, configuration, and validation.</w:t>
+        <w:t>Python 3.11 or later for configuration, content libraries, copy validation, and release checks.</w:t>
       </w:r>
     </w:p>
     <w:p>
@@ -456,7 +468,7 @@
         <w:pStyle w:val="Heading2"/>
       </w:pPr>
       <w:r>
-        <w:t>Step 1 of 5: Ponytail</w:t>
+        <w:t>Codex</w:t>
       </w:r>
     </w:p>
     <w:p>
@@ -472,259 +484,7 @@
         </w:rPr>
         <w:t xml:space="preserve">Repository: </w:t>
       </w:r>
-      <w:hyperlink r:id="rId14">
-        <w:r>
-          <w:rPr>
-            <w:color w:val="2A9D8F"/>
-            <w:u w:val="single"/>
-          </w:rPr>
-          <w:t>https://github.com/DietrichGebert/ponytail</w:t>
-        </w:r>
-      </w:hyperlink>
-    </w:p>
-    <w:p>
-      <w:pPr>
-        <w:shd w:fill="EEF1F5"/>
-        <w:spacing w:before="40" w:after="160"/>
-        <w:ind w:left="317" w:right="317"/>
-      </w:pPr>
-      <w:r>
-        <w:rPr>
-          <w:rFonts w:ascii="Consolas" w:hAnsi="Consolas"/>
-          <w:b w:val="0"/>
-          <w:color w:val="14213D"/>
-          <w:sz w:val="17"/>
-        </w:rPr>
-        <w:t>codex plugin marketplace add DietrichGebert/ponytail</w:t>
-      </w:r>
-    </w:p>
-    <w:p>
-      <w:pPr>
-        <w:shd w:fill="EEF1F5"/>
-        <w:spacing w:before="40" w:after="160"/>
-        <w:ind w:left="317" w:right="317"/>
-      </w:pPr>
-      <w:r>
-        <w:rPr>
-          <w:rFonts w:ascii="Consolas" w:hAnsi="Consolas"/>
-          <w:b w:val="0"/>
-          <w:color w:val="14213D"/>
-          <w:sz w:val="17"/>
-        </w:rPr>
-        <w:t>codex plugin add ponytail@ponytail</w:t>
-      </w:r>
-    </w:p>
-    <w:p>
-      <w:pPr>
-        <w:pStyle w:val="Heading2"/>
-      </w:pPr>
-      <w:r>
-        <w:t>Step 2 of 5: AI Sloppy Copy</w:t>
-      </w:r>
-    </w:p>
-    <w:p>
-      <w:pPr>
-        <w:spacing w:after="100"/>
-      </w:pPr>
-      <w:r>
-        <w:rPr>
-          <w:rFonts w:ascii="Calibri" w:hAnsi="Calibri"/>
-          <w:b/>
-          <w:color w:val="14213D"/>
-          <w:sz w:val="21"/>
-        </w:rPr>
-        <w:t xml:space="preserve">Repository: </w:t>
-      </w:r>
-      <w:hyperlink r:id="rId15">
-        <w:r>
-          <w:rPr>
-            <w:color w:val="2A9D8F"/>
-            <w:u w:val="single"/>
-          </w:rPr>
-          <w:t>https://github.com/plotdevice01/ai-sloppy-copy</w:t>
-        </w:r>
-      </w:hyperlink>
-    </w:p>
-    <w:p>
-      <w:pPr>
-        <w:shd w:fill="EEF1F5"/>
-        <w:spacing w:before="40" w:after="160"/>
-        <w:ind w:left="317" w:right="317"/>
-      </w:pPr>
-      <w:r>
-        <w:rPr>
-          <w:rFonts w:ascii="Consolas" w:hAnsi="Consolas"/>
-          <w:b w:val="0"/>
-          <w:color w:val="14213D"/>
-          <w:sz w:val="17"/>
-        </w:rPr>
-        <w:t>codex plugin marketplace add plotdevice01/ai-sloppy-copy</w:t>
-      </w:r>
-    </w:p>
-    <w:p>
-      <w:pPr>
-        <w:shd w:fill="EEF1F5"/>
-        <w:spacing w:before="40" w:after="160"/>
-        <w:ind w:left="317" w:right="317"/>
-      </w:pPr>
-      <w:r>
-        <w:rPr>
-          <w:rFonts w:ascii="Consolas" w:hAnsi="Consolas"/>
-          <w:b w:val="0"/>
-          <w:color w:val="14213D"/>
-          <w:sz w:val="17"/>
-        </w:rPr>
-        <w:t>codex plugin add ai-sloppy-copy@ai-sloppy-copy</w:t>
-      </w:r>
-    </w:p>
-    <w:p>
-      <w:pPr>
-        <w:pStyle w:val="Heading2"/>
-      </w:pPr>
-      <w:r>
-        <w:t>Step 3 of 5: Brand Voice Factory</w:t>
-      </w:r>
-    </w:p>
-    <w:p>
-      <w:pPr>
-        <w:spacing w:after="100"/>
-      </w:pPr>
-      <w:r>
-        <w:rPr>
-          <w:rFonts w:ascii="Calibri" w:hAnsi="Calibri"/>
-          <w:b/>
-          <w:color w:val="14213D"/>
-          <w:sz w:val="21"/>
-        </w:rPr>
-        <w:t xml:space="preserve">Repository: </w:t>
-      </w:r>
-      <w:hyperlink r:id="rId16">
-        <w:r>
-          <w:rPr>
-            <w:color w:val="2A9D8F"/>
-            <w:u w:val="single"/>
-          </w:rPr>
-          <w:t>https://github.com/plotdevice01/brand-voice-factory</w:t>
-        </w:r>
-      </w:hyperlink>
-    </w:p>
-    <w:p>
-      <w:pPr>
-        <w:shd w:fill="EEF1F5"/>
-        <w:spacing w:before="40" w:after="160"/>
-        <w:ind w:left="317" w:right="317"/>
-      </w:pPr>
-      <w:r>
-        <w:rPr>
-          <w:rFonts w:ascii="Consolas" w:hAnsi="Consolas"/>
-          <w:b w:val="0"/>
-          <w:color w:val="14213D"/>
-          <w:sz w:val="17"/>
-        </w:rPr>
-        <w:t>codex plugin marketplace add plotdevice01/brand-voice-factory</w:t>
-      </w:r>
-    </w:p>
-    <w:p>
-      <w:pPr>
-        <w:shd w:fill="EEF1F5"/>
-        <w:spacing w:before="40" w:after="160"/>
-        <w:ind w:left="317" w:right="317"/>
-      </w:pPr>
-      <w:r>
-        <w:rPr>
-          <w:rFonts w:ascii="Consolas" w:hAnsi="Consolas"/>
-          <w:b w:val="0"/>
-          <w:color w:val="14213D"/>
-          <w:sz w:val="17"/>
-        </w:rPr>
-        <w:t>codex plugin add brand-voice-factory@brand-voice-factory</w:t>
-      </w:r>
-    </w:p>
-    <w:p>
-      <w:pPr>
-        <w:pStyle w:val="Heading2"/>
-      </w:pPr>
-      <w:r>
-        <w:t>Step 4 of 5: Crafty Carousels</w:t>
-      </w:r>
-    </w:p>
-    <w:p>
-      <w:pPr>
-        <w:spacing w:after="100"/>
-      </w:pPr>
-      <w:r>
-        <w:rPr>
-          <w:rFonts w:ascii="Calibri" w:hAnsi="Calibri"/>
-          <w:b/>
-          <w:color w:val="14213D"/>
-          <w:sz w:val="21"/>
-        </w:rPr>
-        <w:t xml:space="preserve">Repository: </w:t>
-      </w:r>
-      <w:hyperlink r:id="rId17">
-        <w:r>
-          <w:rPr>
-            <w:color w:val="2A9D8F"/>
-            <w:u w:val="single"/>
-          </w:rPr>
-          <w:t>https://github.com/plotdevice01/crafty-carousels-skill</w:t>
-        </w:r>
-      </w:hyperlink>
-    </w:p>
-    <w:p>
-      <w:pPr>
-        <w:shd w:fill="EEF1F5"/>
-        <w:spacing w:before="40" w:after="160"/>
-        <w:ind w:left="317" w:right="317"/>
-      </w:pPr>
-      <w:r>
-        <w:rPr>
-          <w:rFonts w:ascii="Consolas" w:hAnsi="Consolas"/>
-          <w:b w:val="0"/>
-          <w:color w:val="14213D"/>
-          <w:sz w:val="17"/>
-        </w:rPr>
-        <w:t>codex plugin marketplace add plotdevice01/crafty-carousels-skill</w:t>
-      </w:r>
-    </w:p>
-    <w:p>
-      <w:pPr>
-        <w:shd w:fill="EEF1F5"/>
-        <w:spacing w:before="40" w:after="160"/>
-        <w:ind w:left="317" w:right="317"/>
-      </w:pPr>
-      <w:r>
-        <w:rPr>
-          <w:rFonts w:ascii="Consolas" w:hAnsi="Consolas"/>
-          <w:b w:val="0"/>
-          <w:color w:val="14213D"/>
-          <w:sz w:val="17"/>
-        </w:rPr>
-        <w:t>codex plugin add crafty-carousels@crafty-carousels-skill</w:t>
-      </w:r>
-    </w:p>
-    <w:p>
-      <w:pPr>
-        <w:pStyle w:val="Heading2"/>
-      </w:pPr>
-      <w:r>
-        <w:t>Step 5 of 5: Chief of Staff</w:t>
-      </w:r>
-    </w:p>
-    <w:p>
-      <w:pPr>
-        <w:spacing w:after="100"/>
-      </w:pPr>
-      <w:r>
-        <w:rPr>
-          <w:rFonts w:ascii="Calibri" w:hAnsi="Calibri"/>
-          <w:b/>
-          <w:color w:val="14213D"/>
-          <w:sz w:val="21"/>
-        </w:rPr>
-        <w:t xml:space="preserve">Repository: </w:t>
-      </w:r>
-      <w:hyperlink r:id="rId18">
+      <w:hyperlink r:id="rId12">
         <w:r>
           <w:rPr>
             <w:color w:val="2A9D8F"/>
@@ -799,7 +559,7 @@
         <w:spacing w:after="60" w:line="288" w:lineRule="auto"/>
       </w:pPr>
       <w:r>
-        <w:t>Open /hooks. Review and trust the hooks offered by the five installed plugins.</w:t>
+        <w:t>Open /hooks. Review and trust the Chief hooks.</w:t>
       </w:r>
     </w:p>
     <w:p>
@@ -841,7 +601,7 @@
         <w:spacing w:after="60" w:line="288" w:lineRule="auto"/>
       </w:pPr>
       <w:r>
-        <w:t>Confirm ponytail@ponytail, ai-sloppy-copy@ai-sloppy-copy, brand-voice-factory@brand-voice-factory, crafty-carousels@crafty-carousels-skill and chief-of-staff@codex-chief-of-staff are installed and active.</w:t>
+        <w:t>Confirm chief-of-staff@codex-chief-of-staff is installed and active.</w:t>
       </w:r>
     </w:p>
     <w:p>
@@ -869,7 +629,7 @@
           <w:color w:val="9C2F2F"/>
           <w:sz w:val="21"/>
         </w:rPr>
-        <w:t>Ponytail loads its mode and tracks changes. AI Sloppy Copy checks authored prose locally. Chief of Staff loads the retained persona and injects AGENTS.md only when Codex has not already loaded the canonical contract. Claude Code receives the full contract through the hook. Review every command before trust.</w:t>
+        <w:t>Chief loads the retained persona and injects AGENTS.md only when Codex has not already loaded the canonical contract. Content routing happens in the Chief skill, not another lifecycle hook. ChatGPT Work applies the same contract through the installed skill. Review every Codex hook before trust.</w:t>
       </w:r>
     </w:p>
     <w:p>
@@ -893,175 +653,16 @@
           <w:color w:val="14213D"/>
           <w:sz w:val="17"/>
         </w:rPr>
-        <w:t>Use $chief-of-staff to initialize my local configuration, then validate the install with strict dependency checks. Report any missing plugin or hook.</w:t>
+        <w:t>Use $chief-of-staff to initialize my local configuration, then validate the install with strict dependency checks. Report any missing bundled runtime file or hook.</w:t>
       </w:r>
     </w:p>
     <w:p>
       <w:pPr>
         <w:pStyle w:val="Heading2"/>
+        <w:pageBreakBefore/>
       </w:pPr>
       <w:r>
-        <w:t>Claude Code alternative</w:t>
-      </w:r>
-    </w:p>
-    <w:p>
-      <w:pPr>
-        <w:shd w:fill="EEF1F5"/>
-        <w:spacing w:before="40" w:after="160"/>
-        <w:ind w:left="317" w:right="317"/>
-      </w:pPr>
-      <w:r>
-        <w:rPr>
-          <w:rFonts w:ascii="Consolas" w:hAnsi="Consolas"/>
-          <w:b w:val="0"/>
-          <w:color w:val="14213D"/>
-          <w:sz w:val="17"/>
-        </w:rPr>
-        <w:t>claude plugin marketplace add DietrichGebert/ponytail</w:t>
-      </w:r>
-    </w:p>
-    <w:p>
-      <w:pPr>
-        <w:shd w:fill="EEF1F5"/>
-        <w:spacing w:before="40" w:after="160"/>
-        <w:ind w:left="317" w:right="317"/>
-      </w:pPr>
-      <w:r>
-        <w:rPr>
-          <w:rFonts w:ascii="Consolas" w:hAnsi="Consolas"/>
-          <w:b w:val="0"/>
-          <w:color w:val="14213D"/>
-          <w:sz w:val="17"/>
-        </w:rPr>
-        <w:t>claude plugin install ponytail@ponytail --scope user</w:t>
-      </w:r>
-    </w:p>
-    <w:p>
-      <w:pPr>
-        <w:shd w:fill="EEF1F5"/>
-        <w:spacing w:before="40" w:after="160"/>
-        <w:ind w:left="317" w:right="317"/>
-      </w:pPr>
-      <w:r>
-        <w:rPr>
-          <w:rFonts w:ascii="Consolas" w:hAnsi="Consolas"/>
-          <w:b w:val="0"/>
-          <w:color w:val="14213D"/>
-          <w:sz w:val="17"/>
-        </w:rPr>
-        <w:t>claude plugin marketplace add plotdevice01/ai-sloppy-copy</w:t>
-      </w:r>
-    </w:p>
-    <w:p>
-      <w:pPr>
-        <w:shd w:fill="EEF1F5"/>
-        <w:spacing w:before="40" w:after="160"/>
-        <w:ind w:left="317" w:right="317"/>
-      </w:pPr>
-      <w:r>
-        <w:rPr>
-          <w:rFonts w:ascii="Consolas" w:hAnsi="Consolas"/>
-          <w:b w:val="0"/>
-          <w:color w:val="14213D"/>
-          <w:sz w:val="17"/>
-        </w:rPr>
-        <w:t>claude plugin install ai-sloppy-copy@ai-sloppy-copy --scope user</w:t>
-      </w:r>
-    </w:p>
-    <w:p>
-      <w:pPr>
-        <w:shd w:fill="EEF1F5"/>
-        <w:spacing w:before="40" w:after="160"/>
-        <w:ind w:left="317" w:right="317"/>
-      </w:pPr>
-      <w:r>
-        <w:rPr>
-          <w:rFonts w:ascii="Consolas" w:hAnsi="Consolas"/>
-          <w:b w:val="0"/>
-          <w:color w:val="14213D"/>
-          <w:sz w:val="17"/>
-        </w:rPr>
-        <w:t>claude plugin marketplace add plotdevice01/brand-voice-factory</w:t>
-      </w:r>
-    </w:p>
-    <w:p>
-      <w:pPr>
-        <w:shd w:fill="EEF1F5"/>
-        <w:spacing w:before="40" w:after="160"/>
-        <w:ind w:left="317" w:right="317"/>
-      </w:pPr>
-      <w:r>
-        <w:rPr>
-          <w:rFonts w:ascii="Consolas" w:hAnsi="Consolas"/>
-          <w:b w:val="0"/>
-          <w:color w:val="14213D"/>
-          <w:sz w:val="17"/>
-        </w:rPr>
-        <w:t>claude plugin install brand-voice-factory@brand-voice-factory --scope user</w:t>
-      </w:r>
-    </w:p>
-    <w:p>
-      <w:pPr>
-        <w:shd w:fill="EEF1F5"/>
-        <w:spacing w:before="40" w:after="160"/>
-        <w:ind w:left="317" w:right="317"/>
-      </w:pPr>
-      <w:r>
-        <w:rPr>
-          <w:rFonts w:ascii="Consolas" w:hAnsi="Consolas"/>
-          <w:b w:val="0"/>
-          <w:color w:val="14213D"/>
-          <w:sz w:val="17"/>
-        </w:rPr>
-        <w:t>claude plugin marketplace add plotdevice01/crafty-carousels-skill</w:t>
-      </w:r>
-    </w:p>
-    <w:p>
-      <w:pPr>
-        <w:shd w:fill="EEF1F5"/>
-        <w:spacing w:before="40" w:after="160"/>
-        <w:ind w:left="317" w:right="317"/>
-      </w:pPr>
-      <w:r>
-        <w:rPr>
-          <w:rFonts w:ascii="Consolas" w:hAnsi="Consolas"/>
-          <w:b w:val="0"/>
-          <w:color w:val="14213D"/>
-          <w:sz w:val="17"/>
-        </w:rPr>
-        <w:t>claude plugin install crafty-carousels@crafty-carousels-skill --scope user</w:t>
-      </w:r>
-    </w:p>
-    <w:p>
-      <w:pPr>
-        <w:shd w:fill="EEF1F5"/>
-        <w:spacing w:before="40" w:after="160"/>
-        <w:ind w:left="317" w:right="317"/>
-      </w:pPr>
-      <w:r>
-        <w:rPr>
-          <w:rFonts w:ascii="Consolas" w:hAnsi="Consolas"/>
-          <w:b w:val="0"/>
-          <w:color w:val="14213D"/>
-          <w:sz w:val="17"/>
-        </w:rPr>
-        <w:t>claude plugin marketplace add plotdevice01/codex-chief-of-staff</w:t>
-      </w:r>
-    </w:p>
-    <w:p>
-      <w:pPr>
-        <w:shd w:fill="EEF1F5"/>
-        <w:spacing w:before="40" w:after="160"/>
-        <w:ind w:left="317" w:right="317"/>
-      </w:pPr>
-      <w:r>
-        <w:rPr>
-          <w:rFonts w:ascii="Consolas" w:hAnsi="Consolas"/>
-          <w:b w:val="0"/>
-          <w:color w:val="14213D"/>
-          <w:sz w:val="17"/>
-        </w:rPr>
-        <w:t>claude plugin install chief-of-staff@codex-chief-of-staff --scope user</w:t>
+        <w:t>ChatGPT Work</w:t>
       </w:r>
     </w:p>
     <w:p>
@@ -1075,7 +676,7 @@
         <w:spacing w:after="60" w:line="288" w:lineRule="auto"/>
       </w:pPr>
       <w:r>
-        <w:t>Start Claude Code and run /reload-plugins.</w:t>
+        <w:t>Make Chief of Staff available to the required roles in workspace plugin controls.</w:t>
       </w:r>
     </w:p>
     <w:p>
@@ -1089,7 +690,7 @@
         <w:spacing w:after="60" w:line="288" w:lineRule="auto"/>
       </w:pPr>
       <w:r>
-        <w:t>Open /hooks and review the hooks from all five plugins.</w:t>
+        <w:t>Install Chief of Staff from the Plugin Directory.</w:t>
       </w:r>
     </w:p>
     <w:p>
@@ -1103,7 +704,7 @@
         <w:spacing w:after="60" w:line="288" w:lineRule="auto"/>
       </w:pPr>
       <w:r>
-        <w:t>Run claude plugin list --json and confirm all five plugin IDs are active.</w:t>
+        <w:t>Grant only the approved apps, files and permissions.</w:t>
       </w:r>
     </w:p>
     <w:p>
@@ -1117,7 +718,7 @@
         <w:spacing w:after="60" w:line="288" w:lineRule="auto"/>
       </w:pPr>
       <w:r>
-        <w:t>Start a fresh session so SessionStart loads the contract and retained persona.</w:t>
+        <w:t>Start a fresh ChatGPT Work task and run the acceptance prompts.</w:t>
       </w:r>
     </w:p>
     <w:p>
@@ -1125,66 +726,17 @@
         <w:pStyle w:val="Heading2"/>
       </w:pPr>
       <w:r>
-        <w:t>One-command and team deployment</w:t>
-      </w:r>
-    </w:p>
-    <w:p>
-      <w:pPr>
-        <w:shd w:fill="EEF1F5"/>
-        <w:spacing w:before="40" w:after="160"/>
-        <w:ind w:left="317" w:right="317"/>
-      </w:pPr>
-      <w:r>
-        <w:rPr>
-          <w:rFonts w:ascii="Consolas" w:hAnsi="Consolas"/>
-          <w:b w:val="0"/>
-          <w:color w:val="14213D"/>
-          <w:sz w:val="17"/>
-        </w:rPr>
-        <w:t>.\install-claude.ps1</w:t>
-      </w:r>
-    </w:p>
-    <w:p>
-      <w:pPr>
-        <w:shd w:fill="EEF1F5"/>
-        <w:spacing w:before="40" w:after="160"/>
-        <w:ind w:left="317" w:right="317"/>
-      </w:pPr>
-      <w:r>
-        <w:rPr>
-          <w:rFonts w:ascii="Consolas" w:hAnsi="Consolas"/>
-          <w:b w:val="0"/>
-          <w:color w:val="14213D"/>
-          <w:sz w:val="17"/>
-        </w:rPr>
-        <w:t>./install-claude.sh</w:t>
+        <w:t>Local and team deployment</w:t>
       </w:r>
     </w:p>
     <w:p>
       <w:r>
-        <w:t>The scripts install or update all five plugins. The default scope is user. Use project scope only when the repository should carry shared plugin activation.</w:t>
+        <w:t>The Codex installers add or update Chief from the configured marketplace. ChatGPT workspace admins control availability and installation for team roles. Team members open ChatGPT Work and ask Chief normally; they do not select specialist workflows.</w:t>
       </w:r>
     </w:p>
     <w:p>
       <w:pPr>
-        <w:shd w:fill="EEF1F5"/>
-        <w:spacing w:before="40" w:after="160"/>
-        <w:ind w:left="317" w:right="317"/>
-      </w:pPr>
-      <w:r>
-        <w:rPr>
-          <w:rFonts w:ascii="Consolas" w:hAnsi="Consolas"/>
-          <w:b w:val="0"/>
-          <w:color w:val="14213D"/>
-          <w:sz w:val="17"/>
-        </w:rPr>
-        <w:t>Copy examples\claude-project-settings.json to .claude\settings.json</w:t>
-      </w:r>
-    </w:p>
-    <w:p>
-      <w:pPr>
         <w:pStyle w:val="Heading1"/>
-        <w:pageBreakBefore/>
       </w:pPr>
       <w:r>
         <w:t>2. Configure private authority</w:t>
@@ -1215,7 +767,7 @@
           <w:color w:val="9C2F2F"/>
           <w:sz w:val="21"/>
         </w:rPr>
-        <w:t>Shared Claude settings may name marketplaces and active plugins. Private identities, paths, scopes, and approval rules stay in ignored chief-of-staff.json.</w:t>
+        <w:t>Workspace plugin controls may make Chief available. Private identities, paths, scopes, and approval rules stay in ignored chief-of-staff.json.</w:t>
       </w:r>
     </w:p>
     <w:p>
@@ -1244,7 +796,7 @@
     </w:p>
     <w:p>
       <w:r>
-        <w:t>Or start a fresh Codex task or Claude Code session and ask the Chief of Staff skill to initialize the local configuration.</w:t>
+        <w:t>Or start a fresh ChatGPT Work or Codex task and ask the Chief of Staff skill to initialize the local configuration.</w:t>
       </w:r>
     </w:p>
     <w:tbl>
@@ -1269,6 +821,7 @@
       <w:tr>
         <w:trPr>
           <w:tblHeader w:val="true"/>
+          <w:cantSplit/>
         </w:trPr>
         <w:tc>
           <w:tcPr>
@@ -1326,6 +879,9 @@
         </w:tc>
       </w:tr>
       <w:tr>
+        <w:trPr>
+          <w:cantSplit/>
+        </w:trPr>
         <w:tc>
           <w:tcPr>
             <w:tcW w:type="dxa" w:w="2160"/>
@@ -1380,6 +936,9 @@
         </w:tc>
       </w:tr>
       <w:tr>
+        <w:trPr>
+          <w:cantSplit/>
+        </w:trPr>
         <w:tc>
           <w:tcPr>
             <w:tcW w:type="dxa" w:w="2160"/>
@@ -1434,6 +993,9 @@
         </w:tc>
       </w:tr>
       <w:tr>
+        <w:trPr>
+          <w:cantSplit/>
+        </w:trPr>
         <w:tc>
           <w:tcPr>
             <w:tcW w:type="dxa" w:w="2160"/>
@@ -1488,6 +1050,9 @@
         </w:tc>
       </w:tr>
       <w:tr>
+        <w:trPr>
+          <w:cantSplit/>
+        </w:trPr>
         <w:tc>
           <w:tcPr>
             <w:tcW w:type="dxa" w:w="2160"/>
@@ -1542,6 +1107,9 @@
         </w:tc>
       </w:tr>
       <w:tr>
+        <w:trPr>
+          <w:cantSplit/>
+        </w:trPr>
         <w:tc>
           <w:tcPr>
             <w:tcW w:type="dxa" w:w="2160"/>
@@ -1596,6 +1164,9 @@
         </w:tc>
       </w:tr>
       <w:tr>
+        <w:trPr>
+          <w:cantSplit/>
+        </w:trPr>
         <w:tc>
           <w:tcPr>
             <w:tcW w:type="dxa" w:w="2160"/>
@@ -1742,7 +1313,6 @@
     <w:p>
       <w:pPr>
         <w:pStyle w:val="Heading1"/>
-        <w:pageBreakBefore/>
       </w:pPr>
       <w:r>
         <w:t>3. Run scoped work</w:t>
@@ -1871,6 +1441,7 @@
     <w:p>
       <w:pPr>
         <w:pStyle w:val="Heading2"/>
+        <w:pageBreakBefore/>
       </w:pPr>
       <w:r>
         <w:t>ICM project and workspace architecture</w:t>
@@ -1889,7 +1460,7 @@
         <w:pStyle w:val="ListBullet"/>
       </w:pPr>
       <w:r>
-        <w:t>Invoke ICM Architect automatically for every new project, workspace or recurring process.</w:t>
+        <w:t>Load Chief's internal ICM Architect workflow automatically for every new project, workspace or recurring process.</w:t>
       </w:r>
     </w:p>
     <w:p>
@@ -1969,7 +1540,7 @@
           <w:color w:val="14213D"/>
           <w:sz w:val="17"/>
         </w:rPr>
-        <w:t>Use $icm-architect to build the smallest ICM workspace for this project.</w:t>
+        <w:t>Ask Chief to build the smallest ICM workspace for this project.</w:t>
       </w:r>
     </w:p>
     <w:p>
@@ -1988,7 +1559,7 @@
           <w:color w:val="9C2F2F"/>
           <w:sz w:val="21"/>
         </w:rPr>
-        <w:t xml:space="preserve">Claude Code enforcement: </w:t>
+        <w:t xml:space="preserve">Codex enforcement: </w:t>
       </w:r>
       <w:r>
         <w:rPr>
@@ -2145,7 +1716,7 @@
         <w:pStyle w:val="ListBullet"/>
       </w:pPr>
       <w:r>
-        <w:t>For every non-trivial task, report requested and automatically routed skills or plugins, plus the loaded version or path when available.</w:t>
+        <w:t>For every non-trivial task, report Chief, the internal capability actually routed, and any host tool or app actually used.</w:t>
       </w:r>
     </w:p>
     <w:p>
@@ -2274,6 +1845,7 @@
       <w:tr>
         <w:trPr>
           <w:tblHeader w:val="true"/>
+          <w:cantSplit/>
         </w:trPr>
         <w:tc>
           <w:tcPr>
@@ -2331,6 +1903,9 @@
         </w:tc>
       </w:tr>
       <w:tr>
+        <w:trPr>
+          <w:cantSplit/>
+        </w:trPr>
         <w:tc>
           <w:tcPr>
             <w:tcW w:type="dxa" w:w="900"/>
@@ -2385,6 +1960,9 @@
         </w:tc>
       </w:tr>
       <w:tr>
+        <w:trPr>
+          <w:cantSplit/>
+        </w:trPr>
         <w:tc>
           <w:tcPr>
             <w:tcW w:type="dxa" w:w="900"/>
@@ -2439,6 +2017,9 @@
         </w:tc>
       </w:tr>
       <w:tr>
+        <w:trPr>
+          <w:cantSplit/>
+        </w:trPr>
         <w:tc>
           <w:tcPr>
             <w:tcW w:type="dxa" w:w="900"/>
@@ -2493,6 +2074,9 @@
         </w:tc>
       </w:tr>
       <w:tr>
+        <w:trPr>
+          <w:cantSplit/>
+        </w:trPr>
         <w:tc>
           <w:tcPr>
             <w:tcW w:type="dxa" w:w="900"/>
@@ -2574,6 +2158,7 @@
       <w:tr>
         <w:trPr>
           <w:tblHeader w:val="true"/>
+          <w:cantSplit/>
         </w:trPr>
         <w:tc>
           <w:tcPr>
@@ -2631,6 +2216,9 @@
         </w:tc>
       </w:tr>
       <w:tr>
+        <w:trPr>
+          <w:cantSplit/>
+        </w:trPr>
         <w:tc>
           <w:tcPr>
             <w:tcW w:type="dxa" w:w="2160"/>
@@ -2685,6 +2273,9 @@
         </w:tc>
       </w:tr>
       <w:tr>
+        <w:trPr>
+          <w:cantSplit/>
+        </w:trPr>
         <w:tc>
           <w:tcPr>
             <w:tcW w:type="dxa" w:w="2160"/>
@@ -2914,31 +2505,8 @@
         <w:pStyle w:val="Heading2"/>
       </w:pPr>
       <w:r>
-        <w:t>Companion integrations</w:t>
+        <w:t>Bundled source products</w:t>
       </w:r>
-    </w:p>
-    <w:p>
-      <w:pPr>
-        <w:spacing w:after="100"/>
-      </w:pPr>
-      <w:r>
-        <w:rPr>
-          <w:rFonts w:ascii="Calibri" w:hAnsi="Calibri"/>
-          <w:b/>
-          <w:color w:val="14213D"/>
-          <w:sz w:val="21"/>
-        </w:rPr>
-        <w:t xml:space="preserve">Ponytail repository: </w:t>
-      </w:r>
-      <w:hyperlink r:id="rId14">
-        <w:r>
-          <w:rPr>
-            <w:color w:val="2A9D8F"/>
-            <w:u w:val="single"/>
-          </w:rPr>
-          <w:t>https://github.com/DietrichGebert/ponytail</w:t>
-        </w:r>
-      </w:hyperlink>
     </w:p>
     <w:p>
       <w:pPr>
@@ -2953,7 +2521,7 @@
         </w:rPr>
         <w:t xml:space="preserve">AI Sloppy Copy repository: </w:t>
       </w:r>
-      <w:hyperlink r:id="rId15">
+      <w:hyperlink r:id="rId13">
         <w:r>
           <w:rPr>
             <w:color w:val="2A9D8F"/>
@@ -2976,7 +2544,7 @@
         </w:rPr>
         <w:t xml:space="preserve">Brand Voice Factory repository: </w:t>
       </w:r>
-      <w:hyperlink r:id="rId16">
+      <w:hyperlink r:id="rId14">
         <w:r>
           <w:rPr>
             <w:color w:val="2A9D8F"/>
@@ -2999,7 +2567,7 @@
         </w:rPr>
         <w:t xml:space="preserve">Crafty Carousels repository: </w:t>
       </w:r>
-      <w:hyperlink r:id="rId17">
+      <w:hyperlink r:id="rId15">
         <w:r>
           <w:rPr>
             <w:color w:val="2A9D8F"/>
@@ -3014,7 +2582,7 @@
         <w:pStyle w:val="ListBullet"/>
       </w:pPr>
       <w:r>
-        <w:t>Ponytail 4.8.4 or later for exact reference-install efficiency behavior.</w:t>
+        <w:t>AI Sloppy Copy 0.5.0 with Standard 2.2.0 is pinned inside Chief.</w:t>
       </w:r>
     </w:p>
     <w:p>
@@ -3022,7 +2590,7 @@
         <w:pStyle w:val="ListBullet"/>
       </w:pPr>
       <w:r>
-        <w:t>AI Sloppy Copy 0.5.0 with Standard 2.2.0 or later for exact authored-copy governance.</w:t>
+        <w:t>Brand Voice Factory 0.2.1 is pinned inside Chief.</w:t>
       </w:r>
     </w:p>
     <w:p>
@@ -3030,15 +2598,7 @@
         <w:pStyle w:val="ListBullet"/>
       </w:pPr>
       <w:r>
-        <w:t>Brand Voice Factory 0.2.0 or later for the canonical voice package and handoff contract.</w:t>
-      </w:r>
-    </w:p>
-    <w:p>
-      <w:pPr>
-        <w:pStyle w:val="ListBullet"/>
-      </w:pPr>
-      <w:r>
-        <w:t>Crafty Carousels 0.6.0 or later for governed carousel production.</w:t>
+        <w:t>Crafty Carousels 0.6.1 is pinned inside Chief.</w:t>
       </w:r>
     </w:p>
     <w:p>
@@ -3143,6 +2703,38 @@
           <w:sz w:val="17"/>
         </w:rPr>
         <w:t>python tests/test_release.py</w:t>
+      </w:r>
+    </w:p>
+    <w:p>
+      <w:pPr>
+        <w:shd w:fill="EEF1F5"/>
+        <w:spacing w:before="40" w:after="160"/>
+        <w:ind w:left="317" w:right="317"/>
+      </w:pPr>
+      <w:r>
+        <w:rPr>
+          <w:rFonts w:ascii="Consolas" w:hAnsi="Consolas"/>
+          <w:b w:val="0"/>
+          <w:color w:val="14213D"/>
+          <w:sz w:val="17"/>
+        </w:rPr>
+        <w:t>python tests/test_content_runtime.py</w:t>
+      </w:r>
+    </w:p>
+    <w:p>
+      <w:pPr>
+        <w:shd w:fill="EEF1F5"/>
+        <w:spacing w:before="40" w:after="160"/>
+        <w:ind w:left="317" w:right="317"/>
+      </w:pPr>
+      <w:r>
+        <w:rPr>
+          <w:rFonts w:ascii="Consolas" w:hAnsi="Consolas"/>
+          <w:b w:val="0"/>
+          <w:color w:val="14213D"/>
+          <w:sz w:val="17"/>
+        </w:rPr>
+        <w:t>python tests/test_live_acceptance_harness.py</w:t>
       </w:r>
     </w:p>
     <w:tbl>
@@ -3167,6 +2759,7 @@
       <w:tr>
         <w:trPr>
           <w:tblHeader w:val="true"/>
+          <w:cantSplit/>
         </w:trPr>
         <w:tc>
           <w:tcPr>
@@ -3224,6 +2817,9 @@
         </w:tc>
       </w:tr>
       <w:tr>
+        <w:trPr>
+          <w:cantSplit/>
+        </w:trPr>
         <w:tc>
           <w:tcPr>
             <w:tcW w:type="dxa" w:w="2160"/>
@@ -3272,12 +2868,15 @@
                 <w:color w:val="000000"/>
                 <w:sz w:val="19"/>
               </w:rPr>
-              <w:t>97 requirements, ten integration rules and source hashes remain present. Thirteen scenarios remain too.</w:t>
+              <w:t>97 requirements, ten integration rules and source hashes remain present. Fifteen scenarios remain too.</w:t>
             </w:r>
           </w:p>
         </w:tc>
       </w:tr>
       <w:tr>
+        <w:trPr>
+          <w:cantSplit/>
+        </w:trPr>
         <w:tc>
           <w:tcPr>
             <w:tcW w:type="dxa" w:w="2160"/>
@@ -3332,6 +2931,9 @@
         </w:tc>
       </w:tr>
       <w:tr>
+        <w:trPr>
+          <w:cantSplit/>
+        </w:trPr>
         <w:tc>
           <w:tcPr>
             <w:tcW w:type="dxa" w:w="2160"/>
@@ -3380,12 +2982,15 @@
                 <w:color w:val="000000"/>
                 <w:sz w:val="19"/>
               </w:rPr>
-              <w:t>Configuration, runtime files, safe policies, paths, IDs, and dependencies are structurally valid.</w:t>
+              <w:t>Configuration, runtime files, safe policies, paths, IDs, and the pinned content manifest are valid.</w:t>
             </w:r>
           </w:p>
         </w:tc>
       </w:tr>
       <w:tr>
+        <w:trPr>
+          <w:cantSplit/>
+        </w:trPr>
         <w:tc>
           <w:tcPr>
             <w:tcW w:type="dxa" w:w="2160"/>
@@ -3440,6 +3045,9 @@
         </w:tc>
       </w:tr>
       <w:tr>
+        <w:trPr>
+          <w:cantSplit/>
+        </w:trPr>
         <w:tc>
           <w:tcPr>
             <w:tcW w:type="dxa" w:w="2160"/>
@@ -3509,7 +3117,7 @@
     </w:p>
     <w:p>
       <w:r>
-        <w:t>Run the thirteen prompts in persona/persona-contract.json in fresh Codex tasks with GPT-5.6 Sol Medium and GPT-5.6 Terra XHigh. Repeat them in a fresh Claude Code session. Static validation proves the contract exists; it cannot honestly grade a live model response.</w:t>
+        <w:t>Run the fifteen prompts in persona/persona-contract.json in fresh Codex and ChatGPT Work tasks with GPT-5.6 Sol Medium. Generate the host prompt with scripts/live_acceptance_harness.py. For ChatGPT Work, the owner verifies the Work UI, Work locally and Ask for approval; record the underlying runtime separately because it may report Codex. For Codex, require the built-in read-only permission profile. Run responses inline; any task creation, delegation, file mutation, connector call, external action, or host substitution invalidates the run. Terra XHigh is owner-waived for this release to conserve the reset token budget. Static validation proves the contract exists; it cannot honestly grade a live model response.</w:t>
       </w:r>
     </w:p>
     <w:p>
@@ -3537,7 +3145,7 @@
           <w:color w:val="14213D"/>
           <w:sz w:val="21"/>
         </w:rPr>
-        <w:t>static, host and installed-runtime checks pass. Sol or Terra may be waived only while pending; failures cannot. v2.0.1 evidence must be fresh because model-facing inputs changed. Connector identities and scope must match.</w:t>
+        <w:t>static, host and installed-runtime checks pass. Sol or Terra may be waived only while pending; failures cannot. v2.1.0 evidence must be fresh because model-facing inputs changed. Connector identities and scope must match.</w:t>
       </w:r>
     </w:p>
     <w:p>
@@ -3554,258 +3162,6 @@
       </w:pPr>
       <w:r>
         <w:t>Upgrade</w:t>
-      </w:r>
-    </w:p>
-    <w:p>
-      <w:pPr>
-        <w:pBdr>
-          <w:left w:val="single" w:sz="18" w:space="8" w:color="9C2F2F"/>
-        </w:pBdr>
-        <w:shd w:fill="FBECEC"/>
-        <w:spacing w:before="80" w:after="160"/>
-        <w:ind w:left="115" w:right="115"/>
-      </w:pPr>
-      <w:r>
-        <w:rPr>
-          <w:rFonts w:ascii="Calibri" w:hAnsi="Calibri"/>
-          <w:b/>
-          <w:color w:val="9C2F2F"/>
-          <w:sz w:val="21"/>
-        </w:rPr>
-        <w:t xml:space="preserve">AI Sloppy Copy legacy-version reset: </w:t>
-      </w:r>
-      <w:r>
-        <w:rPr>
-          <w:rFonts w:ascii="Calibri" w:hAnsi="Calibri"/>
-          <w:b w:val="0"/>
-          <w:color w:val="9C2F2F"/>
-          <w:sz w:val="21"/>
-        </w:rPr>
-        <w:t>Remove an existing 2.2.6 installation once before reinstalling. Version 0.5.0 sorts below 2.2.6 in semantic-version updaters.</w:t>
-      </w:r>
-    </w:p>
-    <w:p>
-      <w:pPr>
-        <w:shd w:fill="EEF1F5"/>
-        <w:spacing w:before="40" w:after="160"/>
-        <w:ind w:left="317" w:right="317"/>
-      </w:pPr>
-      <w:r>
-        <w:rPr>
-          <w:rFonts w:ascii="Consolas" w:hAnsi="Consolas"/>
-          <w:b w:val="0"/>
-          <w:color w:val="14213D"/>
-          <w:sz w:val="17"/>
-        </w:rPr>
-        <w:t>codex plugin remove ai-sloppy-copy@ai-sloppy-copy</w:t>
-      </w:r>
-    </w:p>
-    <w:p>
-      <w:pPr>
-        <w:shd w:fill="EEF1F5"/>
-        <w:spacing w:before="40" w:after="160"/>
-        <w:ind w:left="317" w:right="317"/>
-      </w:pPr>
-      <w:r>
-        <w:rPr>
-          <w:rFonts w:ascii="Consolas" w:hAnsi="Consolas"/>
-          <w:b w:val="0"/>
-          <w:color w:val="14213D"/>
-          <w:sz w:val="17"/>
-        </w:rPr>
-        <w:t>codex plugin marketplace upgrade ai-sloppy-copy</w:t>
-      </w:r>
-    </w:p>
-    <w:p>
-      <w:pPr>
-        <w:shd w:fill="EEF1F5"/>
-        <w:spacing w:before="40" w:after="160"/>
-        <w:ind w:left="317" w:right="317"/>
-      </w:pPr>
-      <w:r>
-        <w:rPr>
-          <w:rFonts w:ascii="Consolas" w:hAnsi="Consolas"/>
-          <w:b w:val="0"/>
-          <w:color w:val="14213D"/>
-          <w:sz w:val="17"/>
-        </w:rPr>
-        <w:t>codex plugin add ai-sloppy-copy@ai-sloppy-copy</w:t>
-      </w:r>
-    </w:p>
-    <w:p>
-      <w:pPr>
-        <w:shd w:fill="EEF1F5"/>
-        <w:spacing w:before="40" w:after="160"/>
-        <w:ind w:left="317" w:right="317"/>
-      </w:pPr>
-      <w:r>
-        <w:rPr>
-          <w:rFonts w:ascii="Consolas" w:hAnsi="Consolas"/>
-          <w:b w:val="0"/>
-          <w:color w:val="14213D"/>
-          <w:sz w:val="17"/>
-        </w:rPr>
-        <w:t>claude plugin uninstall ai-sloppy-copy@ai-sloppy-copy</w:t>
-      </w:r>
-    </w:p>
-    <w:p>
-      <w:pPr>
-        <w:shd w:fill="EEF1F5"/>
-        <w:spacing w:before="40" w:after="160"/>
-        <w:ind w:left="317" w:right="317"/>
-      </w:pPr>
-      <w:r>
-        <w:rPr>
-          <w:rFonts w:ascii="Consolas" w:hAnsi="Consolas"/>
-          <w:b w:val="0"/>
-          <w:color w:val="14213D"/>
-          <w:sz w:val="17"/>
-        </w:rPr>
-        <w:t>claude plugin marketplace update ai-sloppy-copy</w:t>
-      </w:r>
-    </w:p>
-    <w:p>
-      <w:pPr>
-        <w:shd w:fill="EEF1F5"/>
-        <w:spacing w:before="40" w:after="160"/>
-        <w:ind w:left="317" w:right="317"/>
-      </w:pPr>
-      <w:r>
-        <w:rPr>
-          <w:rFonts w:ascii="Consolas" w:hAnsi="Consolas"/>
-          <w:b w:val="0"/>
-          <w:color w:val="14213D"/>
-          <w:sz w:val="17"/>
-        </w:rPr>
-        <w:t>claude plugin install ai-sloppy-copy@ai-sloppy-copy --scope user</w:t>
-      </w:r>
-    </w:p>
-    <w:p>
-      <w:pPr>
-        <w:shd w:fill="EEF1F5"/>
-        <w:spacing w:before="40" w:after="160"/>
-        <w:ind w:left="317" w:right="317"/>
-      </w:pPr>
-      <w:r>
-        <w:rPr>
-          <w:rFonts w:ascii="Consolas" w:hAnsi="Consolas"/>
-          <w:b w:val="0"/>
-          <w:color w:val="14213D"/>
-          <w:sz w:val="17"/>
-        </w:rPr>
-        <w:t>codex plugin marketplace upgrade brand-voice-factory</w:t>
-      </w:r>
-    </w:p>
-    <w:p>
-      <w:pPr>
-        <w:shd w:fill="EEF1F5"/>
-        <w:spacing w:before="40" w:after="160"/>
-        <w:ind w:left="317" w:right="317"/>
-      </w:pPr>
-      <w:r>
-        <w:rPr>
-          <w:rFonts w:ascii="Consolas" w:hAnsi="Consolas"/>
-          <w:b w:val="0"/>
-          <w:color w:val="14213D"/>
-          <w:sz w:val="17"/>
-        </w:rPr>
-        <w:t>codex plugin add brand-voice-factory@brand-voice-factory</w:t>
-      </w:r>
-    </w:p>
-    <w:p>
-      <w:pPr>
-        <w:shd w:fill="EEF1F5"/>
-        <w:spacing w:before="40" w:after="160"/>
-        <w:ind w:left="317" w:right="317"/>
-      </w:pPr>
-      <w:r>
-        <w:rPr>
-          <w:rFonts w:ascii="Consolas" w:hAnsi="Consolas"/>
-          <w:b w:val="0"/>
-          <w:color w:val="14213D"/>
-          <w:sz w:val="17"/>
-        </w:rPr>
-        <w:t>claude plugin marketplace update brand-voice-factory</w:t>
-      </w:r>
-    </w:p>
-    <w:p>
-      <w:pPr>
-        <w:shd w:fill="EEF1F5"/>
-        <w:spacing w:before="40" w:after="160"/>
-        <w:ind w:left="317" w:right="317"/>
-      </w:pPr>
-      <w:r>
-        <w:rPr>
-          <w:rFonts w:ascii="Consolas" w:hAnsi="Consolas"/>
-          <w:b w:val="0"/>
-          <w:color w:val="14213D"/>
-          <w:sz w:val="17"/>
-        </w:rPr>
-        <w:t>claude plugin update brand-voice-factory@brand-voice-factory</w:t>
-      </w:r>
-    </w:p>
-    <w:p>
-      <w:pPr>
-        <w:shd w:fill="EEF1F5"/>
-        <w:spacing w:before="40" w:after="160"/>
-        <w:ind w:left="317" w:right="317"/>
-      </w:pPr>
-      <w:r>
-        <w:rPr>
-          <w:rFonts w:ascii="Consolas" w:hAnsi="Consolas"/>
-          <w:b w:val="0"/>
-          <w:color w:val="14213D"/>
-          <w:sz w:val="17"/>
-        </w:rPr>
-        <w:t>codex plugin marketplace upgrade crafty-carousels-skill</w:t>
-      </w:r>
-    </w:p>
-    <w:p>
-      <w:pPr>
-        <w:shd w:fill="EEF1F5"/>
-        <w:spacing w:before="40" w:after="160"/>
-        <w:ind w:left="317" w:right="317"/>
-      </w:pPr>
-      <w:r>
-        <w:rPr>
-          <w:rFonts w:ascii="Consolas" w:hAnsi="Consolas"/>
-          <w:b w:val="0"/>
-          <w:color w:val="14213D"/>
-          <w:sz w:val="17"/>
-        </w:rPr>
-        <w:t>codex plugin add crafty-carousels@crafty-carousels-skill</w:t>
-      </w:r>
-    </w:p>
-    <w:p>
-      <w:pPr>
-        <w:shd w:fill="EEF1F5"/>
-        <w:spacing w:before="40" w:after="160"/>
-        <w:ind w:left="317" w:right="317"/>
-      </w:pPr>
-      <w:r>
-        <w:rPr>
-          <w:rFonts w:ascii="Consolas" w:hAnsi="Consolas"/>
-          <w:b w:val="0"/>
-          <w:color w:val="14213D"/>
-          <w:sz w:val="17"/>
-        </w:rPr>
-        <w:t>claude plugin marketplace update crafty-carousels-skill</w:t>
-      </w:r>
-    </w:p>
-    <w:p>
-      <w:pPr>
-        <w:shd w:fill="EEF1F5"/>
-        <w:spacing w:before="40" w:after="160"/>
-        <w:ind w:left="317" w:right="317"/>
-      </w:pPr>
-      <w:r>
-        <w:rPr>
-          <w:rFonts w:ascii="Consolas" w:hAnsi="Consolas"/>
-          <w:b w:val="0"/>
-          <w:color w:val="14213D"/>
-          <w:sz w:val="17"/>
-        </w:rPr>
-        <w:t>claude plugin update crafty-carousels@crafty-carousels-skill</w:t>
       </w:r>
     </w:p>
     <w:p>
@@ -3842,38 +3198,6 @@
     </w:p>
     <w:p>
       <w:pPr>
-        <w:shd w:fill="EEF1F5"/>
-        <w:spacing w:before="40" w:after="160"/>
-        <w:ind w:left="317" w:right="317"/>
-      </w:pPr>
-      <w:r>
-        <w:rPr>
-          <w:rFonts w:ascii="Consolas" w:hAnsi="Consolas"/>
-          <w:b w:val="0"/>
-          <w:color w:val="14213D"/>
-          <w:sz w:val="17"/>
-        </w:rPr>
-        <w:t>claude plugin marketplace update codex-chief-of-staff</w:t>
-      </w:r>
-    </w:p>
-    <w:p>
-      <w:pPr>
-        <w:shd w:fill="EEF1F5"/>
-        <w:spacing w:before="40" w:after="160"/>
-        <w:ind w:left="317" w:right="317"/>
-      </w:pPr>
-      <w:r>
-        <w:rPr>
-          <w:rFonts w:ascii="Consolas" w:hAnsi="Consolas"/>
-          <w:b w:val="0"/>
-          <w:color w:val="14213D"/>
-          <w:sz w:val="17"/>
-        </w:rPr>
-        <w:t>claude plugin update chief-of-staff@codex-chief-of-staff</w:t>
-      </w:r>
-    </w:p>
-    <w:p>
-      <w:pPr>
         <w:pStyle w:val="ListBullet"/>
       </w:pPr>
       <w:r>
@@ -3893,7 +3217,7 @@
         <w:pStyle w:val="ListBullet"/>
       </w:pPr>
       <w:r>
-        <w:t>Restart Codex or run Claude Code /reload-plugins, then repeat the fresh-session acceptance prompts.</w:t>
+        <w:t>Restart the ChatGPT desktop app, then repeat the fresh-task acceptance prompts.</w:t>
       </w:r>
     </w:p>
     <w:p>
@@ -3942,38 +3266,6 @@
           <w:sz w:val="17"/>
         </w:rPr>
         <w:t>codex plugin marketplace remove codex-chief-of-staff</w:t>
-      </w:r>
-    </w:p>
-    <w:p>
-      <w:pPr>
-        <w:shd w:fill="EEF1F5"/>
-        <w:spacing w:before="40" w:after="160"/>
-        <w:ind w:left="317" w:right="317"/>
-      </w:pPr>
-      <w:r>
-        <w:rPr>
-          <w:rFonts w:ascii="Consolas" w:hAnsi="Consolas"/>
-          <w:b w:val="0"/>
-          <w:color w:val="14213D"/>
-          <w:sz w:val="17"/>
-        </w:rPr>
-        <w:t>claude plugin uninstall chief-of-staff@codex-chief-of-staff</w:t>
-      </w:r>
-    </w:p>
-    <w:p>
-      <w:pPr>
-        <w:shd w:fill="EEF1F5"/>
-        <w:spacing w:before="40" w:after="160"/>
-        <w:ind w:left="317" w:right="317"/>
-      </w:pPr>
-      <w:r>
-        <w:rPr>
-          <w:rFonts w:ascii="Consolas" w:hAnsi="Consolas"/>
-          <w:b w:val="0"/>
-          <w:color w:val="14213D"/>
-          <w:sz w:val="17"/>
-        </w:rPr>
-        <w:t>claude plugin marketplace remove codex-chief-of-staff</w:t>
       </w:r>
     </w:p>
     <w:p>
@@ -4012,6 +3304,7 @@
       <w:tr>
         <w:trPr>
           <w:tblHeader w:val="true"/>
+          <w:cantSplit/>
         </w:trPr>
         <w:tc>
           <w:tcPr>
@@ -4096,6 +3389,9 @@
         </w:tc>
       </w:tr>
       <w:tr>
+        <w:trPr>
+          <w:cantSplit/>
+        </w:trPr>
         <w:tc>
           <w:tcPr>
             <w:tcW w:type="dxa" w:w="3200"/>
@@ -4144,7 +3440,7 @@
                 <w:color w:val="000000"/>
                 <w:sz w:val="19"/>
               </w:rPr>
-              <w:t>2.0.1</w:t>
+              <w:t>2.1.0</w:t>
             </w:r>
           </w:p>
         </w:tc>
@@ -4176,6 +3472,9 @@
         </w:tc>
       </w:tr>
       <w:tr>
+        <w:trPr>
+          <w:cantSplit/>
+        </w:trPr>
         <w:tc>
           <w:tcPr>
             <w:tcW w:type="dxa" w:w="3200"/>
@@ -4256,6 +3555,9 @@
         </w:tc>
       </w:tr>
       <w:tr>
+        <w:trPr>
+          <w:cantSplit/>
+        </w:trPr>
         <w:tc>
           <w:tcPr>
             <w:tcW w:type="dxa" w:w="3200"/>
@@ -4336,6 +3638,9 @@
         </w:tc>
       </w:tr>
       <w:tr>
+        <w:trPr>
+          <w:cantSplit/>
+        </w:trPr>
         <w:tc>
           <w:tcPr>
             <w:tcW w:type="dxa" w:w="3200"/>
@@ -4415,86 +3720,6 @@
           </w:p>
         </w:tc>
       </w:tr>
-      <w:tr>
-        <w:tc>
-          <w:tcPr>
-            <w:tcW w:type="dxa" w:w="3200"/>
-            <w:vAlign w:val="center"/>
-            <w:tcMar>
-              <w:top w:w="100" w:type="dxa"/>
-              <w:start w:w="120" w:type="dxa"/>
-              <w:bottom w:w="100" w:type="dxa"/>
-              <w:end w:w="120" w:type="dxa"/>
-            </w:tcMar>
-          </w:tcPr>
-          <w:p>
-            <w:pPr>
-              <w:spacing w:after="0" w:line="252" w:lineRule="auto"/>
-            </w:pPr>
-            <w:r>
-              <w:rPr>
-                <w:rFonts w:ascii="Calibri" w:hAnsi="Calibri"/>
-                <w:b w:val="0"/>
-                <w:color w:val="000000"/>
-                <w:sz w:val="19"/>
-              </w:rPr>
-              <w:t>Ponytail</w:t>
-            </w:r>
-          </w:p>
-        </w:tc>
-        <w:tc>
-          <w:tcPr>
-            <w:tcW w:type="dxa" w:w="2500"/>
-            <w:vAlign w:val="center"/>
-            <w:tcMar>
-              <w:top w:w="100" w:type="dxa"/>
-              <w:start w:w="120" w:type="dxa"/>
-              <w:bottom w:w="100" w:type="dxa"/>
-              <w:end w:w="120" w:type="dxa"/>
-            </w:tcMar>
-          </w:tcPr>
-          <w:p>
-            <w:pPr>
-              <w:spacing w:after="0" w:line="252" w:lineRule="auto"/>
-            </w:pPr>
-            <w:r>
-              <w:rPr>
-                <w:rFonts w:ascii="Calibri" w:hAnsi="Calibri"/>
-                <w:b w:val="0"/>
-                <w:color w:val="000000"/>
-                <w:sz w:val="19"/>
-              </w:rPr>
-              <w:t>4.8.4</w:t>
-            </w:r>
-          </w:p>
-        </w:tc>
-        <w:tc>
-          <w:tcPr>
-            <w:tcW w:type="dxa" w:w="3660"/>
-            <w:vAlign w:val="center"/>
-            <w:tcMar>
-              <w:top w:w="100" w:type="dxa"/>
-              <w:start w:w="120" w:type="dxa"/>
-              <w:bottom w:w="100" w:type="dxa"/>
-              <w:end w:w="120" w:type="dxa"/>
-            </w:tcMar>
-          </w:tcPr>
-          <w:p>
-            <w:pPr>
-              <w:spacing w:after="0" w:line="252" w:lineRule="auto"/>
-            </w:pPr>
-            <w:r>
-              <w:rPr>
-                <w:rFonts w:ascii="Calibri" w:hAnsi="Calibri"/>
-                <w:b w:val="0"/>
-                <w:color w:val="000000"/>
-                <w:sz w:val="19"/>
-              </w:rPr>
-              <w:t>None</w:t>
-            </w:r>
-          </w:p>
-        </w:tc>
-      </w:tr>
     </w:tbl>
     <w:p>
       <w:pPr>
@@ -4502,13 +3727,17 @@
       </w:pPr>
     </w:p>
     <w:p>
+      <w:pPr>
+        <w:spacing w:after="240"/>
+      </w:pPr>
       <w:r>
-        <w:t>Each product uses one three-part version for its GitHub release and tag. The ZIP and both host manifests use that same number. AI Sloppy Copy also carries a separately versioned writing-rules contract.</w:t>
+        <w:t>Each product uses one three-part version for its GitHub release and tag. The ZIP and both the portable and OpenAI manifests use that same number. AI Sloppy Copy also carries a separately versioned writing-rules contract.</w:t>
       </w:r>
     </w:p>
     <w:p>
       <w:pPr>
         <w:pStyle w:val="Heading2"/>
+        <w:pageBreakBefore/>
       </w:pPr>
       <w:r>
         <w:t>Troubleshooting</w:t>
@@ -4536,6 +3765,7 @@
       <w:tr>
         <w:trPr>
           <w:tblHeader w:val="true"/>
+          <w:cantSplit/>
         </w:trPr>
         <w:tc>
           <w:tcPr>
@@ -4593,6 +3823,9 @@
         </w:tc>
       </w:tr>
       <w:tr>
+        <w:trPr>
+          <w:cantSplit/>
+        </w:trPr>
         <w:tc>
           <w:tcPr>
             <w:tcW w:type="dxa" w:w="2880"/>
@@ -4641,12 +3874,15 @@
                 <w:color w:val="000000"/>
                 <w:sz w:val="19"/>
               </w:rPr>
-              <w:t>Restart Codex or run Claude Code /reload-plugins, review /hooks, then start fresh.</w:t>
+              <w:t>Restart the ChatGPT desktop app, review Codex hooks, then start a fresh task.</w:t>
             </w:r>
           </w:p>
         </w:tc>
       </w:tr>
       <w:tr>
+        <w:trPr>
+          <w:cantSplit/>
+        </w:trPr>
         <w:tc>
           <w:tcPr>
             <w:tcW w:type="dxa" w:w="2880"/>
@@ -4701,6 +3937,9 @@
         </w:tc>
       </w:tr>
       <w:tr>
+        <w:trPr>
+          <w:cantSplit/>
+        </w:trPr>
         <w:tc>
           <w:tcPr>
             <w:tcW w:type="dxa" w:w="2880"/>
@@ -4755,6 +3994,9 @@
         </w:tc>
       </w:tr>
       <w:tr>
+        <w:trPr>
+          <w:cantSplit/>
+        </w:trPr>
         <w:tc>
           <w:tcPr>
             <w:tcW w:type="dxa" w:w="2880"/>
@@ -4809,6 +4051,9 @@
         </w:tc>
       </w:tr>
       <w:tr>
+        <w:trPr>
+          <w:cantSplit/>
+        </w:trPr>
         <w:tc>
           <w:tcPr>
             <w:tcW w:type="dxa" w:w="2880"/>
@@ -4863,6 +4108,9 @@
         </w:tc>
       </w:tr>
       <w:tr>
+        <w:trPr>
+          <w:cantSplit/>
+        </w:trPr>
         <w:tc>
           <w:tcPr>
             <w:tcW w:type="dxa" w:w="2880"/>
@@ -4924,9 +4172,7 @@
     </w:p>
     <w:sectPr>
       <w:headerReference w:type="default" r:id="rId9"/>
-      <w:headerReference w:type="even" r:id="rId10"/>
-      <w:footerReference w:type="default" r:id="rId11"/>
-      <w:footerReference w:type="even" r:id="rId12"/>
+      <w:footerReference w:type="default" r:id="rId10"/>
       <w:pgSz w:w="12240" w:h="15840"/>
       <w:pgMar w:top="1440" w:right="1440" w:bottom="1440" w:left="1440" w:header="504" w:footer="504" w:gutter="0"/>
       <w:cols w:space="720"/>
@@ -4943,36 +4189,6 @@
       <w:pStyle w:val="Footer"/>
       <w:jc w:val="right"/>
     </w:pPr>
-    <w:r>
-      <w:rPr>
-        <w:rFonts w:ascii="Calibri" w:hAnsi="Calibri"/>
-        <w:b w:val="0"/>
-        <w:color w:val="5B6472"/>
-        <w:sz w:val="16"/>
-      </w:rPr>
-      <w:t xml:space="preserve">v2.0.1   /   </w:t>
-    </w:r>
-    <w:fldSimple w:instr="PAGE"/>
-  </w:p>
-</w:ftr>
-</file>
-
-<file path=word/footer2.xml><?xml version="1.0" encoding="utf-8"?>
-<w:ftr xmlns:m="http://schemas.openxmlformats.org/officeDocument/2006/math" xmlns:mc="http://schemas.openxmlformats.org/markup-compatibility/2006" xmlns:mo="http://schemas.microsoft.com/office/mac/office/2008/main" xmlns:mv="urn:schemas-microsoft-com:mac:vml" xmlns:o="urn:schemas-microsoft-com:office:office" xmlns:r="http://schemas.openxmlformats.org/officeDocument/2006/relationships" xmlns:v="urn:schemas-microsoft-com:vml" xmlns:w10="urn:schemas-microsoft-com:office:word" xmlns:w14="http://schemas.microsoft.com/office/word/2010/wordml" xmlns:w="http://schemas.openxmlformats.org/wordprocessingml/2006/main" xmlns:wne="http://schemas.microsoft.com/office/word/2006/wordml" xmlns:wp14="http://schemas.microsoft.com/office/word/2010/wordprocessingDrawing" xmlns:wp="http://schemas.openxmlformats.org/drawingml/2006/wordprocessingDrawing" xmlns:wpc="http://schemas.microsoft.com/office/word/2010/wordprocessingCanvas" xmlns:wpg="http://schemas.microsoft.com/office/word/2010/wordprocessingGroup" xmlns:wpi="http://schemas.microsoft.com/office/word/2010/wordprocessingInk" xmlns:wps="http://schemas.microsoft.com/office/word/2010/wordprocessingShape" mc:Ignorable="w14 wp14">
-  <w:p>
-    <w:pPr>
-      <w:pStyle w:val="Footer"/>
-      <w:jc w:val="right"/>
-    </w:pPr>
-    <w:r>
-      <w:rPr>
-        <w:rFonts w:ascii="Calibri" w:hAnsi="Calibri"/>
-        <w:b w:val="0"/>
-        <w:color w:val="5B6472"/>
-        <w:sz w:val="16"/>
-      </w:rPr>
-      <w:t xml:space="preserve">v2.0.1   /   </w:t>
-    </w:r>
     <w:fldSimple w:instr="PAGE"/>
   </w:p>
 </w:ftr>
@@ -4992,27 +4208,7 @@
         <w:color w:val="5B6472"/>
         <w:sz w:val="16"/>
       </w:rPr>
-      <w:t>CHIEF OF STAFF  /  CODEX + CLAUDE CODE  /  INSTALLATION AND OPERATING SOP</w:t>
-    </w:r>
-  </w:p>
-</w:hdr>
-</file>
-
-<file path=word/header2.xml><?xml version="1.0" encoding="utf-8"?>
-<w:hdr xmlns:m="http://schemas.openxmlformats.org/officeDocument/2006/math" xmlns:mc="http://schemas.openxmlformats.org/markup-compatibility/2006" xmlns:mo="http://schemas.microsoft.com/office/mac/office/2008/main" xmlns:mv="urn:schemas-microsoft-com:mac:vml" xmlns:o="urn:schemas-microsoft-com:office:office" xmlns:r="http://schemas.openxmlformats.org/officeDocument/2006/relationships" xmlns:v="urn:schemas-microsoft-com:vml" xmlns:w10="urn:schemas-microsoft-com:office:word" xmlns:w14="http://schemas.microsoft.com/office/word/2010/wordml" xmlns:w="http://schemas.openxmlformats.org/wordprocessingml/2006/main" xmlns:wne="http://schemas.microsoft.com/office/word/2006/wordml" xmlns:wp14="http://schemas.microsoft.com/office/word/2010/wordprocessingDrawing" xmlns:wp="http://schemas.openxmlformats.org/drawingml/2006/wordprocessingDrawing" xmlns:wpc="http://schemas.microsoft.com/office/word/2010/wordprocessingCanvas" xmlns:wpg="http://schemas.microsoft.com/office/word/2010/wordprocessingGroup" xmlns:wpi="http://schemas.microsoft.com/office/word/2010/wordprocessingInk" xmlns:wps="http://schemas.microsoft.com/office/word/2010/wordprocessingShape" mc:Ignorable="w14 wp14">
-  <w:p>
-    <w:pPr>
-      <w:pStyle w:val="Header"/>
-      <w:jc w:val="left"/>
-    </w:pPr>
-    <w:r>
-      <w:rPr>
-        <w:rFonts w:ascii="Calibri" w:hAnsi="Calibri"/>
-        <w:b/>
-        <w:color w:val="5B6472"/>
-        <w:sz w:val="16"/>
-      </w:rPr>
-      <w:t>CHIEF OF STAFF  /  CODEX + CLAUDE CODE  /  INSTALLATION AND OPERATING SOP</w:t>
+      <w:t>CHIEF OF STAFF  /  CHATGPT WORK + CODEX  /  INSTALLATION AND OPERATING SOP</w:t>
     </w:r>
   </w:p>
 </w:hdr>

</xml_diff>

<commit_message>
Release Chief v2.1.1 easy install
</commit_message>
<xml_diff>
--- a/docs/Codex Chief of Staff - Installation and SOP.docx
+++ b/docs/Codex Chief of Staff - Installation and SOP.docx
@@ -233,7 +233,7 @@
                 <w:color w:val="000000"/>
                 <w:sz w:val="19"/>
               </w:rPr>
-              <w:t>2.1.0</w:t>
+              <w:t>2.1.1</w:t>
             </w:r>
           </w:p>
         </w:tc>
@@ -285,7 +285,7 @@
                 <w:color w:val="000000"/>
                 <w:sz w:val="19"/>
               </w:rPr>
-              <w:t>OpenAI plugin directory</w:t>
+              <w:t>GitHub marketplace; OpenAI review pending</w:t>
             </w:r>
           </w:p>
         </w:tc>
@@ -428,47 +428,210 @@
         <w:pStyle w:val="Heading2"/>
       </w:pPr>
       <w:r>
-        <w:t>Requirements</w:t>
+        <w:t>Teammate quick start</w:t>
       </w:r>
     </w:p>
     <w:p>
       <w:pPr>
-        <w:pStyle w:val="ListBullet"/>
+        <w:pStyle w:val="ListNumber"/>
+        <w:numPr>
+          <w:ilvl w:val="0"/>
+          <w:numId w:val="10"/>
+        </w:numPr>
+        <w:keepNext w:val="0"/>
+        <w:spacing w:after="60" w:line="288" w:lineRule="auto"/>
       </w:pPr>
       <w:r>
-        <w:t>ChatGPT Work or Codex with plugin support.</w:t>
+        <w:t>Open ChatGPT and switch to Work.</w:t>
       </w:r>
     </w:p>
     <w:p>
       <w:pPr>
-        <w:pStyle w:val="ListBullet"/>
+        <w:pStyle w:val="ListNumber"/>
+        <w:numPr>
+          <w:ilvl w:val="0"/>
+          <w:numId w:val="10"/>
+        </w:numPr>
+        <w:keepNext w:val="0"/>
+        <w:spacing w:after="60" w:line="288" w:lineRule="auto"/>
       </w:pPr>
       <w:r>
-        <w:t>Git for GitHub marketplace installation.</w:t>
+        <w:t>Open Plugins and search for Chief of Staff.</w:t>
       </w:r>
     </w:p>
     <w:p>
       <w:pPr>
-        <w:pStyle w:val="ListBullet"/>
+        <w:pStyle w:val="ListNumber"/>
+        <w:numPr>
+          <w:ilvl w:val="0"/>
+          <w:numId w:val="10"/>
+        </w:numPr>
+        <w:keepNext w:val="0"/>
+        <w:spacing w:after="60" w:line="288" w:lineRule="auto"/>
       </w:pPr>
       <w:r>
-        <w:t>Node.js 18 or later for Chief of Staff hooks.</w:t>
+        <w:t>Select + to install it.</w:t>
       </w:r>
     </w:p>
     <w:p>
       <w:pPr>
-        <w:pStyle w:val="ListBullet"/>
+        <w:pStyle w:val="ListNumber"/>
+        <w:numPr>
+          <w:ilvl w:val="0"/>
+          <w:numId w:val="10"/>
+        </w:numPr>
+        <w:keepNext w:val="0"/>
+        <w:spacing w:after="60" w:line="288" w:lineRule="auto"/>
       </w:pPr>
       <w:r>
-        <w:t>Python 3.11 or later for configuration, content libraries, copy validation, and release checks.</w:t>
+        <w:t>Start a new chat and ask for the finished work normally.</w:t>
       </w:r>
     </w:p>
     <w:p>
       <w:pPr>
+        <w:pBdr>
+          <w:left w:val="single" w:sz="18" w:space="8" w:color="2A9D8F"/>
+        </w:pBdr>
+        <w:shd w:fill="E8F4F2"/>
+        <w:spacing w:before="80" w:after="160"/>
+        <w:ind w:left="115" w:right="115"/>
+      </w:pPr>
+      <w:r>
+        <w:rPr>
+          <w:rFonts w:ascii="Calibri" w:hAnsi="Calibri"/>
+          <w:b/>
+          <w:color w:val="14213D"/>
+          <w:sz w:val="21"/>
+        </w:rPr>
+        <w:t xml:space="preserve">That is the whole teammate procedure: </w:t>
+      </w:r>
+      <w:r>
+        <w:rPr>
+          <w:rFonts w:ascii="Calibri" w:hAnsi="Calibri"/>
+          <w:b w:val="0"/>
+          <w:color w:val="14213D"/>
+          <w:sz w:val="21"/>
+        </w:rPr>
+        <w:t>No terminal or Git is required. Teammates do not need Python, plugin names or specialist selection. Do not install AI Sloppy Copy separately. Brand Voice Factory and Crafty Carousels are already inside Chief.</w:t>
+      </w:r>
+    </w:p>
+    <w:p>
+      <w:pPr>
         <w:pStyle w:val="Heading2"/>
       </w:pPr>
       <w:r>
-        <w:t>Codex</w:t>
+        <w:t>Workspace admin</w:t>
+      </w:r>
+    </w:p>
+    <w:p>
+      <w:pPr>
+        <w:pStyle w:val="ListNumber"/>
+        <w:numPr>
+          <w:ilvl w:val="0"/>
+          <w:numId w:val="11"/>
+        </w:numPr>
+        <w:keepNext w:val="0"/>
+        <w:spacing w:after="60" w:line="288" w:lineRule="auto"/>
+      </w:pPr>
+      <w:r>
+        <w:t>Open Workspace settings and select Plugins.</w:t>
+      </w:r>
+    </w:p>
+    <w:p>
+      <w:pPr>
+        <w:pStyle w:val="ListNumber"/>
+        <w:numPr>
+          <w:ilvl w:val="0"/>
+          <w:numId w:val="11"/>
+        </w:numPr>
+        <w:keepNext w:val="0"/>
+        <w:spacing w:after="60" w:line="288" w:lineRule="auto"/>
+      </w:pPr>
+      <w:r>
+        <w:t>Select Chief of Staff.</w:t>
+      </w:r>
+    </w:p>
+    <w:p>
+      <w:pPr>
+        <w:pStyle w:val="ListNumber"/>
+        <w:numPr>
+          <w:ilvl w:val="0"/>
+          <w:numId w:val="11"/>
+        </w:numPr>
+        <w:keepNext w:val="0"/>
+        <w:spacing w:after="60" w:line="288" w:lineRule="auto"/>
+      </w:pPr>
+      <w:r>
+        <w:t>Set the installation policy to Installed for the required roles.</w:t>
+      </w:r>
+    </w:p>
+    <w:p>
+      <w:pPr>
+        <w:pStyle w:val="ListNumber"/>
+        <w:numPr>
+          <w:ilvl w:val="0"/>
+          <w:numId w:val="11"/>
+        </w:numPr>
+        <w:keepNext w:val="0"/>
+        <w:spacing w:after="60" w:line="288" w:lineRule="auto"/>
+      </w:pPr>
+      <w:r>
+        <w:t>Run one low-risk test from a member account.</w:t>
+      </w:r>
+    </w:p>
+    <w:p>
+      <w:pPr>
+        <w:pStyle w:val="ListNumber"/>
+        <w:numPr>
+          <w:ilvl w:val="0"/>
+          <w:numId w:val="11"/>
+        </w:numPr>
+        <w:keepNext w:val="0"/>
+        <w:spacing w:after="60" w:line="288" w:lineRule="auto"/>
+      </w:pPr>
+      <w:r>
+        <w:t>Tell the team to start a new Work chat and ask Chief normally.</w:t>
+      </w:r>
+    </w:p>
+    <w:p>
+      <w:pPr>
+        <w:pBdr>
+          <w:left w:val="single" w:sz="18" w:space="8" w:color="9C2F2F"/>
+        </w:pBdr>
+        <w:shd w:fill="FBECEC"/>
+        <w:spacing w:before="80" w:after="160"/>
+        <w:ind w:left="115" w:right="115"/>
+      </w:pPr>
+      <w:r>
+        <w:rPr>
+          <w:rFonts w:ascii="Calibri" w:hAnsi="Calibri"/>
+          <w:b/>
+          <w:color w:val="9C2F2F"/>
+          <w:sz w:val="21"/>
+        </w:rPr>
+        <w:t xml:space="preserve">Current status: </w:t>
+      </w:r>
+      <w:r>
+        <w:rPr>
+          <w:rFonts w:ascii="Calibri" w:hAnsi="Calibri"/>
+          <w:b w:val="0"/>
+          <w:color w:val="9C2F2F"/>
+          <w:sz w:val="21"/>
+        </w:rPr>
+        <w:t>Chief is available through its GitHub-backed marketplace. The public four-step store flow is not active yet. The publisher must submit Chief and wait for OpenAI approval. After approval, the publisher must select Publish. Until then, do not claim that Chief is publicly searchable.</w:t>
+      </w:r>
+    </w:p>
+    <w:p>
+      <w:pPr>
+        <w:pStyle w:val="Heading2"/>
+      </w:pPr>
+      <w:r>
+        <w:t>Admin and Codex fallback</w:t>
+      </w:r>
+    </w:p>
+    <w:p>
+      <w:r>
+        <w:t>This fallback is for administrators. Developers may also use it for direct testing or an offline installation. Git is required. Node.js 18 or later is needed for hooks. Python 3.11 or later is needed for configuration validation.</w:t>
       </w:r>
     </w:p>
     <w:p>
@@ -539,7 +702,7 @@
         <w:pStyle w:val="ListNumber"/>
         <w:numPr>
           <w:ilvl w:val="0"/>
-          <w:numId w:val="10"/>
+          <w:numId w:val="12"/>
         </w:numPr>
         <w:keepNext w:val="0"/>
         <w:spacing w:after="60" w:line="288" w:lineRule="auto"/>
@@ -553,7 +716,7 @@
         <w:pStyle w:val="ListNumber"/>
         <w:numPr>
           <w:ilvl w:val="0"/>
-          <w:numId w:val="10"/>
+          <w:numId w:val="12"/>
         </w:numPr>
         <w:keepNext w:val="0"/>
         <w:spacing w:after="60" w:line="288" w:lineRule="auto"/>
@@ -567,7 +730,7 @@
         <w:pStyle w:val="ListNumber"/>
         <w:numPr>
           <w:ilvl w:val="0"/>
-          <w:numId w:val="10"/>
+          <w:numId w:val="12"/>
         </w:numPr>
         <w:keepNext w:val="0"/>
         <w:spacing w:after="60" w:line="288" w:lineRule="auto"/>
@@ -581,7 +744,7 @@
         <w:pStyle w:val="ListNumber"/>
         <w:numPr>
           <w:ilvl w:val="0"/>
-          <w:numId w:val="10"/>
+          <w:numId w:val="12"/>
         </w:numPr>
         <w:keepNext w:val="0"/>
         <w:spacing w:after="60" w:line="288" w:lineRule="auto"/>
@@ -595,7 +758,7 @@
         <w:pStyle w:val="ListNumber"/>
         <w:numPr>
           <w:ilvl w:val="0"/>
-          <w:numId w:val="10"/>
+          <w:numId w:val="12"/>
         </w:numPr>
         <w:keepNext w:val="0"/>
         <w:spacing w:after="60" w:line="288" w:lineRule="auto"/>
@@ -659,71 +822,6 @@
     <w:p>
       <w:pPr>
         <w:pStyle w:val="Heading2"/>
-        <w:pageBreakBefore/>
-      </w:pPr>
-      <w:r>
-        <w:t>ChatGPT Work</w:t>
-      </w:r>
-    </w:p>
-    <w:p>
-      <w:pPr>
-        <w:pStyle w:val="ListNumber"/>
-        <w:numPr>
-          <w:ilvl w:val="0"/>
-          <w:numId w:val="11"/>
-        </w:numPr>
-        <w:keepNext w:val="0"/>
-        <w:spacing w:after="60" w:line="288" w:lineRule="auto"/>
-      </w:pPr>
-      <w:r>
-        <w:t>Make Chief of Staff available to the required roles in workspace plugin controls.</w:t>
-      </w:r>
-    </w:p>
-    <w:p>
-      <w:pPr>
-        <w:pStyle w:val="ListNumber"/>
-        <w:numPr>
-          <w:ilvl w:val="0"/>
-          <w:numId w:val="11"/>
-        </w:numPr>
-        <w:keepNext w:val="0"/>
-        <w:spacing w:after="60" w:line="288" w:lineRule="auto"/>
-      </w:pPr>
-      <w:r>
-        <w:t>Install Chief of Staff from the Plugin Directory.</w:t>
-      </w:r>
-    </w:p>
-    <w:p>
-      <w:pPr>
-        <w:pStyle w:val="ListNumber"/>
-        <w:numPr>
-          <w:ilvl w:val="0"/>
-          <w:numId w:val="11"/>
-        </w:numPr>
-        <w:keepNext w:val="0"/>
-        <w:spacing w:after="60" w:line="288" w:lineRule="auto"/>
-      </w:pPr>
-      <w:r>
-        <w:t>Grant only the approved apps, files and permissions.</w:t>
-      </w:r>
-    </w:p>
-    <w:p>
-      <w:pPr>
-        <w:pStyle w:val="ListNumber"/>
-        <w:numPr>
-          <w:ilvl w:val="0"/>
-          <w:numId w:val="11"/>
-        </w:numPr>
-        <w:keepNext w:val="0"/>
-        <w:spacing w:after="60" w:line="288" w:lineRule="auto"/>
-      </w:pPr>
-      <w:r>
-        <w:t>Start a fresh ChatGPT Work task and run the acceptance prompts.</w:t>
-      </w:r>
-    </w:p>
-    <w:p>
-      <w:pPr>
-        <w:pStyle w:val="Heading2"/>
       </w:pPr>
       <w:r>
         <w:t>Local and team deployment</w:t>
@@ -731,7 +829,7 @@
     </w:p>
     <w:p>
       <w:r>
-        <w:t>The Codex installers add or update Chief from the configured marketplace. ChatGPT workspace admins control availability and installation for team roles. Team members open ChatGPT Work and ask Chief normally; they do not select specialist workflows.</w:t>
+        <w:t>The Codex fallback installs or updates Chief from the configured marketplace. After public-directory approval, ChatGPT workspace admins control automatic installation for team roles. Team members open ChatGPT Work and ask Chief normally; they do not select specialist workflows.</w:t>
       </w:r>
     </w:p>
     <w:p>
@@ -1331,7 +1429,7 @@
         <w:pStyle w:val="ListNumber"/>
         <w:numPr>
           <w:ilvl w:val="0"/>
-          <w:numId w:val="12"/>
+          <w:numId w:val="13"/>
         </w:numPr>
         <w:keepNext w:val="0"/>
         <w:spacing w:after="60" w:line="288" w:lineRule="auto"/>
@@ -1345,7 +1443,7 @@
         <w:pStyle w:val="ListNumber"/>
         <w:numPr>
           <w:ilvl w:val="0"/>
-          <w:numId w:val="12"/>
+          <w:numId w:val="13"/>
         </w:numPr>
         <w:keepNext w:val="0"/>
         <w:spacing w:after="60" w:line="288" w:lineRule="auto"/>
@@ -1359,7 +1457,7 @@
         <w:pStyle w:val="ListNumber"/>
         <w:numPr>
           <w:ilvl w:val="0"/>
-          <w:numId w:val="12"/>
+          <w:numId w:val="13"/>
         </w:numPr>
         <w:keepNext w:val="0"/>
         <w:spacing w:after="60" w:line="288" w:lineRule="auto"/>
@@ -1373,7 +1471,7 @@
         <w:pStyle w:val="ListNumber"/>
         <w:numPr>
           <w:ilvl w:val="0"/>
-          <w:numId w:val="12"/>
+          <w:numId w:val="13"/>
         </w:numPr>
         <w:keepNext w:val="0"/>
         <w:spacing w:after="60" w:line="288" w:lineRule="auto"/>
@@ -1387,7 +1485,7 @@
         <w:pStyle w:val="ListNumber"/>
         <w:numPr>
           <w:ilvl w:val="0"/>
-          <w:numId w:val="12"/>
+          <w:numId w:val="13"/>
         </w:numPr>
         <w:keepNext w:val="0"/>
         <w:spacing w:after="60" w:line="288" w:lineRule="auto"/>
@@ -1401,7 +1499,7 @@
         <w:pStyle w:val="ListNumber"/>
         <w:numPr>
           <w:ilvl w:val="0"/>
-          <w:numId w:val="12"/>
+          <w:numId w:val="13"/>
         </w:numPr>
         <w:keepNext w:val="0"/>
         <w:spacing w:after="60" w:line="288" w:lineRule="auto"/>
@@ -1415,7 +1513,7 @@
         <w:pStyle w:val="ListNumber"/>
         <w:numPr>
           <w:ilvl w:val="0"/>
-          <w:numId w:val="12"/>
+          <w:numId w:val="13"/>
         </w:numPr>
         <w:keepNext w:val="0"/>
         <w:spacing w:after="60" w:line="288" w:lineRule="auto"/>
@@ -1429,7 +1527,7 @@
         <w:pStyle w:val="ListNumber"/>
         <w:numPr>
           <w:ilvl w:val="0"/>
-          <w:numId w:val="12"/>
+          <w:numId w:val="13"/>
         </w:numPr>
         <w:keepNext w:val="0"/>
         <w:spacing w:after="60" w:line="288" w:lineRule="auto"/>
@@ -1624,7 +1722,7 @@
         <w:pStyle w:val="ListNumber"/>
         <w:numPr>
           <w:ilvl w:val="0"/>
-          <w:numId w:val="13"/>
+          <w:numId w:val="14"/>
         </w:numPr>
         <w:keepNext w:val="0"/>
         <w:spacing w:after="60" w:line="288" w:lineRule="auto"/>
@@ -1638,7 +1736,7 @@
         <w:pStyle w:val="ListNumber"/>
         <w:numPr>
           <w:ilvl w:val="0"/>
-          <w:numId w:val="13"/>
+          <w:numId w:val="14"/>
         </w:numPr>
         <w:keepNext w:val="0"/>
         <w:spacing w:after="60" w:line="288" w:lineRule="auto"/>
@@ -1652,7 +1750,7 @@
         <w:pStyle w:val="ListNumber"/>
         <w:numPr>
           <w:ilvl w:val="0"/>
-          <w:numId w:val="13"/>
+          <w:numId w:val="14"/>
         </w:numPr>
         <w:keepNext w:val="0"/>
         <w:spacing w:after="60" w:line="288" w:lineRule="auto"/>
@@ -1666,7 +1764,7 @@
         <w:pStyle w:val="ListNumber"/>
         <w:numPr>
           <w:ilvl w:val="0"/>
-          <w:numId w:val="13"/>
+          <w:numId w:val="14"/>
         </w:numPr>
         <w:keepNext w:val="0"/>
         <w:spacing w:after="60" w:line="288" w:lineRule="auto"/>
@@ -3117,7 +3215,7 @@
     </w:p>
     <w:p>
       <w:r>
-        <w:t>Run the fifteen prompts in persona/persona-contract.json in fresh Codex and ChatGPT Work tasks with GPT-5.6 Sol Medium. Generate the host prompt with scripts/live_acceptance_harness.py. For ChatGPT Work, the owner verifies the Work UI, Work locally and Ask for approval; record the underlying runtime separately because it may report Codex. For Codex, require the built-in read-only permission profile. Run responses inline; any task creation, delegation, file mutation, connector call, external action, or host substitution invalidates the run. Terra XHigh is owner-waived for this release to conserve the reset token budget. Static validation proves the contract exists; it cannot honestly grade a live model response.</w:t>
+        <w:t>Run the fifteen prompts in persona/persona-contract.json in fresh Codex and ChatGPT Work tasks with GPT-5.6 Sol Medium. Generate the host prompt with scripts/live_acceptance_harness.py. For ChatGPT Work, the owner verifies the Work UI, Work locally and Ask for approval; record the underlying runtime separately because it may report Codex. For Codex, require the built-in read-only permission profile. Run responses inline. Any task creation or delegation invalidates the run. A file mutation also invalidates it. The same rule applies to a connector call, external action or host substitution. Terra XHigh is owner-waived for this release to conserve the reset token budget. Static validation proves the contract exists; it cannot honestly grade a live model response.</w:t>
       </w:r>
     </w:p>
     <w:p>
@@ -3145,7 +3243,7 @@
           <w:color w:val="14213D"/>
           <w:sz w:val="21"/>
         </w:rPr>
-        <w:t>static, host and installed-runtime checks pass. Sol or Terra may be waived only while pending; failures cannot. v2.1.0 evidence must be fresh because model-facing inputs changed. Connector identities and scope must match.</w:t>
+        <w:t>static, host and installed-runtime checks pass. Sol or Terra may be waived only while pending; failures cannot. Releases that change model-facing behavior require fresh evidence. A documentation-only patch may carry forward prior host evidence only when the unchanged behavior and source release are recorded. Connector identities and scope must match.</w:t>
       </w:r>
     </w:p>
     <w:p>
@@ -3440,7 +3538,7 @@
                 <w:color w:val="000000"/>
                 <w:sz w:val="19"/>
               </w:rPr>
-              <w:t>2.1.0</w:t>
+              <w:t>2.1.1</w:t>
             </w:r>
           </w:p>
         </w:tc>
@@ -4438,6 +4536,12 @@
       <w:startOverride w:val="1"/>
     </w:lvlOverride>
   </w:num>
+  <w:num w:numId="14">
+    <w:abstractNumId w:val="7"/>
+    <w:lvlOverride w:ilvl="0">
+      <w:startOverride w:val="1"/>
+    </w:lvlOverride>
+  </w:num>
 </w:numbering>
 </file>
 

</xml_diff>

<commit_message>
docs: make repository install and current policy canonical
</commit_message>
<xml_diff>
--- a/docs/Codex Chief of Staff - Installation and SOP.docx
+++ b/docs/Codex Chief of Staff - Installation and SOP.docx
@@ -259,7 +259,7 @@
                 <w:color w:val="000000"/>
                 <w:sz w:val="19"/>
               </w:rPr>
-              <w:t>ChatGPT Work and Codex teams</w:t>
+              <w:t>Codex users</w:t>
             </w:r>
           </w:p>
         </w:tc>
@@ -285,7 +285,7 @@
                 <w:color w:val="000000"/>
                 <w:sz w:val="19"/>
               </w:rPr>
-              <w:t>GitHub marketplace; OpenAI review pending</w:t>
+              <w:t>GitHub repository installer</w:t>
             </w:r>
           </w:p>
         </w:tc>
@@ -347,7 +347,7 @@
           <w:color w:val="14213D"/>
           <w:sz w:val="21"/>
         </w:rPr>
-        <w:t>One ChatGPT Work and Codex plugin that loads the operating contract, retained persona, and pinned content runtime. It grants no connector access, project authority, or external-write permission.</w:t>
+        <w:t>One Codex plugin that loads the operating contract, retained persona, and pinned content runtime. It grants no connector access, project authority, or external-write permission.</w:t>
       </w:r>
     </w:p>
     <w:p>
@@ -421,176 +421,6 @@
       </w:pPr>
       <w:r>
         <w:t>1. Install Chief</w:t>
-      </w:r>
-    </w:p>
-    <w:p>
-      <w:pPr>
-        <w:pStyle w:val="Heading2"/>
-      </w:pPr>
-      <w:r>
-        <w:t>Teammate quick start</w:t>
-      </w:r>
-    </w:p>
-    <w:p>
-      <w:pPr>
-        <w:pStyle w:val="ListNumber"/>
-        <w:numPr>
-          <w:ilvl w:val="0"/>
-          <w:numId w:val="10"/>
-        </w:numPr>
-        <w:keepNext w:val="0"/>
-        <w:spacing w:after="60" w:line="288" w:lineRule="auto"/>
-      </w:pPr>
-      <w:r>
-        <w:t>Open ChatGPT and switch to Work.</w:t>
-      </w:r>
-    </w:p>
-    <w:p>
-      <w:pPr>
-        <w:pStyle w:val="ListNumber"/>
-        <w:numPr>
-          <w:ilvl w:val="0"/>
-          <w:numId w:val="10"/>
-        </w:numPr>
-        <w:keepNext w:val="0"/>
-        <w:spacing w:after="60" w:line="288" w:lineRule="auto"/>
-      </w:pPr>
-      <w:r>
-        <w:t>Open Plugins and search for Chief of Staff.</w:t>
-      </w:r>
-    </w:p>
-    <w:p>
-      <w:pPr>
-        <w:pStyle w:val="ListNumber"/>
-        <w:numPr>
-          <w:ilvl w:val="0"/>
-          <w:numId w:val="10"/>
-        </w:numPr>
-        <w:keepNext w:val="0"/>
-        <w:spacing w:after="60" w:line="288" w:lineRule="auto"/>
-      </w:pPr>
-      <w:r>
-        <w:t>Select + to install it.</w:t>
-      </w:r>
-    </w:p>
-    <w:p>
-      <w:pPr>
-        <w:pStyle w:val="ListNumber"/>
-        <w:numPr>
-          <w:ilvl w:val="0"/>
-          <w:numId w:val="10"/>
-        </w:numPr>
-        <w:keepNext w:val="0"/>
-        <w:spacing w:after="60" w:line="288" w:lineRule="auto"/>
-      </w:pPr>
-      <w:r>
-        <w:t>Start a new chat and ask for the finished work normally.</w:t>
-      </w:r>
-    </w:p>
-    <w:p>
-      <w:pPr>
-        <w:pBdr>
-          <w:left w:val="single" w:sz="18" w:space="8" w:color="2A9D8F"/>
-        </w:pBdr>
-        <w:shd w:fill="E8F4F2"/>
-        <w:spacing w:before="80" w:after="160"/>
-        <w:ind w:left="115" w:right="115"/>
-      </w:pPr>
-      <w:r>
-        <w:rPr>
-          <w:rFonts w:ascii="Calibri" w:hAnsi="Calibri"/>
-          <w:b/>
-          <w:color w:val="14213D"/>
-          <w:sz w:val="21"/>
-        </w:rPr>
-        <w:t xml:space="preserve">That is the whole teammate procedure: </w:t>
-      </w:r>
-      <w:r>
-        <w:rPr>
-          <w:rFonts w:ascii="Calibri" w:hAnsi="Calibri"/>
-          <w:b w:val="0"/>
-          <w:color w:val="14213D"/>
-          <w:sz w:val="21"/>
-        </w:rPr>
-        <w:t>No terminal or Git is required. Teammates do not need Python, plugin names or specialist selection. Do not install AI Sloppy Copy separately. Brand Voice Factory and Crafty Carousels are already inside Chief.</w:t>
-      </w:r>
-    </w:p>
-    <w:p>
-      <w:pPr>
-        <w:pStyle w:val="Heading2"/>
-      </w:pPr>
-      <w:r>
-        <w:t>Workspace admin</w:t>
-      </w:r>
-    </w:p>
-    <w:p>
-      <w:pPr>
-        <w:pStyle w:val="ListNumber"/>
-        <w:numPr>
-          <w:ilvl w:val="0"/>
-          <w:numId w:val="11"/>
-        </w:numPr>
-        <w:keepNext w:val="0"/>
-        <w:spacing w:after="60" w:line="288" w:lineRule="auto"/>
-      </w:pPr>
-      <w:r>
-        <w:t>Open Workspace settings and select Plugins.</w:t>
-      </w:r>
-    </w:p>
-    <w:p>
-      <w:pPr>
-        <w:pStyle w:val="ListNumber"/>
-        <w:numPr>
-          <w:ilvl w:val="0"/>
-          <w:numId w:val="11"/>
-        </w:numPr>
-        <w:keepNext w:val="0"/>
-        <w:spacing w:after="60" w:line="288" w:lineRule="auto"/>
-      </w:pPr>
-      <w:r>
-        <w:t>Select Chief of Staff.</w:t>
-      </w:r>
-    </w:p>
-    <w:p>
-      <w:pPr>
-        <w:pStyle w:val="ListNumber"/>
-        <w:numPr>
-          <w:ilvl w:val="0"/>
-          <w:numId w:val="11"/>
-        </w:numPr>
-        <w:keepNext w:val="0"/>
-        <w:spacing w:after="60" w:line="288" w:lineRule="auto"/>
-      </w:pPr>
-      <w:r>
-        <w:t>Set the installation policy to Installed for the required roles.</w:t>
-      </w:r>
-    </w:p>
-    <w:p>
-      <w:pPr>
-        <w:pStyle w:val="ListNumber"/>
-        <w:numPr>
-          <w:ilvl w:val="0"/>
-          <w:numId w:val="11"/>
-        </w:numPr>
-        <w:keepNext w:val="0"/>
-        <w:spacing w:after="60" w:line="288" w:lineRule="auto"/>
-      </w:pPr>
-      <w:r>
-        <w:t>Run one low-risk test from a member account.</w:t>
-      </w:r>
-    </w:p>
-    <w:p>
-      <w:pPr>
-        <w:pStyle w:val="ListNumber"/>
-        <w:numPr>
-          <w:ilvl w:val="0"/>
-          <w:numId w:val="11"/>
-        </w:numPr>
-        <w:keepNext w:val="0"/>
-        <w:spacing w:after="60" w:line="288" w:lineRule="auto"/>
-      </w:pPr>
-      <w:r>
-        <w:t>Tell the team to start a new Work chat and ask Chief normally.</w:t>
       </w:r>
     </w:p>
     <w:p>
@@ -609,7 +439,7 @@
           <w:color w:val="9C2F2F"/>
           <w:sz w:val="21"/>
         </w:rPr>
-        <w:t xml:space="preserve">Current status: </w:t>
+        <w:t xml:space="preserve">Repository install only: </w:t>
       </w:r>
       <w:r>
         <w:rPr>
@@ -618,7 +448,7 @@
           <w:color w:val="9C2F2F"/>
           <w:sz w:val="21"/>
         </w:rPr>
-        <w:t>Chief is available through its GitHub-backed marketplace. The public four-step store flow is not active yet. The publisher must submit Chief and wait for OpenAI approval. After approval, the publisher must select Publish. Until then, do not claim that Chief is publicly searchable.</w:t>
+        <w:t>Chief is installed from its GitHub repository. This project does not claim an OpenAI review, approval, directory listing or store distribution.</w:t>
       </w:r>
     </w:p>
     <w:p>
@@ -626,12 +456,7 @@
         <w:pStyle w:val="Heading2"/>
       </w:pPr>
       <w:r>
-        <w:t>Admin and Codex fallback</w:t>
-      </w:r>
-    </w:p>
-    <w:p>
-      <w:r>
-        <w:t>This fallback is for administrators. Developers may also use it for direct testing or an offline installation. Git is required. Node.js 18 or later is needed for hooks. Python 3.11 or later is needed for configuration validation.</w:t>
+        <w:t>Windows</w:t>
       </w:r>
     </w:p>
     <w:p>
@@ -670,7 +495,7 @@
           <w:color w:val="14213D"/>
           <w:sz w:val="17"/>
         </w:rPr>
-        <w:t>codex plugin marketplace add plotdevice01/codex-chief-of-staff</w:t>
+        <w:t>git clone https://github.com/plotdevice01/codex-chief-of-staff.git</w:t>
       </w:r>
     </w:p>
     <w:p>
@@ -686,7 +511,148 @@
           <w:color w:val="14213D"/>
           <w:sz w:val="17"/>
         </w:rPr>
-        <w:t>codex plugin add chief-of-staff@codex-chief-of-staff</w:t>
+        <w:t>Set-Location .\codex-chief-of-staff</w:t>
+      </w:r>
+    </w:p>
+    <w:p>
+      <w:pPr>
+        <w:shd w:fill="EEF1F5"/>
+        <w:spacing w:before="40" w:after="160"/>
+        <w:ind w:left="317" w:right="317"/>
+      </w:pPr>
+      <w:r>
+        <w:rPr>
+          <w:rFonts w:ascii="Consolas" w:hAnsi="Consolas"/>
+          <w:b w:val="0"/>
+          <w:color w:val="14213D"/>
+          <w:sz w:val="17"/>
+        </w:rPr>
+        <w:t>.\install.ps1</w:t>
+      </w:r>
+    </w:p>
+    <w:p>
+      <w:pPr>
+        <w:pStyle w:val="Heading2"/>
+      </w:pPr>
+      <w:r>
+        <w:t>macOS or Linux</w:t>
+      </w:r>
+    </w:p>
+    <w:p>
+      <w:pPr>
+        <w:shd w:fill="EEF1F5"/>
+        <w:spacing w:before="40" w:after="160"/>
+        <w:ind w:left="317" w:right="317"/>
+      </w:pPr>
+      <w:r>
+        <w:rPr>
+          <w:rFonts w:ascii="Consolas" w:hAnsi="Consolas"/>
+          <w:b w:val="0"/>
+          <w:color w:val="14213D"/>
+          <w:sz w:val="17"/>
+        </w:rPr>
+        <w:t>git clone https://github.com/plotdevice01/codex-chief-of-staff.git</w:t>
+      </w:r>
+    </w:p>
+    <w:p>
+      <w:pPr>
+        <w:shd w:fill="EEF1F5"/>
+        <w:spacing w:before="40" w:after="160"/>
+        <w:ind w:left="317" w:right="317"/>
+      </w:pPr>
+      <w:r>
+        <w:rPr>
+          <w:rFonts w:ascii="Consolas" w:hAnsi="Consolas"/>
+          <w:b w:val="0"/>
+          <w:color w:val="14213D"/>
+          <w:sz w:val="17"/>
+        </w:rPr>
+        <w:t>cd codex-chief-of-staff</w:t>
+      </w:r>
+    </w:p>
+    <w:p>
+      <w:pPr>
+        <w:shd w:fill="EEF1F5"/>
+        <w:spacing w:before="40" w:after="160"/>
+        <w:ind w:left="317" w:right="317"/>
+      </w:pPr>
+      <w:r>
+        <w:rPr>
+          <w:rFonts w:ascii="Consolas" w:hAnsi="Consolas"/>
+          <w:b w:val="0"/>
+          <w:color w:val="14213D"/>
+          <w:sz w:val="17"/>
+        </w:rPr>
+        <w:t>./install.sh</w:t>
+      </w:r>
+    </w:p>
+    <w:p>
+      <w:pPr>
+        <w:pStyle w:val="Heading2"/>
+      </w:pPr>
+      <w:r>
+        <w:t>What the repository installer does</w:t>
+      </w:r>
+    </w:p>
+    <w:p>
+      <w:pPr>
+        <w:pStyle w:val="ListNumber"/>
+        <w:numPr>
+          <w:ilvl w:val="0"/>
+          <w:numId w:val="10"/>
+        </w:numPr>
+        <w:keepNext w:val="0"/>
+        <w:spacing w:after="60" w:line="288" w:lineRule="auto"/>
+      </w:pPr>
+      <w:r>
+        <w:t>Registers the checked-out repository as the local Codex marketplace.</w:t>
+      </w:r>
+    </w:p>
+    <w:p>
+      <w:pPr>
+        <w:pStyle w:val="ListNumber"/>
+        <w:numPr>
+          <w:ilvl w:val="0"/>
+          <w:numId w:val="10"/>
+        </w:numPr>
+        <w:keepNext w:val="0"/>
+        <w:spacing w:after="60" w:line="288" w:lineRule="auto"/>
+      </w:pPr>
+      <w:r>
+        <w:t>Installs chief-of-staff@codex-chief-of-staff.</w:t>
+      </w:r>
+    </w:p>
+    <w:p>
+      <w:pPr>
+        <w:pStyle w:val="ListNumber"/>
+        <w:numPr>
+          <w:ilvl w:val="0"/>
+          <w:numId w:val="10"/>
+        </w:numPr>
+        <w:keepNext w:val="0"/>
+        <w:spacing w:after="60" w:line="288" w:lineRule="auto"/>
+      </w:pPr>
+      <w:r>
+        <w:t>Initializes a private local configuration when Python is available.</w:t>
+      </w:r>
+    </w:p>
+    <w:p>
+      <w:pPr>
+        <w:pStyle w:val="ListNumber"/>
+        <w:numPr>
+          <w:ilvl w:val="0"/>
+          <w:numId w:val="10"/>
+        </w:numPr>
+        <w:keepNext w:val="0"/>
+        <w:spacing w:after="60" w:line="288" w:lineRule="auto"/>
+      </w:pPr>
+      <w:r>
+        <w:t>Leaves connector and project authority disabled until configured.</w:t>
+      </w:r>
+    </w:p>
+    <w:p>
+      <w:r>
+        <w:t>Git is required. Node.js 18 or later supports hooks. Python 3.11 or later supports configuration and validation. AI Sloppy Copy, Brand Voice Factory and Crafty Carousels are bundled; do not install them separately for normal Chief use.</w:t>
       </w:r>
     </w:p>
     <w:p>
@@ -702,7 +668,7 @@
         <w:pStyle w:val="ListNumber"/>
         <w:numPr>
           <w:ilvl w:val="0"/>
-          <w:numId w:val="12"/>
+          <w:numId w:val="11"/>
         </w:numPr>
         <w:keepNext w:val="0"/>
         <w:spacing w:after="60" w:line="288" w:lineRule="auto"/>
@@ -716,7 +682,7 @@
         <w:pStyle w:val="ListNumber"/>
         <w:numPr>
           <w:ilvl w:val="0"/>
-          <w:numId w:val="12"/>
+          <w:numId w:val="11"/>
         </w:numPr>
         <w:keepNext w:val="0"/>
         <w:spacing w:after="60" w:line="288" w:lineRule="auto"/>
@@ -730,7 +696,7 @@
         <w:pStyle w:val="ListNumber"/>
         <w:numPr>
           <w:ilvl w:val="0"/>
-          <w:numId w:val="12"/>
+          <w:numId w:val="11"/>
         </w:numPr>
         <w:keepNext w:val="0"/>
         <w:spacing w:after="60" w:line="288" w:lineRule="auto"/>
@@ -744,7 +710,7 @@
         <w:pStyle w:val="ListNumber"/>
         <w:numPr>
           <w:ilvl w:val="0"/>
-          <w:numId w:val="12"/>
+          <w:numId w:val="11"/>
         </w:numPr>
         <w:keepNext w:val="0"/>
         <w:spacing w:after="60" w:line="288" w:lineRule="auto"/>
@@ -758,7 +724,7 @@
         <w:pStyle w:val="ListNumber"/>
         <w:numPr>
           <w:ilvl w:val="0"/>
-          <w:numId w:val="12"/>
+          <w:numId w:val="11"/>
         </w:numPr>
         <w:keepNext w:val="0"/>
         <w:spacing w:after="60" w:line="288" w:lineRule="auto"/>
@@ -792,7 +758,7 @@
           <w:color w:val="9C2F2F"/>
           <w:sz w:val="21"/>
         </w:rPr>
-        <w:t>Chief loads the retained persona and injects AGENTS.md only when Codex has not already loaded the canonical contract. Content routing happens in the Chief skill, not another lifecycle hook. ChatGPT Work applies the same contract through the installed skill. Review every Codex hook before trust.</w:t>
+        <w:t>Chief loads the retained persona and injects AGENTS.md only when Codex has not already loaded the canonical contract. Content routing happens in the Chief skill, not another lifecycle hook. Review every Codex hook before trust.</w:t>
       </w:r>
     </w:p>
     <w:p>
@@ -824,12 +790,12 @@
         <w:pStyle w:val="Heading2"/>
       </w:pPr>
       <w:r>
-        <w:t>Local and team deployment</w:t>
+        <w:t>Repository ownership</w:t>
       </w:r>
     </w:p>
     <w:p>
       <w:r>
-        <w:t>The Codex fallback installs or updates Chief from the configured marketplace. After public-directory approval, ChatGPT workspace admins control automatic installation for team roles. Team members open ChatGPT Work and ask Chief normally; they do not select specialist workflows.</w:t>
+        <w:t>Every documented install starts from the Chief repository and runs its installer. The installer registers that checkout with Codex. No third-party review, approval, listing or distribution is claimed.</w:t>
       </w:r>
     </w:p>
     <w:p>
@@ -869,6 +835,11 @@
       </w:r>
     </w:p>
     <w:p>
+      <w:r>
+        <w:t>Chief uses durable local policy, not an expiring or time-boxed mode. Connector access starts disabled. External writes are blocked or require explicit confirmation. Authority changes only through an owner-approved update to the private configuration.</w:t>
+      </w:r>
+    </w:p>
+    <w:p>
       <w:pPr>
         <w:pStyle w:val="Heading2"/>
       </w:pPr>
@@ -894,7 +865,7 @@
     </w:p>
     <w:p>
       <w:r>
-        <w:t>Or start a fresh ChatGPT Work or Codex task and ask the Chief of Staff skill to initialize the local configuration.</w:t>
+        <w:t>Or start a fresh Codex task and ask the Chief of Staff skill to initialize the local configuration.</w:t>
       </w:r>
     </w:p>
     <w:tbl>
@@ -1429,7 +1400,7 @@
         <w:pStyle w:val="ListNumber"/>
         <w:numPr>
           <w:ilvl w:val="0"/>
-          <w:numId w:val="13"/>
+          <w:numId w:val="12"/>
         </w:numPr>
         <w:keepNext w:val="0"/>
         <w:spacing w:after="60" w:line="288" w:lineRule="auto"/>
@@ -1443,7 +1414,7 @@
         <w:pStyle w:val="ListNumber"/>
         <w:numPr>
           <w:ilvl w:val="0"/>
-          <w:numId w:val="13"/>
+          <w:numId w:val="12"/>
         </w:numPr>
         <w:keepNext w:val="0"/>
         <w:spacing w:after="60" w:line="288" w:lineRule="auto"/>
@@ -1457,7 +1428,7 @@
         <w:pStyle w:val="ListNumber"/>
         <w:numPr>
           <w:ilvl w:val="0"/>
-          <w:numId w:val="13"/>
+          <w:numId w:val="12"/>
         </w:numPr>
         <w:keepNext w:val="0"/>
         <w:spacing w:after="60" w:line="288" w:lineRule="auto"/>
@@ -1471,7 +1442,7 @@
         <w:pStyle w:val="ListNumber"/>
         <w:numPr>
           <w:ilvl w:val="0"/>
-          <w:numId w:val="13"/>
+          <w:numId w:val="12"/>
         </w:numPr>
         <w:keepNext w:val="0"/>
         <w:spacing w:after="60" w:line="288" w:lineRule="auto"/>
@@ -1485,7 +1456,7 @@
         <w:pStyle w:val="ListNumber"/>
         <w:numPr>
           <w:ilvl w:val="0"/>
-          <w:numId w:val="13"/>
+          <w:numId w:val="12"/>
         </w:numPr>
         <w:keepNext w:val="0"/>
         <w:spacing w:after="60" w:line="288" w:lineRule="auto"/>
@@ -1499,7 +1470,7 @@
         <w:pStyle w:val="ListNumber"/>
         <w:numPr>
           <w:ilvl w:val="0"/>
-          <w:numId w:val="13"/>
+          <w:numId w:val="12"/>
         </w:numPr>
         <w:keepNext w:val="0"/>
         <w:spacing w:after="60" w:line="288" w:lineRule="auto"/>
@@ -1513,7 +1484,7 @@
         <w:pStyle w:val="ListNumber"/>
         <w:numPr>
           <w:ilvl w:val="0"/>
-          <w:numId w:val="13"/>
+          <w:numId w:val="12"/>
         </w:numPr>
         <w:keepNext w:val="0"/>
         <w:spacing w:after="60" w:line="288" w:lineRule="auto"/>
@@ -1527,7 +1498,7 @@
         <w:pStyle w:val="ListNumber"/>
         <w:numPr>
           <w:ilvl w:val="0"/>
-          <w:numId w:val="13"/>
+          <w:numId w:val="12"/>
         </w:numPr>
         <w:keepNext w:val="0"/>
         <w:spacing w:after="60" w:line="288" w:lineRule="auto"/>
@@ -1722,7 +1693,7 @@
         <w:pStyle w:val="ListNumber"/>
         <w:numPr>
           <w:ilvl w:val="0"/>
-          <w:numId w:val="14"/>
+          <w:numId w:val="13"/>
         </w:numPr>
         <w:keepNext w:val="0"/>
         <w:spacing w:after="60" w:line="288" w:lineRule="auto"/>
@@ -1736,7 +1707,7 @@
         <w:pStyle w:val="ListNumber"/>
         <w:numPr>
           <w:ilvl w:val="0"/>
-          <w:numId w:val="14"/>
+          <w:numId w:val="13"/>
         </w:numPr>
         <w:keepNext w:val="0"/>
         <w:spacing w:after="60" w:line="288" w:lineRule="auto"/>
@@ -1750,7 +1721,7 @@
         <w:pStyle w:val="ListNumber"/>
         <w:numPr>
           <w:ilvl w:val="0"/>
-          <w:numId w:val="14"/>
+          <w:numId w:val="13"/>
         </w:numPr>
         <w:keepNext w:val="0"/>
         <w:spacing w:after="60" w:line="288" w:lineRule="auto"/>
@@ -1764,7 +1735,7 @@
         <w:pStyle w:val="ListNumber"/>
         <w:numPr>
           <w:ilvl w:val="0"/>
-          <w:numId w:val="14"/>
+          <w:numId w:val="13"/>
         </w:numPr>
         <w:keepNext w:val="0"/>
         <w:spacing w:after="60" w:line="288" w:lineRule="auto"/>
@@ -3275,7 +3246,7 @@
           <w:color w:val="14213D"/>
           <w:sz w:val="17"/>
         </w:rPr>
-        <w:t>codex plugin marketplace upgrade codex-chief-of-staff</w:t>
+        <w:t>git pull --ff-only</w:t>
       </w:r>
     </w:p>
     <w:p>
@@ -3291,47 +3262,7 @@
           <w:color w:val="14213D"/>
           <w:sz w:val="17"/>
         </w:rPr>
-        <w:t>codex plugin add chief-of-staff@codex-chief-of-staff</w:t>
-      </w:r>
-    </w:p>
-    <w:p>
-      <w:pPr>
-        <w:pStyle w:val="ListBullet"/>
-      </w:pPr>
-      <w:r>
-        <w:t>Read CHANGELOG.md.</w:t>
-      </w:r>
-    </w:p>
-    <w:p>
-      <w:pPr>
-        <w:pStyle w:val="ListBullet"/>
-      </w:pPr>
-      <w:r>
-        <w:t>Run validation again.</w:t>
-      </w:r>
-    </w:p>
-    <w:p>
-      <w:pPr>
-        <w:pStyle w:val="ListBullet"/>
-      </w:pPr>
-      <w:r>
-        <w:t>Restart the ChatGPT desktop app, then repeat the fresh-task acceptance prompts.</w:t>
-      </w:r>
-    </w:p>
-    <w:p>
-      <w:pPr>
-        <w:pStyle w:val="ListBullet"/>
-      </w:pPr>
-      <w:r>
-        <w:t>Keep the prior tagged release available until acceptance passes.</w:t>
-      </w:r>
-    </w:p>
-    <w:p>
-      <w:pPr>
-        <w:pStyle w:val="Heading2"/>
-      </w:pPr>
-      <w:r>
-        <w:t>Uninstall</w:t>
+        <w:t>.\install.ps1 -Upgrade</w:t>
       </w:r>
     </w:p>
     <w:p>
@@ -3347,7 +3278,47 @@
           <w:color w:val="14213D"/>
           <w:sz w:val="17"/>
         </w:rPr>
-        <w:t>codex plugin remove chief-of-staff@codex-chief-of-staff</w:t>
+        <w:t>./install.sh --upgrade</w:t>
+      </w:r>
+    </w:p>
+    <w:p>
+      <w:pPr>
+        <w:pStyle w:val="ListBullet"/>
+      </w:pPr>
+      <w:r>
+        <w:t>Read CHANGELOG.md.</w:t>
+      </w:r>
+    </w:p>
+    <w:p>
+      <w:pPr>
+        <w:pStyle w:val="ListBullet"/>
+      </w:pPr>
+      <w:r>
+        <w:t>Run validation again.</w:t>
+      </w:r>
+    </w:p>
+    <w:p>
+      <w:pPr>
+        <w:pStyle w:val="ListBullet"/>
+      </w:pPr>
+      <w:r>
+        <w:t>Restart Codex, then repeat the fresh-task acceptance prompts.</w:t>
+      </w:r>
+    </w:p>
+    <w:p>
+      <w:pPr>
+        <w:pStyle w:val="ListBullet"/>
+      </w:pPr>
+      <w:r>
+        <w:t>Keep the prior tagged release available until acceptance passes.</w:t>
+      </w:r>
+    </w:p>
+    <w:p>
+      <w:pPr>
+        <w:pStyle w:val="Heading2"/>
+      </w:pPr>
+      <w:r>
+        <w:t>Uninstall</w:t>
       </w:r>
     </w:p>
     <w:p>
@@ -3363,7 +3334,23 @@
           <w:color w:val="14213D"/>
           <w:sz w:val="17"/>
         </w:rPr>
-        <w:t>codex plugin marketplace remove codex-chief-of-staff</w:t>
+        <w:t>.\install.ps1 -Uninstall</w:t>
+      </w:r>
+    </w:p>
+    <w:p>
+      <w:pPr>
+        <w:shd w:fill="EEF1F5"/>
+        <w:spacing w:before="40" w:after="160"/>
+        <w:ind w:left="317" w:right="317"/>
+      </w:pPr>
+      <w:r>
+        <w:rPr>
+          <w:rFonts w:ascii="Consolas" w:hAnsi="Consolas"/>
+          <w:b w:val="0"/>
+          <w:color w:val="14213D"/>
+          <w:sz w:val="17"/>
+        </w:rPr>
+        <w:t>./install.sh --uninstall</w:t>
       </w:r>
     </w:p>
     <w:p>
@@ -3829,7 +3816,7 @@
         <w:spacing w:after="240"/>
       </w:pPr>
       <w:r>
-        <w:t>Each product uses one three-part version for its GitHub release and tag. The ZIP and both the portable and OpenAI manifests use that same number. AI Sloppy Copy also carries a separately versioned writing-rules contract.</w:t>
+        <w:t>Each product uses one three-part version for its GitHub release and tag. The ZIP and both the portable and Codex manifests use that same number. AI Sloppy Copy also carries a separately versioned writing-rules contract.</w:t>
       </w:r>
     </w:p>
     <w:p>
@@ -3972,7 +3959,7 @@
                 <w:color w:val="000000"/>
                 <w:sz w:val="19"/>
               </w:rPr>
-              <w:t>Restart the ChatGPT desktop app, review Codex hooks, then start a fresh task.</w:t>
+              <w:t>Restart Codex, review the Chief hooks, then start a fresh task.</w:t>
             </w:r>
           </w:p>
         </w:tc>
@@ -4306,7 +4293,7 @@
         <w:color w:val="5B6472"/>
         <w:sz w:val="16"/>
       </w:rPr>
-      <w:t>CHIEF OF STAFF  /  CHATGPT WORK + CODEX  /  INSTALLATION AND OPERATING SOP</w:t>
+      <w:t>CHIEF OF STAFF  /  CODEX  /  INSTALLATION AND OPERATING SOP</w:t>
     </w:r>
   </w:p>
 </w:hdr>
@@ -4531,12 +4518,6 @@
     </w:lvlOverride>
   </w:num>
   <w:num w:numId="13">
-    <w:abstractNumId w:val="7"/>
-    <w:lvlOverride w:ilvl="0">
-      <w:startOverride w:val="1"/>
-    </w:lvlOverride>
-  </w:num>
-  <w:num w:numId="14">
     <w:abstractNumId w:val="7"/>
     <w:lvlOverride w:ilvl="0">
       <w:startOverride w:val="1"/>

</xml_diff>

<commit_message>
release: prepare Chief v2.1.2 parity repair
</commit_message>
<xml_diff>
--- a/docs/Codex Chief of Staff - Installation and SOP.docx
+++ b/docs/Codex Chief of Staff - Installation and SOP.docx
@@ -233,7 +233,7 @@
                 <w:color w:val="000000"/>
                 <w:sz w:val="19"/>
               </w:rPr>
-              <w:t>2.1.1</w:t>
+              <w:t>2.1.2</w:t>
             </w:r>
           </w:p>
         </w:tc>
@@ -3186,7 +3186,7 @@
     </w:p>
     <w:p>
       <w:r>
-        <w:t>Run the fifteen prompts in persona/persona-contract.json in fresh Codex and ChatGPT Work tasks with GPT-5.6 Sol Medium. Generate the host prompt with scripts/live_acceptance_harness.py. For ChatGPT Work, the owner verifies the Work UI, Work locally and Ask for approval; record the underlying runtime separately because it may report Codex. For Codex, require the built-in read-only permission profile. Run responses inline. Any task creation or delegation invalidates the run. A file mutation also invalidates it. The same rule applies to a connector call, external action or host substitution. Terra XHigh is owner-waived for this release to conserve the reset token budget. Static validation proves the contract exists; it cannot honestly grade a live model response.</w:t>
+        <w:t>Run the fifteen prompts in persona/persona-contract.json in fresh Codex and ChatGPT Work tasks with GPT-5.6 Sol Medium. Generate the host prompt with scripts/live_acceptance_harness.py. For ChatGPT Work, the owner verifies the Work UI, Work locally and Ask for approval; record the underlying runtime separately because it may report Codex. For Codex, require the built-in read-only permission profile. Run responses inline. Any task creation or delegation invalidates the run. A file mutation also invalidates it. The same rule applies to a connector call, external action or host substitution. Terra XHigh remains pending unless the owner explicitly approves a version-bound release waiver. Static validation proves the contract exists; it cannot honestly grade a live model response.</w:t>
       </w:r>
     </w:p>
     <w:p>
@@ -3525,7 +3525,7 @@
                 <w:color w:val="000000"/>
                 <w:sz w:val="19"/>
               </w:rPr>
-              <w:t>2.1.1</w:t>
+              <w:t>2.1.2</w:t>
             </w:r>
           </w:p>
         </w:tc>

</xml_diff>

<commit_message>
fix plan-scoped authorization and clean cache installs
</commit_message>
<xml_diff>
--- a/docs/Codex Chief of Staff - Installation and SOP.docx
+++ b/docs/Codex Chief of Staff - Installation and SOP.docx
@@ -233,7 +233,7 @@
                 <w:color w:val="000000"/>
                 <w:sz w:val="19"/>
               </w:rPr>
-              <w:t>2.1.2</w:t>
+              <w:t>2.2.0</w:t>
             </w:r>
           </w:p>
         </w:tc>
@@ -347,7 +347,7 @@
           <w:color w:val="14213D"/>
           <w:sz w:val="21"/>
         </w:rPr>
-        <w:t>One Codex plugin that loads the operating contract, retained persona, and pinned content runtime. It grants no connector access, project authority, or external-write permission.</w:t>
+        <w:t>One Codex plugin that loads the operating contract, retained persona, and pinned content runtime. It grants no connector credentials or project scope. The private configuration controls plan-scoped external-write authority.</w:t>
       </w:r>
     </w:p>
     <w:p>
@@ -379,7 +379,7 @@
         <w:pStyle w:val="ListBullet"/>
       </w:pPr>
       <w:r>
-        <w:t>Explicit policy before drafts, sends, edits, posts, or permission changes.</w:t>
+        <w:t>Plan-scoped authorization for every included write, push, release, deployment, or publication step.</w:t>
       </w:r>
     </w:p>
     <w:p>
@@ -605,7 +605,7 @@
         <w:spacing w:after="60" w:line="288" w:lineRule="auto"/>
       </w:pPr>
       <w:r>
-        <w:t>Registers the checked-out repository as the local Codex marketplace.</w:t>
+        <w:t>Removes the prior Chief cache, stages only canonical repository files under .install/codex-chief-of-staff, and registers that clean repository-owned package as the local Codex marketplace.</w:t>
       </w:r>
     </w:p>
     <w:p>
@@ -633,7 +633,7 @@
         <w:spacing w:after="60" w:line="288" w:lineRule="auto"/>
       </w:pPr>
       <w:r>
-        <w:t>Initializes a private local configuration when Python is available.</w:t>
+        <w:t>Initializes a private local configuration.</w:t>
       </w:r>
     </w:p>
     <w:p>
@@ -652,7 +652,7 @@
     </w:p>
     <w:p>
       <w:r>
-        <w:t>Git is required. Node.js 18 or later supports hooks. Python 3.11 or later supports configuration and validation. AI Sloppy Copy, Brand Voice Factory and Crafty Carousels are bundled; do not install them separately for normal Chief use.</w:t>
+        <w:t>Git is required. Node.js 18 or later supports hooks. Python 3.11 or later stages the clean install package and supports configuration and validation. AI Sloppy Copy, Brand Voice Factory and Crafty Carousels are bundled; do not install them separately for normal Chief use.</w:t>
       </w:r>
     </w:p>
     <w:p>
@@ -795,7 +795,7 @@
     </w:p>
     <w:p>
       <w:r>
-        <w:t>Every documented install starts from the Chief repository and runs its installer. The installer registers that checkout with Codex. No third-party review, approval, listing or distribution is claimed.</w:t>
+        <w:t>Every documented install starts from the Chief repository and runs its installer. The installer clears the prior Chief cache and registers a clean canonical staging package inside that checkout with Codex. No third-party review, approval, listing or distribution is claimed.</w:t>
       </w:r>
     </w:p>
     <w:p>
@@ -831,12 +831,12 @@
           <w:color w:val="9C2F2F"/>
           <w:sz w:val="21"/>
         </w:rPr>
-        <w:t>Workspace plugin controls may make Chief available. Private identities, paths, scopes, and approval rules stay in ignored chief-of-staff.json.</w:t>
+        <w:t>Workspace plugin controls may make Chief available. Private identities, paths, scopes, and plan-scoped authorization rules stay in ignored chief-of-staff.json.</w:t>
       </w:r>
     </w:p>
     <w:p>
       <w:r>
-        <w:t>Chief uses durable local policy, not an expiring or time-boxed mode. Connector access starts disabled. External writes are blocked or require explicit confirmation. Authority changes only through an owner-approved update to the private configuration.</w:t>
+        <w:t>Chief uses durable local policy, not an expiring or time-boxed mode. Connector access starts disabled. External writes are blocked or plan-scoped. A direct request, approved plan, approved goal, or full-access instruction authorizes every plainly included action through completion. Reconfirm only for a material scope change or missing material decision.</w:t>
       </w:r>
     </w:p>
     <w:p>
@@ -1227,7 +1227,7 @@
                 <w:color w:val="000000"/>
                 <w:sz w:val="19"/>
               </w:rPr>
-              <w:t>Default confirmations and blocked financial actions with authority limits.</w:t>
+              <w:t>Plan-scoped authorization, blocked financial actions, material-change-only reconfirmation, and owner steering.</w:t>
             </w:r>
           </w:p>
         </w:tc>
@@ -1316,7 +1316,7 @@
         <w:pStyle w:val="ListBullet"/>
       </w:pPr>
       <w:r>
-        <w:t>Use blocked or confirm_each for external writes.</w:t>
+        <w:t>Use blocked or plan_scoped for external writes.</w:t>
       </w:r>
     </w:p>
     <w:p>
@@ -1376,7 +1376,7 @@
           <w:color w:val="9C2F2F"/>
           <w:sz w:val="21"/>
         </w:rPr>
-        <w:t>Do not use a connector until validation passes and the host reads back the intended scope and identity gate with the approval policy.</w:t>
+        <w:t>Do not use a connector until validation passes and the host reads back the intended scope and identity gate with the authorization policy.</w:t>
       </w:r>
     </w:p>
     <w:p>
@@ -1448,7 +1448,7 @@
         <w:spacing w:after="60" w:line="288" w:lineRule="auto"/>
       </w:pPr>
       <w:r>
-        <w:t>Define exact inputs, one job, relevant references, output, observable status and the human check.</w:t>
+        <w:t>Define inputs, one job, references, output, status and the human check.</w:t>
       </w:r>
     </w:p>
     <w:p>
@@ -1504,13 +1504,12 @@
         <w:spacing w:after="60" w:line="288" w:lineRule="auto"/>
       </w:pPr>
       <w:r>
-        <w:t>Use idempotency when available. Read the saved result back before any retry or completion report.</w:t>
+        <w:t>Use idempotency. Read the saved result before retrying or reporting completion.</w:t>
       </w:r>
     </w:p>
     <w:p>
       <w:pPr>
         <w:pStyle w:val="Heading2"/>
-        <w:pageBreakBefore/>
       </w:pPr>
       <w:r>
         <w:t>ICM project and workspace architecture</w:t>
@@ -2367,7 +2366,7 @@
                 <w:color w:val="000000"/>
                 <w:sz w:val="19"/>
               </w:rPr>
-              <w:t>confirm_each</w:t>
+              <w:t>plan_scoped</w:t>
             </w:r>
           </w:p>
         </w:tc>
@@ -2393,7 +2392,7 @@
                 <w:color w:val="000000"/>
                 <w:sz w:val="19"/>
               </w:rPr>
-              <w:t>State the exact action and target, then wait for immediate confirmation.</w:t>
+              <w:t>Treat the direct request or approved plan as durable authorization for every included step through completion.</w:t>
             </w:r>
           </w:p>
         </w:tc>
@@ -2409,7 +2408,23 @@
         <w:pStyle w:val="ListBullet"/>
       </w:pPr>
       <w:r>
-        <w:t>Earlier approval is not standing permission for a different external write.</w:t>
+        <w:t>An approved plan stays authorized through its included local edits, external writes and publication.</w:t>
+      </w:r>
+    </w:p>
+    <w:p>
+      <w:pPr>
+        <w:pStyle w:val="ListBullet"/>
+      </w:pPr>
+      <w:r>
+        <w:t>Reconfirm only for material expansion, a new target, unplanned irreversible destruction, or a missing decision.</w:t>
+      </w:r>
+    </w:p>
+    <w:p>
+      <w:pPr>
+        <w:pStyle w:val="ListBullet"/>
+      </w:pPr>
+      <w:r>
+        <w:t>Full access cannot create credentials or override host safeguards. The owner can steer or revoke it.</w:t>
       </w:r>
     </w:p>
     <w:p>
@@ -2477,7 +2492,7 @@
         <w:pStyle w:val="Heading2"/>
       </w:pPr>
       <w:r>
-        <w:t>Preview every change</w:t>
+        <w:t>Preview and apply the authorized propagation plan</w:t>
       </w:r>
     </w:p>
     <w:p>
@@ -2506,7 +2521,7 @@
         <w:pStyle w:val="Heading2"/>
       </w:pPr>
       <w:r>
-        <w:t>Apply after approval</w:t>
+        <w:t>Apply without a second permission checkpoint</w:t>
       </w:r>
     </w:p>
     <w:p>
@@ -2804,6 +2819,22 @@
           <w:sz w:val="17"/>
         </w:rPr>
         <w:t>python tests/test_live_acceptance_harness.py</w:t>
+      </w:r>
+    </w:p>
+    <w:p>
+      <w:pPr>
+        <w:shd w:fill="EEF1F5"/>
+        <w:spacing w:before="40" w:after="160"/>
+        <w:ind w:left="317" w:right="317"/>
+      </w:pPr>
+      <w:r>
+        <w:rPr>
+          <w:rFonts w:ascii="Consolas" w:hAnsi="Consolas"/>
+          <w:b w:val="0"/>
+          <w:color w:val="14213D"/>
+          <w:sz w:val="17"/>
+        </w:rPr>
+        <w:t>python scripts/verify_installed_cache.py --require-only-current --require-plugin-state --receipt qa/installed-cache-v2.2.0.json --visual qa/installed-cache-v2.2.0.svg</w:t>
       </w:r>
     </w:p>
     <w:tbl>
@@ -2937,7 +2968,7 @@
                 <w:color w:val="000000"/>
                 <w:sz w:val="19"/>
               </w:rPr>
-              <w:t>97 requirements, ten integration rules and source hashes remain present. Fifteen scenarios remain too.</w:t>
+              <w:t>97 requirements, ten integration rules and source hashes remain present. Sixteen scenarios remain too.</w:t>
             </w:r>
           </w:p>
         </w:tc>
@@ -3186,7 +3217,7 @@
     </w:p>
     <w:p>
       <w:r>
-        <w:t>Run the fifteen prompts in persona/persona-contract.json in fresh Codex and ChatGPT Work tasks with GPT-5.6 Sol Medium. Generate the host prompt with scripts/live_acceptance_harness.py. For ChatGPT Work, the owner verifies the Work UI, Work locally and Ask for approval; record the underlying runtime separately because it may report Codex. For Codex, require the built-in read-only permission profile. Run responses inline. Any task creation or delegation invalidates the run. A file mutation also invalidates it. The same rule applies to a connector call, external action or host substitution. Terra XHigh remains pending unless the owner explicitly approves a version-bound release waiver. Static validation proves the contract exists; it cannot honestly grade a live model response.</w:t>
+        <w:t>Run the sixteen prompts in persona/persona-contract.json in fresh Codex and ChatGPT Work tasks with GPT-5.6 Sol Medium. Generate the host prompt with scripts/live_acceptance_harness.py. For ChatGPT Work, the owner verifies the Work UI, Work locally and Ask for approval for this response-only test; that test setting does not alter normal plan-scoped authorization. Record the underlying runtime separately because it may report Codex. For Codex, require the built-in read-only permission profile. Run responses inline. Any task creation or delegation invalidates the run. A file mutation also invalidates it. The same rule applies to a connector call, external action or host substitution. Terra XHigh remains pending unless the owner explicitly approves a version-bound release waiver. Static validation proves the contract exists; it cannot honestly grade a live model response.</w:t>
       </w:r>
     </w:p>
     <w:p>
@@ -3294,7 +3325,7 @@
         <w:pStyle w:val="ListBullet"/>
       </w:pPr>
       <w:r>
-        <w:t>Run validation again.</w:t>
+        <w:t>Run validation again, including verify_installed_cache.py --require-only-current --require-plugin-state.</w:t>
       </w:r>
     </w:p>
     <w:p>
@@ -3525,7 +3556,7 @@
                 <w:color w:val="000000"/>
                 <w:sz w:val="19"/>
               </w:rPr>
-              <w:t>2.1.2</w:t>
+              <w:t>2.2.0</w:t>
             </w:r>
           </w:p>
         </w:tc>

</xml_diff>

<commit_message>
fix plan-scoped authorization and clean cache installs (#7)
Co-authored-by: plotdevice01 <284102241+plotdevice01@users.noreply.github.com>
</commit_message>
<xml_diff>
--- a/docs/Codex Chief of Staff - Installation and SOP.docx
+++ b/docs/Codex Chief of Staff - Installation and SOP.docx
@@ -233,7 +233,7 @@
                 <w:color w:val="000000"/>
                 <w:sz w:val="19"/>
               </w:rPr>
-              <w:t>2.1.2</w:t>
+              <w:t>2.2.0</w:t>
             </w:r>
           </w:p>
         </w:tc>
@@ -347,7 +347,7 @@
           <w:color w:val="14213D"/>
           <w:sz w:val="21"/>
         </w:rPr>
-        <w:t>One Codex plugin that loads the operating contract, retained persona, and pinned content runtime. It grants no connector access, project authority, or external-write permission.</w:t>
+        <w:t>One Codex plugin that loads the operating contract, retained persona, and pinned content runtime. It grants no connector credentials or project scope. The private configuration controls plan-scoped external-write authority.</w:t>
       </w:r>
     </w:p>
     <w:p>
@@ -379,7 +379,7 @@
         <w:pStyle w:val="ListBullet"/>
       </w:pPr>
       <w:r>
-        <w:t>Explicit policy before drafts, sends, edits, posts, or permission changes.</w:t>
+        <w:t>Plan-scoped authorization for every included write, push, release, deployment, or publication step.</w:t>
       </w:r>
     </w:p>
     <w:p>
@@ -605,7 +605,7 @@
         <w:spacing w:after="60" w:line="288" w:lineRule="auto"/>
       </w:pPr>
       <w:r>
-        <w:t>Registers the checked-out repository as the local Codex marketplace.</w:t>
+        <w:t>Removes the prior Chief cache, stages only canonical repository files under .install/codex-chief-of-staff, and registers that clean repository-owned package as the local Codex marketplace.</w:t>
       </w:r>
     </w:p>
     <w:p>
@@ -633,7 +633,7 @@
         <w:spacing w:after="60" w:line="288" w:lineRule="auto"/>
       </w:pPr>
       <w:r>
-        <w:t>Initializes a private local configuration when Python is available.</w:t>
+        <w:t>Initializes a private local configuration.</w:t>
       </w:r>
     </w:p>
     <w:p>
@@ -652,7 +652,7 @@
     </w:p>
     <w:p>
       <w:r>
-        <w:t>Git is required. Node.js 18 or later supports hooks. Python 3.11 or later supports configuration and validation. AI Sloppy Copy, Brand Voice Factory and Crafty Carousels are bundled; do not install them separately for normal Chief use.</w:t>
+        <w:t>Git is required. Node.js 18 or later supports hooks. Python 3.11 or later stages the clean install package and supports configuration and validation. AI Sloppy Copy, Brand Voice Factory and Crafty Carousels are bundled; do not install them separately for normal Chief use.</w:t>
       </w:r>
     </w:p>
     <w:p>
@@ -795,7 +795,7 @@
     </w:p>
     <w:p>
       <w:r>
-        <w:t>Every documented install starts from the Chief repository and runs its installer. The installer registers that checkout with Codex. No third-party review, approval, listing or distribution is claimed.</w:t>
+        <w:t>Every documented install starts from the Chief repository and runs its installer. The installer clears the prior Chief cache and registers a clean canonical staging package inside that checkout with Codex. No third-party review, approval, listing or distribution is claimed.</w:t>
       </w:r>
     </w:p>
     <w:p>
@@ -831,12 +831,12 @@
           <w:color w:val="9C2F2F"/>
           <w:sz w:val="21"/>
         </w:rPr>
-        <w:t>Workspace plugin controls may make Chief available. Private identities, paths, scopes, and approval rules stay in ignored chief-of-staff.json.</w:t>
+        <w:t>Workspace plugin controls may make Chief available. Private identities, paths, scopes, and plan-scoped authorization rules stay in ignored chief-of-staff.json.</w:t>
       </w:r>
     </w:p>
     <w:p>
       <w:r>
-        <w:t>Chief uses durable local policy, not an expiring or time-boxed mode. Connector access starts disabled. External writes are blocked or require explicit confirmation. Authority changes only through an owner-approved update to the private configuration.</w:t>
+        <w:t>Chief uses durable local policy, not an expiring or time-boxed mode. Connector access starts disabled. External writes are blocked or plan-scoped. A direct request, approved plan, approved goal, or full-access instruction authorizes every plainly included action through completion. Reconfirm only for a material scope change or missing material decision.</w:t>
       </w:r>
     </w:p>
     <w:p>
@@ -1227,7 +1227,7 @@
                 <w:color w:val="000000"/>
                 <w:sz w:val="19"/>
               </w:rPr>
-              <w:t>Default confirmations and blocked financial actions with authority limits.</w:t>
+              <w:t>Plan-scoped authorization, blocked financial actions, material-change-only reconfirmation, and owner steering.</w:t>
             </w:r>
           </w:p>
         </w:tc>
@@ -1316,7 +1316,7 @@
         <w:pStyle w:val="ListBullet"/>
       </w:pPr>
       <w:r>
-        <w:t>Use blocked or confirm_each for external writes.</w:t>
+        <w:t>Use blocked or plan_scoped for external writes.</w:t>
       </w:r>
     </w:p>
     <w:p>
@@ -1376,7 +1376,7 @@
           <w:color w:val="9C2F2F"/>
           <w:sz w:val="21"/>
         </w:rPr>
-        <w:t>Do not use a connector until validation passes and the host reads back the intended scope and identity gate with the approval policy.</w:t>
+        <w:t>Do not use a connector until validation passes and the host reads back the intended scope and identity gate with the authorization policy.</w:t>
       </w:r>
     </w:p>
     <w:p>
@@ -1448,7 +1448,7 @@
         <w:spacing w:after="60" w:line="288" w:lineRule="auto"/>
       </w:pPr>
       <w:r>
-        <w:t>Define exact inputs, one job, relevant references, output, observable status and the human check.</w:t>
+        <w:t>Define inputs, one job, references, output, status and the human check.</w:t>
       </w:r>
     </w:p>
     <w:p>
@@ -1504,13 +1504,12 @@
         <w:spacing w:after="60" w:line="288" w:lineRule="auto"/>
       </w:pPr>
       <w:r>
-        <w:t>Use idempotency when available. Read the saved result back before any retry or completion report.</w:t>
+        <w:t>Use idempotency. Read the saved result before retrying or reporting completion.</w:t>
       </w:r>
     </w:p>
     <w:p>
       <w:pPr>
         <w:pStyle w:val="Heading2"/>
-        <w:pageBreakBefore/>
       </w:pPr>
       <w:r>
         <w:t>ICM project and workspace architecture</w:t>
@@ -2367,7 +2366,7 @@
                 <w:color w:val="000000"/>
                 <w:sz w:val="19"/>
               </w:rPr>
-              <w:t>confirm_each</w:t>
+              <w:t>plan_scoped</w:t>
             </w:r>
           </w:p>
         </w:tc>
@@ -2393,7 +2392,7 @@
                 <w:color w:val="000000"/>
                 <w:sz w:val="19"/>
               </w:rPr>
-              <w:t>State the exact action and target, then wait for immediate confirmation.</w:t>
+              <w:t>Treat the direct request or approved plan as durable authorization for every included step through completion.</w:t>
             </w:r>
           </w:p>
         </w:tc>
@@ -2409,7 +2408,23 @@
         <w:pStyle w:val="ListBullet"/>
       </w:pPr>
       <w:r>
-        <w:t>Earlier approval is not standing permission for a different external write.</w:t>
+        <w:t>An approved plan stays authorized through its included local edits, external writes and publication.</w:t>
+      </w:r>
+    </w:p>
+    <w:p>
+      <w:pPr>
+        <w:pStyle w:val="ListBullet"/>
+      </w:pPr>
+      <w:r>
+        <w:t>Reconfirm only for material expansion, a new target, unplanned irreversible destruction, or a missing decision.</w:t>
+      </w:r>
+    </w:p>
+    <w:p>
+      <w:pPr>
+        <w:pStyle w:val="ListBullet"/>
+      </w:pPr>
+      <w:r>
+        <w:t>Full access cannot create credentials or override host safeguards. The owner can steer or revoke it.</w:t>
       </w:r>
     </w:p>
     <w:p>
@@ -2477,7 +2492,7 @@
         <w:pStyle w:val="Heading2"/>
       </w:pPr>
       <w:r>
-        <w:t>Preview every change</w:t>
+        <w:t>Preview and apply the authorized propagation plan</w:t>
       </w:r>
     </w:p>
     <w:p>
@@ -2506,7 +2521,7 @@
         <w:pStyle w:val="Heading2"/>
       </w:pPr>
       <w:r>
-        <w:t>Apply after approval</w:t>
+        <w:t>Apply without a second permission checkpoint</w:t>
       </w:r>
     </w:p>
     <w:p>
@@ -2804,6 +2819,22 @@
           <w:sz w:val="17"/>
         </w:rPr>
         <w:t>python tests/test_live_acceptance_harness.py</w:t>
+      </w:r>
+    </w:p>
+    <w:p>
+      <w:pPr>
+        <w:shd w:fill="EEF1F5"/>
+        <w:spacing w:before="40" w:after="160"/>
+        <w:ind w:left="317" w:right="317"/>
+      </w:pPr>
+      <w:r>
+        <w:rPr>
+          <w:rFonts w:ascii="Consolas" w:hAnsi="Consolas"/>
+          <w:b w:val="0"/>
+          <w:color w:val="14213D"/>
+          <w:sz w:val="17"/>
+        </w:rPr>
+        <w:t>python scripts/verify_installed_cache.py --require-only-current --require-plugin-state --receipt qa/installed-cache-v2.2.0.json --visual qa/installed-cache-v2.2.0.svg</w:t>
       </w:r>
     </w:p>
     <w:tbl>
@@ -2937,7 +2968,7 @@
                 <w:color w:val="000000"/>
                 <w:sz w:val="19"/>
               </w:rPr>
-              <w:t>97 requirements, ten integration rules and source hashes remain present. Fifteen scenarios remain too.</w:t>
+              <w:t>97 requirements, ten integration rules and source hashes remain present. Sixteen scenarios remain too.</w:t>
             </w:r>
           </w:p>
         </w:tc>
@@ -3186,7 +3217,7 @@
     </w:p>
     <w:p>
       <w:r>
-        <w:t>Run the fifteen prompts in persona/persona-contract.json in fresh Codex and ChatGPT Work tasks with GPT-5.6 Sol Medium. Generate the host prompt with scripts/live_acceptance_harness.py. For ChatGPT Work, the owner verifies the Work UI, Work locally and Ask for approval; record the underlying runtime separately because it may report Codex. For Codex, require the built-in read-only permission profile. Run responses inline. Any task creation or delegation invalidates the run. A file mutation also invalidates it. The same rule applies to a connector call, external action or host substitution. Terra XHigh remains pending unless the owner explicitly approves a version-bound release waiver. Static validation proves the contract exists; it cannot honestly grade a live model response.</w:t>
+        <w:t>Run the sixteen prompts in persona/persona-contract.json in fresh Codex and ChatGPT Work tasks with GPT-5.6 Sol Medium. Generate the host prompt with scripts/live_acceptance_harness.py. For ChatGPT Work, the owner verifies the Work UI, Work locally and Ask for approval for this response-only test; that test setting does not alter normal plan-scoped authorization. Record the underlying runtime separately because it may report Codex. For Codex, require the built-in read-only permission profile. Run responses inline. Any task creation or delegation invalidates the run. A file mutation also invalidates it. The same rule applies to a connector call, external action or host substitution. Terra XHigh remains pending unless the owner explicitly approves a version-bound release waiver. Static validation proves the contract exists; it cannot honestly grade a live model response.</w:t>
       </w:r>
     </w:p>
     <w:p>
@@ -3294,7 +3325,7 @@
         <w:pStyle w:val="ListBullet"/>
       </w:pPr>
       <w:r>
-        <w:t>Run validation again.</w:t>
+        <w:t>Run validation again, including verify_installed_cache.py --require-only-current --require-plugin-state.</w:t>
       </w:r>
     </w:p>
     <w:p>
@@ -3525,7 +3556,7 @@
                 <w:color w:val="000000"/>
                 <w:sz w:val="19"/>
               </w:rPr>
-              <w:t>2.1.2</w:t>
+              <w:t>2.2.0</w:t>
             </w:r>
           </w:p>
         </w:tc>

</xml_diff>

<commit_message>
fix operational closeout ordering
</commit_message>
<xml_diff>
--- a/docs/Codex Chief of Staff - Installation and SOP.docx
+++ b/docs/Codex Chief of Staff - Installation and SOP.docx
@@ -1776,6 +1776,70 @@
         <w:pStyle w:val="Heading2"/>
       </w:pPr>
       <w:r>
+        <w:t>Operational closeout</w:t>
+      </w:r>
+    </w:p>
+    <w:p>
+      <w:pPr>
+        <w:pStyle w:val="ListNumber"/>
+        <w:numPr>
+          <w:ilvl w:val="0"/>
+          <w:numId w:val="14"/>
+        </w:numPr>
+        <w:keepNext w:val="0"/>
+        <w:spacing w:after="60" w:line="288" w:lineRule="auto"/>
+      </w:pPr>
+      <w:r>
+        <w:t>Return the finished result or exact hold.</w:t>
+      </w:r>
+    </w:p>
+    <w:p>
+      <w:pPr>
+        <w:pStyle w:val="ListNumber"/>
+        <w:numPr>
+          <w:ilvl w:val="0"/>
+          <w:numId w:val="14"/>
+        </w:numPr>
+        <w:keepNext w:val="0"/>
+        <w:spacing w:after="60" w:line="288" w:lineRule="auto"/>
+      </w:pPr>
+      <w:r>
+        <w:t>Complete every safe, authorized next step available in the current task.</w:t>
+      </w:r>
+    </w:p>
+    <w:p>
+      <w:pPr>
+        <w:pStyle w:val="ListNumber"/>
+        <w:numPr>
+          <w:ilvl w:val="0"/>
+          <w:numId w:val="14"/>
+        </w:numPr>
+        <w:keepNext w:val="0"/>
+        <w:spacing w:after="60" w:line="288" w:lineRule="auto"/>
+      </w:pPr>
+      <w:r>
+        <w:t>List only remaining actions and genuine external or host blockers under numbered Next steps.</w:t>
+      </w:r>
+    </w:p>
+    <w:p>
+      <w:pPr>
+        <w:pStyle w:val="ListNumber"/>
+        <w:numPr>
+          <w:ilvl w:val="0"/>
+          <w:numId w:val="14"/>
+        </w:numPr>
+        <w:keepNext w:val="0"/>
+        <w:spacing w:after="60" w:line="288" w:lineRule="auto"/>
+      </w:pPr>
+      <w:r>
+        <w:t>Append Execution trace last. Do not insert a closing summary before it.</w:t>
+      </w:r>
+    </w:p>
+    <w:p>
+      <w:pPr>
+        <w:pStyle w:val="Heading2"/>
+      </w:pPr>
+      <w:r>
         <w:t>Execution trace</w:t>
       </w:r>
     </w:p>
@@ -2968,7 +3032,7 @@
                 <w:color w:val="000000"/>
                 <w:sz w:val="19"/>
               </w:rPr>
-              <w:t>97 requirements, ten integration rules and source hashes remain present. Sixteen scenarios remain too.</w:t>
+              <w:t>97 requirements, eleven integration rules and source hashes remain present. Seventeen scenarios remain too.</w:t>
             </w:r>
           </w:p>
         </w:tc>
@@ -3217,7 +3281,7 @@
     </w:p>
     <w:p>
       <w:r>
-        <w:t>Run the sixteen prompts in persona/persona-contract.json in fresh Codex and ChatGPT Work tasks with GPT-5.6 Sol Medium. Generate the host prompt with scripts/live_acceptance_harness.py. For ChatGPT Work, the owner verifies the Work UI, Work locally and Ask for approval for this response-only test; that test setting does not alter normal plan-scoped authorization. Record the underlying runtime separately because it may report Codex. For Codex, require the built-in read-only permission profile. Run responses inline. Any task creation or delegation invalidates the run. A file mutation also invalidates it. The same rule applies to a connector call, external action or host substitution. Terra XHigh remains pending unless the owner explicitly approves a version-bound release waiver. Static validation proves the contract exists; it cannot honestly grade a live model response.</w:t>
+        <w:t>Run the seventeen prompts in persona/persona-contract.json in fresh Codex and ChatGPT Work tasks with GPT-5.6 Sol Medium. Generate the host prompt with scripts/live_acceptance_harness.py. For ChatGPT Work, the owner verifies the Work UI, Work locally and Ask for approval for this response-only test; that test setting does not alter normal plan-scoped authorization. Record the underlying runtime separately because it may report Codex. For Codex, require the built-in read-only permission profile. Run responses inline. Any task creation or delegation invalidates the run. A file mutation also invalidates it. The same rule applies to a connector call, external action or host substitution. Terra XHigh remains pending unless the owner explicitly approves a version-bound release waiver. Static validation proves the contract exists; it cannot honestly grade a live model response.</w:t>
       </w:r>
     </w:p>
     <w:p>
@@ -4554,6 +4618,12 @@
       <w:startOverride w:val="1"/>
     </w:lvlOverride>
   </w:num>
+  <w:num w:numId="14">
+    <w:abstractNumId w:val="7"/>
+    <w:lvlOverride w:ilvl="0">
+      <w:startOverride w:val="1"/>
+    </w:lvlOverride>
+  </w:num>
 </w:numbering>
 </file>
 

</xml_diff>

<commit_message>
fix operational closeout ordering (#8)
Co-authored-by: plotdevice01 <284102241+plotdevice01@users.noreply.github.com>
</commit_message>
<xml_diff>
--- a/docs/Codex Chief of Staff - Installation and SOP.docx
+++ b/docs/Codex Chief of Staff - Installation and SOP.docx
@@ -1776,6 +1776,70 @@
         <w:pStyle w:val="Heading2"/>
       </w:pPr>
       <w:r>
+        <w:t>Operational closeout</w:t>
+      </w:r>
+    </w:p>
+    <w:p>
+      <w:pPr>
+        <w:pStyle w:val="ListNumber"/>
+        <w:numPr>
+          <w:ilvl w:val="0"/>
+          <w:numId w:val="14"/>
+        </w:numPr>
+        <w:keepNext w:val="0"/>
+        <w:spacing w:after="60" w:line="288" w:lineRule="auto"/>
+      </w:pPr>
+      <w:r>
+        <w:t>Return the finished result or exact hold.</w:t>
+      </w:r>
+    </w:p>
+    <w:p>
+      <w:pPr>
+        <w:pStyle w:val="ListNumber"/>
+        <w:numPr>
+          <w:ilvl w:val="0"/>
+          <w:numId w:val="14"/>
+        </w:numPr>
+        <w:keepNext w:val="0"/>
+        <w:spacing w:after="60" w:line="288" w:lineRule="auto"/>
+      </w:pPr>
+      <w:r>
+        <w:t>Complete every safe, authorized next step available in the current task.</w:t>
+      </w:r>
+    </w:p>
+    <w:p>
+      <w:pPr>
+        <w:pStyle w:val="ListNumber"/>
+        <w:numPr>
+          <w:ilvl w:val="0"/>
+          <w:numId w:val="14"/>
+        </w:numPr>
+        <w:keepNext w:val="0"/>
+        <w:spacing w:after="60" w:line="288" w:lineRule="auto"/>
+      </w:pPr>
+      <w:r>
+        <w:t>List only remaining actions and genuine external or host blockers under numbered Next steps.</w:t>
+      </w:r>
+    </w:p>
+    <w:p>
+      <w:pPr>
+        <w:pStyle w:val="ListNumber"/>
+        <w:numPr>
+          <w:ilvl w:val="0"/>
+          <w:numId w:val="14"/>
+        </w:numPr>
+        <w:keepNext w:val="0"/>
+        <w:spacing w:after="60" w:line="288" w:lineRule="auto"/>
+      </w:pPr>
+      <w:r>
+        <w:t>Append Execution trace last. Do not insert a closing summary before it.</w:t>
+      </w:r>
+    </w:p>
+    <w:p>
+      <w:pPr>
+        <w:pStyle w:val="Heading2"/>
+      </w:pPr>
+      <w:r>
         <w:t>Execution trace</w:t>
       </w:r>
     </w:p>
@@ -2968,7 +3032,7 @@
                 <w:color w:val="000000"/>
                 <w:sz w:val="19"/>
               </w:rPr>
-              <w:t>97 requirements, ten integration rules and source hashes remain present. Sixteen scenarios remain too.</w:t>
+              <w:t>97 requirements, eleven integration rules and source hashes remain present. Seventeen scenarios remain too.</w:t>
             </w:r>
           </w:p>
         </w:tc>
@@ -3217,7 +3281,7 @@
     </w:p>
     <w:p>
       <w:r>
-        <w:t>Run the sixteen prompts in persona/persona-contract.json in fresh Codex and ChatGPT Work tasks with GPT-5.6 Sol Medium. Generate the host prompt with scripts/live_acceptance_harness.py. For ChatGPT Work, the owner verifies the Work UI, Work locally and Ask for approval for this response-only test; that test setting does not alter normal plan-scoped authorization. Record the underlying runtime separately because it may report Codex. For Codex, require the built-in read-only permission profile. Run responses inline. Any task creation or delegation invalidates the run. A file mutation also invalidates it. The same rule applies to a connector call, external action or host substitution. Terra XHigh remains pending unless the owner explicitly approves a version-bound release waiver. Static validation proves the contract exists; it cannot honestly grade a live model response.</w:t>
+        <w:t>Run the seventeen prompts in persona/persona-contract.json in fresh Codex and ChatGPT Work tasks with GPT-5.6 Sol Medium. Generate the host prompt with scripts/live_acceptance_harness.py. For ChatGPT Work, the owner verifies the Work UI, Work locally and Ask for approval for this response-only test; that test setting does not alter normal plan-scoped authorization. Record the underlying runtime separately because it may report Codex. For Codex, require the built-in read-only permission profile. Run responses inline. Any task creation or delegation invalidates the run. A file mutation also invalidates it. The same rule applies to a connector call, external action or host substitution. Terra XHigh remains pending unless the owner explicitly approves a version-bound release waiver. Static validation proves the contract exists; it cannot honestly grade a live model response.</w:t>
       </w:r>
     </w:p>
     <w:p>
@@ -4554,6 +4618,12 @@
       <w:startOverride w:val="1"/>
     </w:lvlOverride>
   </w:num>
+  <w:num w:numId="14">
+    <w:abstractNumId w:val="7"/>
+    <w:lvlOverride w:ilvl="0">
+      <w:startOverride w:val="1"/>
+    </w:lvlOverride>
+  </w:num>
 </w:numbering>
 </file>
 

</xml_diff>

<commit_message>
make Sol the sole release profile
</commit_message>
<xml_diff>
--- a/docs/Codex Chief of Staff - Installation and SOP.docx
+++ b/docs/Codex Chief of Staff - Installation and SOP.docx
@@ -3281,7 +3281,7 @@
     </w:p>
     <w:p>
       <w:r>
-        <w:t>Run the seventeen prompts in persona/persona-contract.json in a fresh Codex CLI run and ChatGPT Work task with GPT-5.6 Sol Medium. Generate the host prompt with scripts/live_acceptance_harness.py. For ChatGPT Work, the owner verifies the Work UI, Work locally and Ask for approval for this response-only test; that test setting does not alter normal plan-scoped authorization. Record the underlying runtime separately because it may report Codex. Generate each sealed prompt with --plugin-root and --runtime-version so the harness embeds installed Chief sources, observed runtime evidence, the complete LIVE-014 content query and the inline AI Sloppy Copy result before the model run. For Codex, pipe that prompt into codex --ask-for-approval never exec --ephemeral --sandbox read-only. The Desktop approval presets are not proof of a read-only filesystem sandbox; use Desktop for the separate fresh-load smoke check. Run responses inline with zero model tool calls. Any model tool call, task creation or delegation invalidates the run. A write attempt, approval request, or file mutation also invalidates it. The same rule applies to a connector call, external action or host substitution. Terra XHigh remains pending unless the owner explicitly approves a version-bound release waiver. Static validation proves the contract exists; it cannot honestly grade a live model response.</w:t>
+        <w:t>Run the seventeen prompts in persona/persona-contract.json in a fresh Codex CLI run and ChatGPT Work task with GPT-5.6 Sol Medium. Generate the host prompt with scripts/live_acceptance_harness.py. For ChatGPT Work, the owner verifies the Work UI, Work locally and Ask for approval for this response-only test; that test setting does not alter normal plan-scoped authorization. Record the underlying runtime separately because it may report Codex. Generate each sealed prompt with --plugin-root and --runtime-version so the harness embeds installed Chief sources, observed runtime evidence, the complete LIVE-014 content query and the inline AI Sloppy Copy result before the model run. For Codex, pipe that prompt into codex --ask-for-approval never exec --ephemeral --sandbox read-only. The Desktop approval presets are not proof of a read-only filesystem sandbox; use Desktop for the separate fresh-load smoke check. Run responses inline with zero model tool calls. Any model tool call, task creation or delegation invalidates the run. A write attempt, approval request, or file mutation also invalidates it. The same rule applies to a connector call, external action or host substitution. Sol Medium is the sole active release profile; no secondary-model test or model-waiver gate applies. Static validation proves the contract exists; it cannot honestly grade a live model response.</w:t>
       </w:r>
     </w:p>
     <w:p>
@@ -3309,7 +3309,7 @@
           <w:color w:val="14213D"/>
           <w:sz w:val="21"/>
         </w:rPr>
-        <w:t>static, host and installed-runtime checks pass. Sol or Terra may be waived only while pending; failures cannot. Releases that change model-facing behavior require fresh evidence. A documentation-only patch may carry forward prior host evidence only when the unchanged behavior and source release are recorded. Connector identities and scope must match.</w:t>
+        <w:t>static, host and installed-runtime checks pass. The Sol Medium profile must pass and cannot be waived. Releases that change model-facing behavior require fresh evidence. A documentation-only patch may carry forward prior host evidence only when the unchanged behavior and source release are recorded. Connector identities and scope must match.</w:t>
       </w:r>
     </w:p>
     <w:p>

</xml_diff>

<commit_message>
make Sol the sole release profile (#12)
Co-authored-by: plotdevice01 <284102241+plotdevice01@users.noreply.github.com>
</commit_message>
<xml_diff>
--- a/docs/Codex Chief of Staff - Installation and SOP.docx
+++ b/docs/Codex Chief of Staff - Installation and SOP.docx
@@ -3281,7 +3281,7 @@
     </w:p>
     <w:p>
       <w:r>
-        <w:t>Run the seventeen prompts in persona/persona-contract.json in a fresh Codex CLI run and ChatGPT Work task with GPT-5.6 Sol Medium. Generate the host prompt with scripts/live_acceptance_harness.py. For ChatGPT Work, the owner verifies the Work UI, Work locally and Ask for approval for this response-only test; that test setting does not alter normal plan-scoped authorization. Record the underlying runtime separately because it may report Codex. Generate each sealed prompt with --plugin-root and --runtime-version so the harness embeds installed Chief sources, observed runtime evidence, the complete LIVE-014 content query and the inline AI Sloppy Copy result before the model run. For Codex, pipe that prompt into codex --ask-for-approval never exec --ephemeral --sandbox read-only. The Desktop approval presets are not proof of a read-only filesystem sandbox; use Desktop for the separate fresh-load smoke check. Run responses inline with zero model tool calls. Any model tool call, task creation or delegation invalidates the run. A write attempt, approval request, or file mutation also invalidates it. The same rule applies to a connector call, external action or host substitution. Terra XHigh remains pending unless the owner explicitly approves a version-bound release waiver. Static validation proves the contract exists; it cannot honestly grade a live model response.</w:t>
+        <w:t>Run the seventeen prompts in persona/persona-contract.json in a fresh Codex CLI run and ChatGPT Work task with GPT-5.6 Sol Medium. Generate the host prompt with scripts/live_acceptance_harness.py. For ChatGPT Work, the owner verifies the Work UI, Work locally and Ask for approval for this response-only test; that test setting does not alter normal plan-scoped authorization. Record the underlying runtime separately because it may report Codex. Generate each sealed prompt with --plugin-root and --runtime-version so the harness embeds installed Chief sources, observed runtime evidence, the complete LIVE-014 content query and the inline AI Sloppy Copy result before the model run. For Codex, pipe that prompt into codex --ask-for-approval never exec --ephemeral --sandbox read-only. The Desktop approval presets are not proof of a read-only filesystem sandbox; use Desktop for the separate fresh-load smoke check. Run responses inline with zero model tool calls. Any model tool call, task creation or delegation invalidates the run. A write attempt, approval request, or file mutation also invalidates it. The same rule applies to a connector call, external action or host substitution. Sol Medium is the sole active release profile; no secondary-model test or model-waiver gate applies. Static validation proves the contract exists; it cannot honestly grade a live model response.</w:t>
       </w:r>
     </w:p>
     <w:p>
@@ -3309,7 +3309,7 @@
           <w:color w:val="14213D"/>
           <w:sz w:val="21"/>
         </w:rPr>
-        <w:t>static, host and installed-runtime checks pass. Sol or Terra may be waived only while pending; failures cannot. Releases that change model-facing behavior require fresh evidence. A documentation-only patch may carry forward prior host evidence only when the unchanged behavior and source release are recorded. Connector identities and scope must match.</w:t>
+        <w:t>static, host and installed-runtime checks pass. The Sol Medium profile must pass and cannot be waived. Releases that change model-facing behavior require fresh evidence. A documentation-only patch may carry forward prior host evidence only when the unchanged behavior and source release are recorded. Connector identities and scope must match.</w:t>
       </w:r>
     </w:p>
     <w:p>

</xml_diff>